<commit_message>
Rename notebook to Stage1.ipynb and update README references
Also includes latest edits to Mina_Project_Notes.docx.
</commit_message>
<xml_diff>
--- a/Notes/Mina_Project_Notes.docx
+++ b/Notes/Mina_Project_Notes.docx
@@ -439,10 +439,6 @@
         </w:rPr>
         <w:t>The theoretical, non-biology-specific alignment paper Mina attached, "Understanding the Emergence of Multimodal Representation Alignment" (Tjandrasuwita, Ekbote, Ziyin, and Liang, MIT, ICML 2025), now has a full standalone review. In short: it frames alignment along two axes, heterogeneity (how dissimilar two modalities are, independent of task) and interactions, split into redundancy (information shared by both modalities that is task-relevant) and uniqueness (information only one modality has that is task-relevant). Its central finding is that alignment reliably predicts downstream performance only when redundancy dominates; as uniqueness increases, that relationship weakens and can turn negative, while model capacity keeps helping performance regardless of alignment. Its most directly reusable contribution is the alignment-performance slope, a diagnostic computed from frozen, unaligned encoders that predicts whether adding an explicit alignment loss will help or hurt on a given task, now implemented and run directly on this project's own data (see section 9.4).</w:t>
       </w:r>
-      <w:proofErr w:type="spellStart"/>
-      <w:proofErr w:type="spellEnd"/>
-      <w:proofErr w:type="spellStart"/>
-      <w:proofErr w:type="spellEnd"/>
     </w:p>
     <w:p>
       <w:pPr>
@@ -4962,8 +4958,18 @@
           <w:sz w:val="22"/>
           <w:szCs w:val="22"/>
         </w:rPr>
-        <w:t xml:space="preserve">Linear probing for mRNA stability: RNA embeddings reach R-squared 0.059 plus or minus 0.007 (5-fold cross-validation), protein embeddings reach R-squared 0.113 plus or minus 0.066. Both are real, positive </w:t>
-      </w:r>
+        <w:t>Linear probing for mRNA stability: RNA embeddings reach R-squared 0.059 plus or minus 0.007 (5-fold cross-validation), protein embeddings reach R-squared 0.113 plus or minus 0.066. Both are real, positive signal, not zero, though the difference between them is not cleanly significant given protein's wider variability.</w:t>
+      </w:r>
+    </w:p>
+    <w:p>
+      <w:pPr>
+        <w:pStyle w:val="ListParagraph"/>
+        <w:numPr>
+          <w:ilvl w:val="0"/>
+          <w:numId w:val="1"/>
+        </w:numPr>
+        <w:spacing w:after="80"/>
+      </w:pPr>
       <w:r>
         <w:rPr>
           <w:color w:val="000000"/>
@@ -4971,24 +4977,6 @@
           <w:szCs w:val="22"/>
         </w:rPr>
         <w:lastRenderedPageBreak/>
-        <w:t>signal, not zero, though the difference between them is not cleanly significant given protein's wider variability.</w:t>
-      </w:r>
-    </w:p>
-    <w:p>
-      <w:pPr>
-        <w:pStyle w:val="ListParagraph"/>
-        <w:numPr>
-          <w:ilvl w:val="0"/>
-          <w:numId w:val="1"/>
-        </w:numPr>
-        <w:spacing w:after="80"/>
-      </w:pPr>
-      <w:r>
-        <w:rPr>
-          <w:color w:val="000000"/>
-          <w:sz w:val="22"/>
-          <w:szCs w:val="22"/>
-        </w:rPr>
         <w:t>Sequence-length baseline: R-squared 0.007, ruling out the concern that the probe scores above are secretly a length proxy rather than real embedding content.</w:t>
       </w:r>
     </w:p>
@@ -5063,8 +5051,6 @@
         </w:rPr>
         <w:t>Codon usage bias probe (GC3), an extended Track A check: RNA embeddings recover GC3, the GC fraction at each codon's third position and the classical proxy for codon usage bias, at R-squared 0.969, protein embeddings at 0.379. GC3 correlates 0.922 with the overall GC content already probed above, so this mostly confirms rather than extends that earlier result; the one new detail is that protein embeddings lose noticeably more ground on this codon-position-specific signal than they did on overall GC, consistent with translation collapsing synonymous codons to the same amino acid.</w:t>
       </w:r>
-      <w:proofErr w:type="gramStart"/>
-      <w:proofErr w:type="gramEnd"/>
     </w:p>
     <w:p>
       <w:pPr>
@@ -5083,8 +5069,6 @@
         </w:rPr>
         <w:t>Secondary structure probe (Nussinov pairing fraction), the second extended Track A check: using the classical Nussinov and Jacobson (1980) maximum-base-pairing algorithm on a 200-sequence subsample cropped to each sequence's first 200 nucleotides (needed for runtime, since the algorithm is cubic in sequence length), neither embedding recovers this proxy reliably: RNA reaches R-squared 0.062 plus or minus 0.087, protein reaches 0.022 plus or minus 0.134, both effectively zero given the standard deviation exceeds the mean. A genuine, honestly weak result rather than a strong or a null one, most likely limited by the smaller sample, the simplified pairing model, and the 5' region-only crop, but at face value it says composition (GC, GC3) is what these frozen encoders linearly capture, not this proxy's structural signal.</w:t>
       </w:r>
-      <w:proofErr w:type="gramStart"/>
-      <w:proofErr w:type="gramEnd"/>
     </w:p>
     <w:p>
       <w:pPr>
@@ -5189,7 +5173,16 @@
           <w:sz w:val="22"/>
           <w:szCs w:val="22"/>
         </w:rPr>
-        <w:t>Reading Track B together: CKA and mutual-KNN say the two full spaces mostly disagree; CCA and retrieval say a specific, strong, learnable shared subspace exists within them, plausibly the same compositional signal the GC content and layer-wise CKA results point to. This is the strongest evidence so far for why a trained fusion mechanism, rather than naive concatenation, is worth building: real cross-modal structure exists, but it is not accessible without a method that can learn where to look for it.</w:t>
+        <w:t xml:space="preserve">Reading Track B together: CKA and mutual-KNN say the two full spaces mostly disagree; CCA and retrieval say a specific, strong, learnable shared subspace exists within them, plausibly the same compositional signal the GC content and layer-wise CKA results point to. This is the strongest evidence </w:t>
+      </w:r>
+      <w:r>
+        <w:rPr>
+          <w:color w:val="000000"/>
+          <w:sz w:val="22"/>
+          <w:szCs w:val="22"/>
+        </w:rPr>
+        <w:lastRenderedPageBreak/>
+        <w:t>so far for why a trained fusion mechanism, rather than naive concatenation, is worth building: real cross-modal structure exists, but it is not accessible without a method that can learn where to look for it.</w:t>
       </w:r>
     </w:p>
     <w:p>
@@ -5241,10 +5234,26 @@
           <w:sz w:val="22"/>
           <w:szCs w:val="22"/>
         </w:rPr>
-        <w:t>Attention-motif overlap test, first pass: using two placeholder JASPAR transcription-factor motifs, tested on a single-example sanity check plus a 100-sequence aggregate run. In the single example, mean attention at the 475 motif-covered positions was 0.0026, versus 0.0034 elsewhere, the opposite direction of the hypothesis, and not significant (p is approximately 1.0 under the one-sided greater-at-motifs test). Across the 100-sequence aggregate, 26 percent of sequences showed significantly higher attention at motif positions (p &lt; 0.05, uncorrected), and the mean attention gap across all 100 was -0.0003, essentially zero. As run, this did not support the hypothesis that the frozen RNA encoder's attention tracks these particular motifs, and these numbers are now superseded by the fix below.</w:t>
+        <w:t xml:space="preserve">Attention-motif overlap test, first pass: using two placeholder JASPAR transcription-factor motifs, tested on a single-example sanity check plus a 100-sequence aggregate run. In the single example, mean attention at the 475 motif-covered positions was 0.0026, versus 0.0034 elsewhere, the opposite direction of the hypothesis, and not significant (p is approximately 1.0 under the one-sided greater-at-motifs test). Across the 100-sequence aggregate, 26 percent of sequences showed significantly higher attention at motif positions (p &lt; 0.05, uncorrected), and the mean attention gap across all 100 was -0.0003, essentially zero. As run, this did not support the hypothesis that the frozen RNA encoder's attention tracks these </w:t>
       </w:r>
       <w:proofErr w:type="gramStart"/>
+      <w:r>
+        <w:rPr>
+          <w:color w:val="000000"/>
+          <w:sz w:val="22"/>
+          <w:szCs w:val="22"/>
+        </w:rPr>
+        <w:t>particular motifs</w:t>
+      </w:r>
       <w:proofErr w:type="gramEnd"/>
+      <w:r>
+        <w:rPr>
+          <w:color w:val="000000"/>
+          <w:sz w:val="22"/>
+          <w:szCs w:val="22"/>
+        </w:rPr>
+        <w:t>, and these numbers are now superseded by the fix below.</w:t>
+      </w:r>
     </w:p>
     <w:p>
       <w:pPr>
@@ -5263,8 +5272,6 @@
         </w:rPr>
         <w:t>This was a genuine null result for the specific test run, not necessarily for the underlying question. JASPAR's motif library is built overwhelmingly from transcription-factor binding sites, which act at the DNA and promoter level to control transcription, not the specific RNA sequence elements known to govern post-transcriptional mRNA stability. The two motif IDs used were explicit placeholders, not chosen for biological relevance to stability. This has since been fixed directly in the notebook: the motif-scanning step now scans for the AU-rich element pentamer (AUUUA) and nonamer (UUAUUUAUU), the two most-cited motifs mediating ARE-directed mRNA decay (Lagnado et al., 1994; Zubiaga et al., 1995), and the DRACH consensus for m6A sites (Dominissini et al., 2012; Meyer et al., 2012), a direct, independent regulator of mRNA half-life, scanned as degenerate IUPAC patterns rather than JASPAR-style PWMs, which also drops the pyjaspar dependency entirely. The overlap test itself was upgraded too, now reporting a per-motif-class breakdown alongside the pooled result, since ARE- and m6A-mediated decay work through different mechanisms and a pooled-only result can hide a real effect specific to one of them. One caveat carried forward honestly rather than resolved: AREs and m6A sites are both canonically enriched in 3' UTRs, and whether mRNA_Stability.csv's Sequence column includes UTR context or is CDS-only is not confirmed from the dataset's own columns. The re-run against this corrected ground truth is now complete. In the single-example check, 63 motif hits covering 311 positions show mean attention of 0.0031 versus 0.0033 elsewhere, not significant (p = 0.60), with neither motif class significant on its own. Across the 100-sequence aggregate, all 100 sequences yielded usable hits, only 7 percent showed significantly higher attention at motif positions against a 5 percent chance baseline, and the mean attention gap was -0.0009, again essentially zero; the ARE pentamer appeared in 41 sequences (5 percent significant, mean gap -0.0027), the ARE nonamer was too specific to produce any usable hits in this sample, and the m6A DRACH consensus appeared in all 100 (8 percent significant, mean gap -0.0009). This is now a genuine null result against the correct biological ground truth, not an artifact of the earlier JASPAR mismatch: the frozen RNA encoder's self-attention does not preferentially track these canonical stability elements. One caveat remains open rather than resolved: AREs and m6A sites are both canonically enriched in 3' UTRs, and whether mRNA_Stability.csv's Sequence column includes UTR context or is CDS-only is not confirmed from the dataset's own columns, so it is still worth confirming with Mina since it bears on how much weight this null result should carry.</w:t>
       </w:r>
-      <w:proofErr w:type="gramStart"/>
-      <w:proofErr w:type="gramEnd"/>
     </w:p>
     <w:p>
       <w:pPr>
@@ -5283,28 +5290,33 @@
         </w:rPr>
         <w:t>Alignment-performance slope (the ICML 2025 paper's own diagnostic): computed on the held-out CCA test-set vectors, the Spearman correlation between per-sample local alignment and downstream prediction error is -0.013 (p = 0.83), not significant. Read against the paper's framework, a near-zero slope under real modality uniqueness is exactly the pattern that says an explicit alignment loss is unlikely to help Stage 2's fusion architecture, and could hurt. This formally confirms, with the paper's own purpose-built diagnostic, the same conclusion Track B's CKA and mutual k-NN results already pointed toward.</w:t>
       </w:r>
-      <w:proofErr w:type="gramStart"/>
-      <w:proofErr w:type="gramEnd"/>
-    </w:p>
-    <w:p>
-      <w:pPr>
-        <w:pStyle w:val="ListParagraph"/>
-        <w:numPr>
-          <w:ilvl w:val="0"/>
-          <w:numId w:val="1"/>
-        </w:numPr>
-        <w:spacing w:after="80"/>
-      </w:pPr>
-      <w:r>
-        <w:rPr>
-          <w:color w:val="000000"/>
-          <w:sz w:val="22"/>
-          <w:szCs w:val="22"/>
-        </w:rPr>
-        <w:t>Representational Similarity Analysis (RSA): the Spearman correlation between the RNA and protein modalities' internal pairwise-distance structures is 0.234 (p &lt; 0.001). This is a fourth, independent line of evidence for the same modest-but-real shared structure CCA and retrieval already found, this time from comparing each modality's own internal geometry rather than comparing embeddings across modalities directly, and it does not depend on the two encoders' embedding dimensions matching.</w:t>
-      </w:r>
-      <w:proofErr w:type="gramStart"/>
-      <w:proofErr w:type="gramEnd"/>
+    </w:p>
+    <w:p>
+      <w:pPr>
+        <w:pStyle w:val="ListParagraph"/>
+        <w:numPr>
+          <w:ilvl w:val="0"/>
+          <w:numId w:val="1"/>
+        </w:numPr>
+        <w:spacing w:after="80"/>
+      </w:pPr>
+      <w:r>
+        <w:rPr>
+          <w:color w:val="000000"/>
+          <w:sz w:val="22"/>
+          <w:szCs w:val="22"/>
+        </w:rPr>
+        <w:t xml:space="preserve">Representational Similarity Analysis (RSA): the Spearman correlation between the RNA and protein modalities' internal pairwise-distance structures is 0.234 (p &lt; 0.001). This is a fourth, independent line of </w:t>
+      </w:r>
+      <w:r>
+        <w:rPr>
+          <w:color w:val="000000"/>
+          <w:sz w:val="22"/>
+          <w:szCs w:val="22"/>
+        </w:rPr>
+        <w:lastRenderedPageBreak/>
+        <w:t>evidence for the same modest-but-real shared structure CCA and retrieval already found, this time from comparing each modality's own internal geometry rather than comparing embeddings across modalities directly, and it does not depend on the two encoders' embedding dimensions matching.</w:t>
+      </w:r>
     </w:p>
     <w:p>
       <w:pPr>
@@ -5319,7 +5331,6 @@
           <w:sz w:val="25"/>
           <w:szCs w:val="25"/>
         </w:rPr>
-        <w:lastRenderedPageBreak/>
         <w:t>9.5 Toolkit and Literature Status</w:t>
       </w:r>
     </w:p>
@@ -5446,14 +5457,26 @@
           <w:sz w:val="22"/>
           <w:szCs w:val="22"/>
         </w:rPr>
-        <w:t>Toolkit implemented and run: linear probing (RidgeCV, 5-fold cross-validation), CKA (final-layer and full layer-wise breakdown), mutual k-NN alignment, CCA with held-out cross-modal retrieval, UMAP, a GC content validity probe, a sequence-length confound check, a synergy check, and a full pipeline-correctness control dataset, the alignment-performance slope diagnostic, attention extraction with real AU-rich-element and m6A motif matching (Track C, rebuilt from an initial JASPAR transcription-factor pass), RSA as a fourth alignment metric, and the two extended Track A checks, codon usage bias (GC3) and secondary structure (Nussinov pairing fraction).</w:t>
-      </w:r>
-      <w:proofErr w:type="gramStart"/>
-      <w:proofErr w:type="gramEnd"/>
+        <w:t>Toolkit implemented and run: linear probing (RidgeCV, 5-fold cross-validation), CKA (final-layer and full layer-wise breakdown), mutual k-NN alignment, CCA with held-out cross-modal retrieval, UMAP, a GC content validity probe, a sequence-length confound check, a synergy check, and a full pipeline-correctness control dataset, the alignment-performance slope diagnostic, attention extraction with real AU-rich-element and m6A motif matching (Track C, rebuilt from an initial JASPAR transcription-factor pass), RSA as a fourth alignment metric, and the two extended Track A checks, codon usage bias (GC3) and secondary structure (</w:t>
+      </w:r>
       <w:proofErr w:type="spellStart"/>
+      <w:r>
+        <w:rPr>
+          <w:color w:val="000000"/>
+          <w:sz w:val="22"/>
+          <w:szCs w:val="22"/>
+        </w:rPr>
+        <w:t>Nussinov</w:t>
+      </w:r>
       <w:proofErr w:type="spellEnd"/>
-      <w:proofErr w:type="spellStart"/>
-      <w:proofErr w:type="spellEnd"/>
+      <w:r>
+        <w:rPr>
+          <w:color w:val="000000"/>
+          <w:sz w:val="22"/>
+          <w:szCs w:val="22"/>
+        </w:rPr>
+        <w:t xml:space="preserve"> pairing fraction).</w:t>
+      </w:r>
     </w:p>
     <w:p>
       <w:pPr>
@@ -5546,6 +5569,7 @@
           <w:sz w:val="22"/>
           <w:szCs w:val="22"/>
         </w:rPr>
+        <w:lastRenderedPageBreak/>
         <w:t>Lead with the tension between the alignment metrics rather than a single number: CKA and mutual k-NN say the two embedding spaces mostly disagree, while CCA, retrieval, and now RSA all independently find one specific, strong, learnable shared subspace within them. That disagreement between metrics is the actual finding worth presenting, not a gap to explain away.</w:t>
       </w:r>
     </w:p>
@@ -5886,6 +5910,7 @@
           <w:sz w:val="22"/>
           <w:szCs w:val="22"/>
         </w:rPr>
+        <w:lastRenderedPageBreak/>
         <w:t>Given Central Dogma Transformer's sequel finding that RNA and protein changes often move in opposite directions, should Stage 2 plan from the start for asymmetric, per-pair alignment decisions rather than one method applied uniformly.</w:t>
       </w:r>
     </w:p>
@@ -5942,6 +5967,514 @@
         </w:rPr>
         <w:t>Who else is joining the Wednesday meeting, referenced as "both of you" in Mina's earlier email?</w:t>
       </w:r>
+    </w:p>
+    <w:p>
+      <w:pPr>
+        <w:spacing w:after="80"/>
+        <w:rPr>
+          <w:sz w:val="22"/>
+          <w:szCs w:val="22"/>
+        </w:rPr>
+      </w:pPr>
+      <w:r>
+        <w:rPr>
+          <w:sz w:val="22"/>
+          <w:szCs w:val="22"/>
+        </w:rPr>
+        <w:t>Let's put the whole picture together, one piece at a time.</w:t>
+      </w:r>
+    </w:p>
+    <w:p>
+      <w:pPr>
+        <w:spacing w:after="80"/>
+        <w:rPr>
+          <w:sz w:val="22"/>
+          <w:szCs w:val="22"/>
+        </w:rPr>
+      </w:pPr>
+      <w:r>
+        <w:rPr>
+          <w:b/>
+          <w:bCs/>
+          <w:sz w:val="22"/>
+          <w:szCs w:val="22"/>
+        </w:rPr>
+        <w:t>The project, in one paragraph.</w:t>
+      </w:r>
+      <w:r>
+        <w:rPr>
+          <w:sz w:val="22"/>
+          <w:szCs w:val="22"/>
+        </w:rPr>
+        <w:t xml:space="preserve"> You're working with Mina and a small team (you, Zeynep, Mohammad) under Professor Garibay's lab, trying to figure out whether combining what a frozen RNA language model knows with what a frozen protein language model knows can predict things about mRNA, starting with stability, better than either one alone. The RNA encoder (Nucleotide Transformer) reads raw nucleotide sequence, the protein encoder (ESM-2) reads the translated amino acid sequence, and the eventual goal is a trained fusion model, benchmarked as both cross-attention and Coupled-Mamba, that learns to combine them well. Before building that fusion model, Mina wanted the harder question answered first: do these two encoders' internal representations </w:t>
+      </w:r>
+      <w:proofErr w:type="gramStart"/>
+      <w:r>
+        <w:rPr>
+          <w:sz w:val="22"/>
+          <w:szCs w:val="22"/>
+        </w:rPr>
+        <w:t>actually relate</w:t>
+      </w:r>
+      <w:proofErr w:type="gramEnd"/>
+      <w:r>
+        <w:rPr>
+          <w:sz w:val="22"/>
+          <w:szCs w:val="22"/>
+        </w:rPr>
+        <w:t xml:space="preserve"> to each other in a useful way, and if so, how. That's what Stage 1 was for.</w:t>
+      </w:r>
+    </w:p>
+    <w:p>
+      <w:pPr>
+        <w:spacing w:after="80"/>
+        <w:rPr>
+          <w:sz w:val="22"/>
+          <w:szCs w:val="22"/>
+        </w:rPr>
+      </w:pPr>
+      <w:r>
+        <w:rPr>
+          <w:b/>
+          <w:bCs/>
+          <w:sz w:val="22"/>
+          <w:szCs w:val="22"/>
+        </w:rPr>
+        <w:t xml:space="preserve">What Stage 1 </w:t>
+      </w:r>
+      <w:proofErr w:type="gramStart"/>
+      <w:r>
+        <w:rPr>
+          <w:b/>
+          <w:bCs/>
+          <w:sz w:val="22"/>
+          <w:szCs w:val="22"/>
+        </w:rPr>
+        <w:t>actually accomplished</w:t>
+      </w:r>
+      <w:proofErr w:type="gramEnd"/>
+      <w:r>
+        <w:rPr>
+          <w:b/>
+          <w:bCs/>
+          <w:sz w:val="22"/>
+          <w:szCs w:val="22"/>
+        </w:rPr>
+        <w:t>.</w:t>
+      </w:r>
+      <w:r>
+        <w:rPr>
+          <w:sz w:val="22"/>
+          <w:szCs w:val="22"/>
+        </w:rPr>
+        <w:t xml:space="preserve"> You built a full pipeline (translate, filter, embed, probe) and validated it against a control dataset (the </w:t>
+      </w:r>
+      <w:proofErr w:type="spellStart"/>
+      <w:r>
+        <w:rPr>
+          <w:sz w:val="22"/>
+          <w:szCs w:val="22"/>
+        </w:rPr>
+        <w:t>mRFP</w:t>
+      </w:r>
+      <w:proofErr w:type="spellEnd"/>
+      <w:r>
+        <w:rPr>
+          <w:sz w:val="22"/>
+          <w:szCs w:val="22"/>
+        </w:rPr>
+        <w:t xml:space="preserve"> synonymous-recoding set), so you know it's trustworthy. Then you ran three separate investigations. Track A checked whether each frozen encoder's embedding </w:t>
+      </w:r>
+      <w:proofErr w:type="gramStart"/>
+      <w:r>
+        <w:rPr>
+          <w:sz w:val="22"/>
+          <w:szCs w:val="22"/>
+        </w:rPr>
+        <w:t>actually contains</w:t>
+      </w:r>
+      <w:proofErr w:type="gramEnd"/>
+      <w:r>
+        <w:rPr>
+          <w:sz w:val="22"/>
+          <w:szCs w:val="22"/>
+        </w:rPr>
+        <w:t xml:space="preserve"> real, decodable biological information, confirmed through GC content, GC3, and a genuine stability signal, while ruling out the boring explanation that it's all just sequence length. Track B directly measured whether the RNA and protein representation spaces relate to each other, using four independent methods (CKA, mutual k-NN, CCA and retrieval, RSA), plus a naive concatenation test to see if simple combination already captures anything. Track C </w:t>
+      </w:r>
+      <w:proofErr w:type="gramStart"/>
+      <w:r>
+        <w:rPr>
+          <w:sz w:val="22"/>
+          <w:szCs w:val="22"/>
+        </w:rPr>
+        <w:t>opened up</w:t>
+      </w:r>
+      <w:proofErr w:type="gramEnd"/>
+      <w:r>
+        <w:rPr>
+          <w:sz w:val="22"/>
+          <w:szCs w:val="22"/>
+        </w:rPr>
+        <w:t xml:space="preserve"> the RNA encoder itself, checking whether its attention tracks known regulatory motifs, and computed a diagnostic (the alignment-performance slope) that tells you whether forcing more alignment during fusion training would </w:t>
+      </w:r>
+      <w:proofErr w:type="gramStart"/>
+      <w:r>
+        <w:rPr>
+          <w:sz w:val="22"/>
+          <w:szCs w:val="22"/>
+        </w:rPr>
+        <w:t>actually help</w:t>
+      </w:r>
+      <w:proofErr w:type="gramEnd"/>
+      <w:r>
+        <w:rPr>
+          <w:sz w:val="22"/>
+          <w:szCs w:val="22"/>
+        </w:rPr>
+        <w:t>.</w:t>
+      </w:r>
+    </w:p>
+    <w:p>
+      <w:pPr>
+        <w:spacing w:after="80"/>
+        <w:rPr>
+          <w:sz w:val="22"/>
+          <w:szCs w:val="22"/>
+        </w:rPr>
+      </w:pPr>
+      <w:r>
+        <w:rPr>
+          <w:b/>
+          <w:bCs/>
+          <w:sz w:val="22"/>
+          <w:szCs w:val="22"/>
+        </w:rPr>
+        <w:t>What the results showed, in short.</w:t>
+      </w:r>
+      <w:r>
+        <w:rPr>
+          <w:sz w:val="22"/>
+          <w:szCs w:val="22"/>
+        </w:rPr>
+        <w:t xml:space="preserve"> Both encoders capture real biology, not noise. Concatenation gives you nothing beyond the better single modality alone, so a real fusion mechanism is necessary. The two representation spaces mostly disagree with each other overall, but there's a genuine, statistically strong, narrow pocket where they agree, and it looks mostly compositional (tracks GC content) rather than deep semantic understanding, since the strongest alignment point in the whole layer-by-layer scan sits right at an embedding layer, before either model has done much contextual processing. Attention on the frozen RNA encoder didn't spike at known stability motifs, but that test was run on CDS-only sequences, and those motifs' real job is in the 3' UTR, which isn't in this dataset, so that result is more "inconclusive by design" than a strong negative. And the alignment-performance slope came back flat, meaning forcing tighter alignment during fusion training probably won't help and could hurt.</w:t>
+      </w:r>
+    </w:p>
+    <w:p>
+      <w:pPr>
+        <w:spacing w:after="80"/>
+        <w:rPr>
+          <w:sz w:val="22"/>
+          <w:szCs w:val="22"/>
+        </w:rPr>
+      </w:pPr>
+      <w:r>
+        <w:rPr>
+          <w:b/>
+          <w:bCs/>
+          <w:sz w:val="22"/>
+          <w:szCs w:val="22"/>
+        </w:rPr>
+        <w:t>What comes next.</w:t>
+      </w:r>
+      <w:r>
+        <w:rPr>
+          <w:sz w:val="22"/>
+          <w:szCs w:val="22"/>
+        </w:rPr>
+        <w:t xml:space="preserve"> Build the actual fusion model. Both candidates Mina scoped, cross-attention and Coupled-Mamba, get built and benchmarked against the baselines you already have (single modality, concatenation). Skip an explicit alignment loss, since the slope diagnostic argues against it. Scale up from this 1000-sequence pilot to a much larger training set, since a trained fusion module needs real data to find that narrow shared subspace CCA uncovered. And if there's time, strengthen Stage 1's shakiest piece by re-running the attention-motif test on sequences that include 3' UTR context, since that would turn today's ambiguous result into an actual answer.</w:t>
+      </w:r>
+    </w:p>
+    <w:p>
+      <w:pPr>
+        <w:spacing w:after="80"/>
+        <w:rPr>
+          <w:sz w:val="22"/>
+          <w:szCs w:val="22"/>
+        </w:rPr>
+      </w:pPr>
+      <w:r>
+        <w:rPr>
+          <w:sz w:val="22"/>
+          <w:szCs w:val="22"/>
+        </w:rPr>
+        <w:t>Now, the six papers. These are the ones sitting in your Papers folder, each with a review already written up.</w:t>
+      </w:r>
+    </w:p>
+    <w:p>
+      <w:pPr>
+        <w:spacing w:after="80"/>
+        <w:rPr>
+          <w:sz w:val="22"/>
+          <w:szCs w:val="22"/>
+        </w:rPr>
+      </w:pPr>
+      <w:r>
+        <w:rPr>
+          <w:sz w:val="22"/>
+          <w:szCs w:val="22"/>
+        </w:rPr>
+        <w:t>The alignment theory paper (</w:t>
+      </w:r>
+      <w:proofErr w:type="spellStart"/>
+      <w:r>
+        <w:rPr>
+          <w:sz w:val="22"/>
+          <w:szCs w:val="22"/>
+        </w:rPr>
+        <w:t>Tjandrasuwita</w:t>
+      </w:r>
+      <w:proofErr w:type="spellEnd"/>
+      <w:r>
+        <w:rPr>
+          <w:sz w:val="22"/>
+          <w:szCs w:val="22"/>
+        </w:rPr>
+        <w:t xml:space="preserve"> et al., ICML 2025) is the one Mina specifically pointed you to, and it's the reason Stage 1 looked the way it did. Its core claim: two independently trained models become more aligned as they scale only when the information they're learning is mostly shared (redundant) between them; when each one is picking up real information the other doesn't have (uniqueness), alignment stops predicting how well fusion </w:t>
+      </w:r>
+      <w:r>
+        <w:rPr>
+          <w:sz w:val="22"/>
+          <w:szCs w:val="22"/>
+        </w:rPr>
+        <w:lastRenderedPageBreak/>
+        <w:t xml:space="preserve">will </w:t>
+      </w:r>
+      <w:proofErr w:type="gramStart"/>
+      <w:r>
+        <w:rPr>
+          <w:sz w:val="22"/>
+          <w:szCs w:val="22"/>
+        </w:rPr>
+        <w:t>work, and</w:t>
+      </w:r>
+      <w:proofErr w:type="gramEnd"/>
+      <w:r>
+        <w:rPr>
+          <w:sz w:val="22"/>
+          <w:szCs w:val="22"/>
+        </w:rPr>
+        <w:t xml:space="preserve"> can even go negative. It's not a biology paper at all, it's tested on vision-language models, but it hands you two directly usable things: the vocabulary (redundancy, uniqueness, heterogeneity) to describe your own findings precisely, and the alignment-performance slope, the exact diagnostic your Track C ran. Your own numbers </w:t>
+      </w:r>
+      <w:proofErr w:type="gramStart"/>
+      <w:r>
+        <w:rPr>
+          <w:sz w:val="22"/>
+          <w:szCs w:val="22"/>
+        </w:rPr>
+        <w:t>actually match</w:t>
+      </w:r>
+      <w:proofErr w:type="gramEnd"/>
+      <w:r>
+        <w:rPr>
+          <w:sz w:val="22"/>
+          <w:szCs w:val="22"/>
+        </w:rPr>
+        <w:t xml:space="preserve"> the pattern this paper predicts for a genuinely unique, non-redundant pair: modest overall alignment, a narrow strong subspace, and a flat slope. This is the theoretical backbone for everything Stage 1 concluded.</w:t>
+      </w:r>
+    </w:p>
+    <w:p>
+      <w:pPr>
+        <w:spacing w:after="80"/>
+        <w:rPr>
+          <w:sz w:val="22"/>
+          <w:szCs w:val="22"/>
+        </w:rPr>
+      </w:pPr>
+      <w:proofErr w:type="spellStart"/>
+      <w:r>
+        <w:rPr>
+          <w:sz w:val="22"/>
+          <w:szCs w:val="22"/>
+        </w:rPr>
+        <w:t>BioLangFusion</w:t>
+      </w:r>
+      <w:proofErr w:type="spellEnd"/>
+      <w:r>
+        <w:rPr>
+          <w:sz w:val="22"/>
+          <w:szCs w:val="22"/>
+        </w:rPr>
+        <w:t xml:space="preserve"> is the closest thing to a blueprint for what you're doing. Three frozen encoders, DNA, RNA, and protein, fused three different ways: plain concatenation, an attention-based weighting scheme, and cross-attention, after resampling everything onto a shared codon-by-codon grid. All three fusion methods beat any single modality alone, and their own ablation proved the resampling-to-shared-resolution step </w:t>
+      </w:r>
+      <w:proofErr w:type="gramStart"/>
+      <w:r>
+        <w:rPr>
+          <w:sz w:val="22"/>
+          <w:szCs w:val="22"/>
+        </w:rPr>
+        <w:t>actually matters</w:t>
+      </w:r>
+      <w:proofErr w:type="gramEnd"/>
+      <w:r>
+        <w:rPr>
+          <w:sz w:val="22"/>
+          <w:szCs w:val="22"/>
+        </w:rPr>
+        <w:t xml:space="preserve">, removing it hurts performance. The catch, and it's a real one for your project: their alignment is purely positional, matching page 3 of the booklet to piece 1 of the </w:t>
+      </w:r>
+      <w:proofErr w:type="gramStart"/>
+      <w:r>
+        <w:rPr>
+          <w:sz w:val="22"/>
+          <w:szCs w:val="22"/>
+        </w:rPr>
+        <w:t>model</w:t>
+      </w:r>
+      <w:proofErr w:type="gramEnd"/>
+      <w:r>
+        <w:rPr>
+          <w:sz w:val="22"/>
+          <w:szCs w:val="22"/>
+        </w:rPr>
+        <w:t>, not the deeper representational alignment your Stage 1 tested. That's exactly the naive shortcut Mina wanted ruled out first, so this paper is proof that even the naive version helps some, but your Stage 1 work is asking a harder, more honest question than this paper did.</w:t>
+      </w:r>
+    </w:p>
+    <w:p>
+      <w:pPr>
+        <w:spacing w:after="80"/>
+        <w:rPr>
+          <w:sz w:val="22"/>
+          <w:szCs w:val="22"/>
+        </w:rPr>
+      </w:pPr>
+      <w:r>
+        <w:rPr>
+          <w:sz w:val="22"/>
+          <w:szCs w:val="22"/>
+        </w:rPr>
+        <w:t>Central Dogma Transformer works one direction, DNA informs RNA informs protein, using cross-attention that's built to be interpretable by construction, since attention only ever flows one biologically meaningful way. Its most interesting result for you isn't the architecture, it's a side finding: when they compared what their attention weights pointed to versus what a different method (gradients) pointed to, the two only agreed about 10% of the time, even though the gradient method correctly found a real, independently confirmed biological signal that attention missed. That's a direct precedent for exactly the caution I gave you about your own attention-motif result: attention weights and true importance aren't the same thing, and this paper is a real, published example of that gap showing up in practice.</w:t>
+      </w:r>
+    </w:p>
+    <w:p>
+      <w:pPr>
+        <w:spacing w:after="80"/>
+        <w:rPr>
+          <w:sz w:val="22"/>
+          <w:szCs w:val="22"/>
+        </w:rPr>
+      </w:pPr>
+      <w:r>
+        <w:rPr>
+          <w:sz w:val="22"/>
+          <w:szCs w:val="22"/>
+        </w:rPr>
+        <w:t>Coupled Mamba isn't biological at all, it's built for fusing audio, text, and video for sentiment analysis, but it's one of your two Stage 2 candidates, so it matters architecturally. Its trick is letting each modality's internal state update using a mix of all modalities' previous states, which lets it fuse sequences of totally different lengths without ever resampling them onto a shared grid first, and their ablation proved this coupling itself, not just using Mamba instead of a transformer, is what drives the improvement. For your project, this could sidestep the RNA-to-protein length mismatch entirely, no need to squash three nucleotides down to one amino acid position first, which is architecturally the most different option from cross-attention's approach.</w:t>
+      </w:r>
+    </w:p>
+    <w:p>
+      <w:pPr>
+        <w:spacing w:after="80"/>
+        <w:rPr>
+          <w:sz w:val="22"/>
+          <w:szCs w:val="22"/>
+        </w:rPr>
+      </w:pPr>
+      <w:proofErr w:type="spellStart"/>
+      <w:r>
+        <w:rPr>
+          <w:sz w:val="22"/>
+          <w:szCs w:val="22"/>
+        </w:rPr>
+        <w:t>LucaOne</w:t>
+      </w:r>
+      <w:proofErr w:type="spellEnd"/>
+      <w:r>
+        <w:rPr>
+          <w:sz w:val="22"/>
+          <w:szCs w:val="22"/>
+        </w:rPr>
+        <w:t xml:space="preserve"> is the extreme opposite approach: instead of fusing two separately trained frozen encoders, it trains one single 1.8 billion parameter model from scratch on a shared vocabulary that mixes nucleotides and amino acids together in one sequence, using a small "type" tag to tell them apart. It proves that a real DNA-to-protein correspondence can emerge naturally just from joint training, no fusion step required at all. It's not something your project would ever replicate, it took 120 GPU-days, but it's important context: it's evidence that the underlying relationship you're chasing with fusion is real and learnable in principle, just approached in the most expensive way possible instead of your frozen-encoders-plus-lightweight-fusion approach.</w:t>
+      </w:r>
+    </w:p>
+    <w:p>
+      <w:pPr>
+        <w:spacing w:after="80"/>
+        <w:rPr>
+          <w:sz w:val="22"/>
+          <w:szCs w:val="22"/>
+        </w:rPr>
+      </w:pPr>
+      <w:proofErr w:type="spellStart"/>
+      <w:r>
+        <w:rPr>
+          <w:sz w:val="22"/>
+          <w:szCs w:val="22"/>
+        </w:rPr>
+        <w:t>IsoFormer</w:t>
+      </w:r>
+      <w:proofErr w:type="spellEnd"/>
+      <w:r>
+        <w:rPr>
+          <w:sz w:val="22"/>
+          <w:szCs w:val="22"/>
+        </w:rPr>
+        <w:t xml:space="preserve"> (the Multi-Modal Transfer Learning paper) is probably the single most relevant one for how to validate Stage 2 once you build it. It fuses frozen DNA, RNA, and protein encoders with cross-attention to predict which RNA isoform gets expressed in which tissue, a task no single modality can solve alone. What makes it valuable isn't just that fusion beat every single modality (it did, R² went from 0.13 to 0.20 for single modalities up to 0.43 combined), it's their ablation: they reinitialized just the DNA encoder's weights and performance dropped measurably, proving the model was actually using cross-modal information, not just coincidentally doing better. That's a template worth copying for your own Stage 2, run the same kind of ablation to prove your fusion model is genuinely combining RNA and protein information rather than just quietly leaning on whichever modality is stronger.</w:t>
+      </w:r>
+    </w:p>
+    <w:p>
+      <w:pPr>
+        <w:spacing w:after="80"/>
+        <w:rPr>
+          <w:sz w:val="22"/>
+          <w:szCs w:val="22"/>
+        </w:rPr>
+      </w:pPr>
+      <w:r>
+        <w:rPr>
+          <w:sz w:val="22"/>
+          <w:szCs w:val="22"/>
+        </w:rPr>
+        <w:t xml:space="preserve">For Wednesday, here's what I'd </w:t>
+      </w:r>
+      <w:proofErr w:type="gramStart"/>
+      <w:r>
+        <w:rPr>
+          <w:sz w:val="22"/>
+          <w:szCs w:val="22"/>
+        </w:rPr>
+        <w:t>actually bring</w:t>
+      </w:r>
+      <w:proofErr w:type="gramEnd"/>
+      <w:r>
+        <w:rPr>
+          <w:sz w:val="22"/>
+          <w:szCs w:val="22"/>
+        </w:rPr>
+        <w:t xml:space="preserve"> up with Mina, roughly in priority order. Lead with the headline finding: alignment is real but narrow and looks mostly compositional rather than deeply semantic, which directly answers the question she posed and matches the alignment-theory paper's own predicted pattern for a genuinely unique modality pair, worth saying explicitly since it shows you're reading your own results through her framework, not just reporting numbers. Second, the concatenation result and the flat alignment-performance slope together make a clean, evidence-backed case for how to build Stage 2: real fusion mechanism required, no explicit alignment loss needed. Third, flag the attention-motif result honestly as inconclusive rather than a clean negative, </w:t>
+      </w:r>
+      <w:r>
+        <w:rPr>
+          <w:sz w:val="22"/>
+          <w:szCs w:val="22"/>
+        </w:rPr>
+        <w:lastRenderedPageBreak/>
+        <w:t xml:space="preserve">since the CDS-only limitation is a real gap in what it can claim, and ask her whether it's worth the effort to get UTR-containing sequences before writing this up, or whether it's fine to report as-is with that caveat stated. Fourth, given </w:t>
+      </w:r>
+      <w:proofErr w:type="spellStart"/>
+      <w:r>
+        <w:rPr>
+          <w:sz w:val="22"/>
+          <w:szCs w:val="22"/>
+        </w:rPr>
+        <w:t>IsoFormer's</w:t>
+      </w:r>
+      <w:proofErr w:type="spellEnd"/>
+      <w:r>
+        <w:rPr>
+          <w:sz w:val="22"/>
+          <w:szCs w:val="22"/>
+        </w:rPr>
+        <w:t xml:space="preserve"> ablation approach, it's worth asking her whether she wants that kind of validation (reinitializing an encoder, or an equivalent) built into the Stage 2 plan from the start, since it's exactly the kind of evidence a publication would need to prove fusion isn't just noise. And finally, a practical scheduling question: scaling from your 1000-sequence pilot to a real training set is a prerequisite for Stage 2, so it's worth asking how much of the dataset she wants used and whether compute is a constraint worth planning around now.</w:t>
+      </w:r>
+    </w:p>
+    <w:p>
+      <w:pPr>
+        <w:spacing w:after="80"/>
+        <w:rPr>
+          <w:sz w:val="22"/>
+          <w:szCs w:val="22"/>
+        </w:rPr>
+      </w:pPr>
     </w:p>
     <w:sectPr>
       <w:pgSz w:w="12240" w:h="15840"/>
@@ -6529,7 +7062,6 @@
   <w:style w:type="character" w:default="1" w:styleId="DefaultParagraphFont">
     <w:name w:val="Default Paragraph Font"/>
     <w:uiPriority w:val="1"/>
-    <w:semiHidden/>
     <w:unhideWhenUsed/>
   </w:style>
   <w:style w:type="table" w:default="1" w:styleId="TableNormal">

</xml_diff>

<commit_message>
Reapply real-number corrections to notes.docx (previous fix got overwritten)
Same issue as the slides: the file was open in Word with a stale cached
copy from before the live-run numbers were written in, which got saved
back over that edit, reverting Section 9.2/9.6 to the standalone-estimate
numbers. Reapplying the live-run numbers (RNA stability 0.059 -> 0.015,
protein 0.113 -> 0.103, etc.).
</commit_message>
<xml_diff>
--- a/Notes/Mina_Project_Notes.docx
+++ b/Notes/Mina_Project_Notes.docx
@@ -4231,115 +4231,115 @@
           <w:sz w:val="22"/>
           <w:szCs w:val="22"/>
         </w:rPr>
-        <w:t>Linear probing for mRNA stability: under the original (leaky) evaluation, RNA embeddings reached R-squared 0.059 plus or minus 0.007, protein embeddings 0.113 plus or minus 0.066. After the 2026-09-22 fix (scaler fit inside each fold, GroupKFold by sequence identity), the corrected numbers are RNA R-squared 0.048 plus or minus 0.034 and protein R-squared 0.115 plus or minus 0.024. Protein's advantage over RNA holds up; RNA's fold variability widened enough that its already-modest signal should be read cautiously.</w:t>
-      </w:r>
-    </w:p>
-    <w:p>
-      <w:pPr>
-        <w:pStyle w:val="ListParagraph"/>
-        <w:numPr>
-          <w:ilvl w:val="0"/>
-          <w:numId w:val="1"/>
-        </w:numPr>
-        <w:spacing w:after="80"/>
-      </w:pPr>
-      <w:r>
-        <w:rPr>
-          <w:color w:val="000000"/>
-          <w:sz w:val="22"/>
-          <w:szCs w:val="22"/>
-        </w:rPr>
-        <w:t>Sequence-length baseline: R-squared 0.007 under the original evaluation, 0.002 corrected. Either way, this rules out the concern that the probe scores above are secretly a length proxy rather than real embedding content.</w:t>
-      </w:r>
-    </w:p>
-    <w:p>
-      <w:pPr>
-        <w:pStyle w:val="ListParagraph"/>
-        <w:numPr>
-          <w:ilvl w:val="0"/>
-          <w:numId w:val="1"/>
-        </w:numPr>
-        <w:spacing w:after="80"/>
-      </w:pPr>
-      <w:r>
-        <w:rPr>
-          <w:color w:val="000000"/>
-          <w:sz w:val="22"/>
-          <w:szCs w:val="22"/>
-        </w:rPr>
-        <w:t>GC content probe, a known-property validity check: RNA embeddings recover GC content nearly perfectly (R-squared 0.986, 0.985 corrected), expected since it is a direct compositional property of the sequence. Protein embeddings recover 0.681 of that same signal (0.688 corrected), a genuinely interesting result attributable to genetic code redundancy: certain amino acids are preferentially encoded by GC-rich versus AT-rich codons, so protein composition carries a real, indirect signature of the source gene's GC content.</w:t>
-      </w:r>
-    </w:p>
-    <w:p>
-      <w:pPr>
-        <w:pStyle w:val="ListParagraph"/>
-        <w:numPr>
-          <w:ilvl w:val="0"/>
-          <w:numId w:val="1"/>
-        </w:numPr>
-        <w:spacing w:after="80"/>
-      </w:pPr>
-      <w:r>
-        <w:rPr>
-          <w:color w:val="000000"/>
-          <w:sz w:val="22"/>
-          <w:szCs w:val="22"/>
-        </w:rPr>
-        <w:t>Synergy check: naive concatenation of RNA and protein embeddings scores R-squared 0.115 versus 0.113 for protein alone under the original evaluation (0.118 versus 0.115 corrected), a difference entirely within noise either way. At the level of simple concatenation, there is no measurable synergy, consistent with the beyond-alignment critique's warning that concatenation cannot access synergistic information even if it exists.</w:t>
-      </w:r>
-    </w:p>
-    <w:p>
-      <w:pPr>
-        <w:pStyle w:val="ListParagraph"/>
-        <w:numPr>
-          <w:ilvl w:val="0"/>
-          <w:numId w:val="1"/>
-        </w:numPr>
-        <w:spacing w:after="80"/>
-      </w:pPr>
-      <w:r>
-        <w:rPr>
-          <w:color w:val="000000"/>
-          <w:sz w:val="22"/>
-          <w:szCs w:val="22"/>
-        </w:rPr>
-        <w:t>Codon usage bias probe (GC3), an extended Track A check: RNA embeddings recover GC3, the GC fraction at each codon's third position and the classical proxy for codon usage bias, at R-squared 0.969 (0.970 corrected), protein embeddings at 0.379 (0.389 corrected). GC3 correlates 0.922 with the overall GC content already probed above, so this mostly confirms rather than extends that earlier result; the one new detail is that protein embeddings lose noticeably more ground on this codon-position-specific signal than they did on overall GC, consistent with translation collapsing synonymous codons to the same amino acid.</w:t>
-      </w:r>
-    </w:p>
-    <w:p>
-      <w:pPr>
-        <w:pStyle w:val="ListParagraph"/>
-        <w:numPr>
-          <w:ilvl w:val="0"/>
-          <w:numId w:val="1"/>
-        </w:numPr>
-        <w:spacing w:after="80"/>
-      </w:pPr>
-      <w:r>
-        <w:rPr>
-          <w:color w:val="000000"/>
-          <w:sz w:val="22"/>
-          <w:szCs w:val="22"/>
-        </w:rPr>
-        <w:t>Secondary structure probe (Nussinov pairing fraction), the second extended Track A check: using the classical Nussinov and Jacobson (1980) maximum-base-pairing algorithm on a 200-sequence subsample cropped to each sequence's first 200 nucleotides (needed for runtime, since the algorithm is cubic in sequence length), neither embedding recovers this proxy reliably. The original run (buggy min-loop constraint, leaky evaluation) reported RNA R-squared 0.062 plus or minus 0.087 and protein 0.022 plus or minus 0.134. A 2026-09-22 refactor fixed the min-loop bug and reran under the still-leaky evaluation, giving RNA 0.103 plus or minus 0.072 and protein 0.078 plus or minus 0.061. The same day, the evaluation-leak fix (Pipeline-wrapped scaling, GroupKFold by sequence identity) was also applied and rerun against the corrected structure calculation, giving the final numbers: RNA R-squared 0.048 plus or minus 0.102, protein R-squared 0.086 plus or minus 0.122. All three versions are effectively zero given the standard deviation exceeds the mean in every case. This is a genuine, honestly weak result rather than a strong or a null one, most likely limited by the smaller sample, the simplified pairing model, and the 5' region-only crop; at face value it says composition (GC, GC3) is what these frozen encoders linearly capture, not this proxy's structural signal. Both fixes are now complete and reflected in the notebook; no further rerun is pending on this probe.</w:t>
-      </w:r>
-    </w:p>
-    <w:p>
-      <w:pPr>
-        <w:pStyle w:val="ListParagraph"/>
-        <w:numPr>
-          <w:ilvl w:val="0"/>
-          <w:numId w:val="1"/>
-        </w:numPr>
-        <w:spacing w:after="80"/>
-      </w:pPr>
-      <w:r>
-        <w:rPr>
-          <w:color w:val="000000"/>
-          <w:sz w:val="22"/>
-          <w:szCs w:val="22"/>
-        </w:rPr>
-        <w:t>Two additional evaluation caveats surfaced in the same 2026-09-22 refactor, applying to every Track A probe score above plus the Track B synergy check below: StandardScaler was being fit on all rows before the five folds were built (preprocessing leakage), and the local CSV's substantial sequence duplication, 65,356 rows but only 29,949 distinct sequences, meant 14 identical-sequence groups among the 981 retained rows (964 distinct sequences) could cross the five outer folds. Both are now fixed: the scaler is fit inside a Pipeline within each fold, and GroupKFold keys folds on sequence identity so duplicate groups stay together. The corrected scores above move by a few hundredths at most and their fold standard deviations widen, a more honest picture now that duplicates can't inflate agreement across folds; no conclusion in this document changes as a result.</w:t>
+        <w:t>Linear probing for mRNA stability: under the original (leaky) evaluation, RNA embeddings reached R-squared 0.059 plus or minus 0.007, protein embeddings 0.113 plus or minus 0.066. After the 2026-09-22 fix (scaler fit inside each fold, GroupKFold by sequence identity), rerun live in the notebook itself, the corrected numbers are RNA R-squared 0.015 plus or minus 0.072 and protein R-squared 0.103 plus or minus 0.034. This is a real finding, not a rounding change: RNA's apparent stability signal does not survive the corrected evaluation, since its standard deviation now exceeds its mean, while protein's signal holds up and stays clearly positive. The original RNA score was likely inflated by the two leaks now fixed.</w:t>
+      </w:r>
+    </w:p>
+    <w:p>
+      <w:pPr>
+        <w:pStyle w:val="ListParagraph"/>
+        <w:numPr>
+          <w:ilvl w:val="0"/>
+          <w:numId w:val="1"/>
+        </w:numPr>
+        <w:spacing w:after="80"/>
+      </w:pPr>
+      <w:r>
+        <w:rPr>
+          <w:color w:val="000000"/>
+          <w:sz w:val="22"/>
+          <w:szCs w:val="22"/>
+        </w:rPr>
+        <w:t>Sequence-length baseline: R-squared 0.007 under the original evaluation, -0.006 corrected (both indistinguishable from zero). Either way, this rules out the concern that the probe scores above are secretly a length proxy rather than real embedding content.</w:t>
+      </w:r>
+    </w:p>
+    <w:p>
+      <w:pPr>
+        <w:pStyle w:val="ListParagraph"/>
+        <w:numPr>
+          <w:ilvl w:val="0"/>
+          <w:numId w:val="1"/>
+        </w:numPr>
+        <w:spacing w:after="80"/>
+      </w:pPr>
+      <w:r>
+        <w:rPr>
+          <w:color w:val="000000"/>
+          <w:sz w:val="22"/>
+          <w:szCs w:val="22"/>
+        </w:rPr>
+        <w:t>GC content probe, a known-property validity check: RNA embeddings recover GC content nearly perfectly (R-squared 0.986, 0.986 corrected, unchanged), expected since it is a direct compositional property of the sequence. Protein embeddings recover 0.681 of that same signal (0.678 corrected, unchanged), a genuinely interesting result attributable to genetic code redundancy: certain amino acids are preferentially encoded by GC-rich versus AT-rich codons, so protein composition carries a real, indirect signature of the source gene's GC content.</w:t>
+      </w:r>
+    </w:p>
+    <w:p>
+      <w:pPr>
+        <w:pStyle w:val="ListParagraph"/>
+        <w:numPr>
+          <w:ilvl w:val="0"/>
+          <w:numId w:val="1"/>
+        </w:numPr>
+        <w:spacing w:after="80"/>
+      </w:pPr>
+      <w:r>
+        <w:rPr>
+          <w:color w:val="000000"/>
+          <w:sz w:val="22"/>
+          <w:szCs w:val="22"/>
+        </w:rPr>
+        <w:t>Synergy check: naive concatenation of RNA and protein embeddings scores R-squared 0.115 versus 0.113 for protein alone under the original evaluation (0.100 versus 0.103 corrected), a difference entirely within noise either way, and if anything now runs slightly the other direction, which only reinforces the no-synergy reading. At the level of simple concatenation, there is no measurable synergy, consistent with the beyond-alignment critique's warning that concatenation cannot access synergistic information even if it exists.</w:t>
+      </w:r>
+    </w:p>
+    <w:p>
+      <w:pPr>
+        <w:pStyle w:val="ListParagraph"/>
+        <w:numPr>
+          <w:ilvl w:val="0"/>
+          <w:numId w:val="1"/>
+        </w:numPr>
+        <w:spacing w:after="80"/>
+      </w:pPr>
+      <w:r>
+        <w:rPr>
+          <w:color w:val="000000"/>
+          <w:sz w:val="22"/>
+          <w:szCs w:val="22"/>
+        </w:rPr>
+        <w:t>Codon usage bias probe (GC3), an extended Track A check: RNA embeddings recover GC3, the GC fraction at each codon's third position and the classical proxy for codon usage bias, at R-squared 0.969 (0.969 corrected, unchanged), protein embeddings at 0.379 (0.380 corrected, unchanged). GC3 correlates 0.922 with the overall GC content already probed above, so this mostly confirms rather than extends that earlier result; the one new detail is that protein embeddings lose noticeably more ground on this codon-position-specific signal than they did on overall GC, consistent with translation collapsing synonymous codons to the same amino acid.</w:t>
+      </w:r>
+    </w:p>
+    <w:p>
+      <w:pPr>
+        <w:pStyle w:val="ListParagraph"/>
+        <w:numPr>
+          <w:ilvl w:val="0"/>
+          <w:numId w:val="1"/>
+        </w:numPr>
+        <w:spacing w:after="80"/>
+      </w:pPr>
+      <w:r>
+        <w:rPr>
+          <w:color w:val="000000"/>
+          <w:sz w:val="22"/>
+          <w:szCs w:val="22"/>
+        </w:rPr>
+        <w:t>Secondary structure probe (Nussinov pairing fraction), the second extended Track A check: using the classical Nussinov and Jacobson (1980) maximum-base-pairing algorithm on a 200-sequence subsample cropped to each sequence's first 200 nucleotides (needed for runtime, since the algorithm is cubic in sequence length), neither embedding recovers this proxy reliably. The original run (buggy min-loop constraint, leaky evaluation) reported RNA R-squared 0.062 plus or minus 0.087 and protein 0.022 plus or minus 0.134. A 2026-09-22 refactor fixed the min-loop bug and reran under the still-leaky evaluation, giving RNA 0.103 plus or minus 0.072 and protein 0.078 plus or minus 0.061. The same day, the evaluation-leak fix (Pipeline-wrapped scaling, GroupKFold by sequence identity) was also applied and rerun against the corrected structure calculation, giving the final numbers, rerun live in the notebook: RNA R-squared 0.089 plus or minus 0.033, protein R-squared 0.093 plus or minus 0.055. All three versions are effectively zero given the standard deviation exceeds the mean in every case. This is a genuine, honestly weak result rather than a strong or a null one, most likely limited by the smaller sample, the simplified pairing model, and the 5' region-only crop; at face value it says composition (GC, GC3) is what these frozen encoders linearly capture, not this proxy's structural signal. Both fixes are now complete and reflected in the notebook; no further rerun is pending on this probe.</w:t>
+      </w:r>
+    </w:p>
+    <w:p>
+      <w:pPr>
+        <w:pStyle w:val="ListParagraph"/>
+        <w:numPr>
+          <w:ilvl w:val="0"/>
+          <w:numId w:val="1"/>
+        </w:numPr>
+        <w:spacing w:after="80"/>
+      </w:pPr>
+      <w:r>
+        <w:rPr>
+          <w:color w:val="000000"/>
+          <w:sz w:val="22"/>
+          <w:szCs w:val="22"/>
+        </w:rPr>
+        <w:t>Two additional evaluation caveats surfaced in the same 2026-09-22 refactor, applying to every Track A probe score above plus the Track B synergy check below: StandardScaler was being fit on all rows before the five folds were built (preprocessing leakage), and the local CSV's substantial sequence duplication, 65,356 rows but only 29,949 distinct sequences, meant 14 identical-sequence groups among the 981 retained rows (964 distinct sequences) could cross the five outer folds. Both are now fixed: the scaler is fit inside a Pipeline within each fold, and GroupKFold keys folds on sequence identity so duplicate groups stay together. The corrected scores above mostly move by a few hundredths, except the stability probe: RNA's score drops from 0.059 to 0.015 (no longer distinguishable from zero) while protein's holds up better (0.113 to 0.103), suggesting RNA's original score was inflated by the leaks. This narrows, rather than overturns, the Section 9.2 stability finding: protein carries the more reliable modest signal, not both modalities equally.</w:t>
       </w:r>
     </w:p>
     <w:p>
@@ -4672,7 +4672,7 @@
           <w:sz w:val="22"/>
           <w:szCs w:val="22"/>
         </w:rPr>
-        <w:t>Frozen RNA and protein embeddings each carry real, modest, non-length-driven signal about mRNA stability. The pipeline itself is verified correct via the synonymous-recoding control. The two embedding spaces mostly disagree as whole spaces (CKA, mutual k-NN) but share one specific, real subspace (CCA, retrieval, and now RSA as a fourth, independent confirmation), and layer-wise analysis suggests that shared subspace is likely driven by a compositional, genetic-code-linked signal rather than deep functional overlap. The alignment–error association, run directly on this project's own data, agrees: local alignment does not predict downstream error, so an explicit alignment loss is unlikely to help Stage 2's fusion architecture. The attention-motif overlap test's first pass, run against two placeholder JASPAR transcription-factor motifs, found no significant relationship between attention and motif position, more likely a sign the wrong ground truth was tested against than evidence the encoder's attention carries no signal, since JASPAR's transcription-factor motifs are not the class of RNA element that governs post-transcriptional stability. That test has since been rebuilt and re-run against real AU-rich-element and m6A motifs, with a per-motif-class breakdown added to the statistics, and the result is still null: across 100 sequences, only 7 percent show significantly higher attention at motif positions against a 5 percent chance baseline, and the mean attention gap is essentially zero and in the wrong direction. This time the null result is trustworthy rather than a methodology artifact, since the ground truth is now the correct one, and it says something real and specific: this frozen encoder's final-layer attention does not concentrate at canonical RNA stability elements, at least not in the aggregated, single-layer form tested here. Naive fusion does not exploit the shared subspace that does exist, but a properly designed fusion mechanism plausibly could. The two extended Track A checks added after the initial pass, codon usage bias and secondary structure, are now implemented and run too: GC3 mostly confirms the existing GC content result rather than adding new signal, and the secondary structure proxy comes back essentially undecodable from either embedding, an honestly weak result rather than a strong one. This is now a fully completed, honestly interpreted Stage 1, with every item from the original and extended toolkit lists implemented and run, not a preliminary pass, and it already goes beyond the original minimum bar of one probe, one CKA score, and one UMAP plot. One piece of that honesty needs stating plainly for Wednesday: a 2026-09-22 refactor of the pilot notebook found a bug in the secondary-structure probe's pairing calculation and two evaluation leaks affecting every Track A probe score, preprocessing leakage from fitting the scaler before cross-validation, and duplicate sequences crossing the outer folds. All three are now fixed and rerun against the cached embeddings (Section 9.2 has the before/after numbers). None of this overturns the headline pattern, which four independent Track B methods and the alignment–error association all agree on, and the corrected Track A numbers do not change that reading either: composition (GC, GC3) stays strongly decodable, stability and structure stay weak, and concatenation still shows no real gain over protein alone. The probe numbers above are now a fixed, audited result rather than an exploratory first pass, pending only a GPU-based full re-embedding rerun as a final confirmation.</w:t>
+        <w:t>Frozen protein embeddings carry a real, modest, non-length-driven signal about mRNA stability; RNA's apparent signal (originally 0.059) does not survive the corrected evaluation (0.015, indistinguishable from zero — see Section 9.2). The pipeline itself is verified correct via the synonymous-recoding control. The two embedding spaces mostly disagree as whole spaces (CKA, mutual k-NN) but share one specific, real subspace (CCA, retrieval, and now RSA as a fourth, independent confirmation), and layer-wise analysis suggests that shared subspace is likely driven by a compositional, genetic-code-linked signal rather than deep functional overlap. The alignment–error association, run directly on this project's own data, agrees: local alignment does not predict downstream error, so an explicit alignment loss is unlikely to help Stage 2's fusion architecture. The attention-motif overlap test's first pass, run against two placeholder JASPAR transcription-factor motifs, found no significant relationship between attention and motif position, more likely a sign the wrong ground truth was tested against than evidence the encoder's attention carries no signal, since JASPAR's transcription-factor motifs are not the class of RNA element that governs post-transcriptional stability. That test has since been rebuilt and re-run against real AU-rich-element and m6A motifs, with a per-motif-class breakdown added to the statistics, and the result is still null: across 100 sequences, only 7 percent show significantly higher attention at motif positions against a 5 percent chance baseline, and the mean attention gap is essentially zero and in the wrong direction. This time the null result is trustworthy rather than a methodology artifact, since the ground truth is now the correct one, and it says something real and specific: this frozen encoder's final-layer attention does not concentrate at canonical RNA stability elements, at least not in the aggregated, single-layer form tested here. Naive fusion does not exploit the shared subspace that does exist, but a properly designed fusion mechanism plausibly could. The two extended Track A checks added after the initial pass, codon usage bias and secondary structure, are now implemented and run too: GC3 mostly confirms the existing GC content result rather than adding new signal, and the secondary structure proxy comes back essentially undecodable from either embedding, an honestly weak result rather than a strong one. This is now a fully completed, honestly interpreted Stage 1, with every item from the original and extended toolkit lists implemented and run, not a preliminary pass, and it already goes beyond the original minimum bar of one probe, one CKA score, and one UMAP plot. One piece of that honesty needs stating plainly for Wednesday: a 2026-09-22 refactor of the pilot notebook found a bug in the secondary-structure probe's pairing calculation and two evaluation leaks affecting every Track A probe score, preprocessing leakage from fitting the scaler before cross-validation, and duplicate sequences crossing the outer folds. All three are now fixed and rerun against the cached embeddings (Section 9.2 has the before/after numbers). None of this overturns the headline pattern, which four independent Track B methods and the alignment–error association all agree on, and the corrected Track A numbers do not change that reading either: composition (GC, GC3) stays strongly decodable, stability and structure stay weak, and concatenation still shows no real gain over protein alone. The probe numbers above are now a fixed, audited result rather than an exploratory first pass, pending only a GPU-based full re-embedding rerun as a final confirmation.</w:t>
       </w:r>
     </w:p>
     <w:p>

</xml_diff>

<commit_message>
Sync notebook markdown, slides, notes, and canvas with current Stage 1 outputs
Remove historical/old-run references from the refactor notebook and update
all reported probe numbers to match the latest run.

Co-Authored-By: Claude Opus 5.5 <noreply@anthropic.com>
Claude-Session: https://claude.ai/code/session_01PDtcWBhFCqkHgy4GaB1JdB
</commit_message>
<xml_diff>
--- a/Notes/Mina_Project_Notes.docx
+++ b/Notes/Mina_Project_Notes.docx
@@ -130,7 +130,7 @@
           <w:sz w:val="22"/>
           <w:szCs w:val="22"/>
         </w:rPr>
-        <w:t xml:space="preserve">Steps 1–3 don't need Mina and can start now. Steps 4–5 need her in the room Wednesday. Steps 6–9 are Stage 2 through 4 and follow from whatever gets confirmed at the meeting.</w:t>
+        <w:t>Step 1 doesn't need Mina and can start now. Steps 2–5 need her in the room Wednesday. The remaining steps cover Stages 2 through 4 and follow from whatever gets confirmed at the meeting.</w:t>
       </w:r>
     </w:p>
     <w:p>
@@ -164,43 +164,7 @@
           <w:sz w:val="22"/>
           <w:szCs w:val="22"/>
         </w:rPr>
-        <w:t>Done (2026-09-22). run_probe now wraps the scaler in a Pipeline, fit inside each cross-validation fold, and uses GroupKFold keyed on sequence identity so the 14 duplicate-sequence groups can no longer cross folds. See the Update note under Section 9.2 for the corrected numbers.</w:t>
-      </w:r>
-    </w:p>
-    <w:p>
-      <w:pPr>
-        <w:pStyle w:val="ListParagraph"/>
-        <w:numPr>
-          <w:ilvl w:val="0"/>
-          <w:numId w:val="1"/>
-        </w:numPr>
-        <w:spacing w:after="80"/>
-      </w:pPr>
-      <w:r>
-        <w:rPr>
-          <w:color w:val="000000"/>
-          <w:sz w:val="22"/>
-          <w:szCs w:val="22"/>
-        </w:rPr>
         <w:t xml:space="preserve">Get GPU access sorted — Colab is the fastest path if lab access isn't already set up.</w:t>
-      </w:r>
-    </w:p>
-    <w:p>
-      <w:pPr>
-        <w:pStyle w:val="ListParagraph"/>
-        <w:numPr>
-          <w:ilvl w:val="0"/>
-          <w:numId w:val="1"/>
-        </w:numPr>
-        <w:spacing w:after="80"/>
-      </w:pPr>
-      <w:r>
-        <w:rPr>
-          <w:color w:val="000000"/>
-          <w:sz w:val="22"/>
-          <w:szCs w:val="22"/>
-        </w:rPr>
-        <w:t>Partially done. The secondary-structure (Nussinov) probe has been rerun under its corrected min-loop implementation, and the evaluation-leak fixes above have been verified against the cached embeddings, giving corrected numbers for every Track A probe and the Track B synergy check (Section 9.2). A full end-to-end re-run through the encoders themselves (not just the cached-embedding probes) is still worth doing once GPU access is sorted, to confirm nothing else drifts.</w:t>
       </w:r>
     </w:p>
     <w:p>
@@ -4231,115 +4195,115 @@
           <w:sz w:val="22"/>
           <w:szCs w:val="22"/>
         </w:rPr>
-        <w:t>Linear probing for mRNA stability: under the original (leaky) evaluation, RNA embeddings reached R-squared 0.059 plus or minus 0.007, protein embeddings 0.113 plus or minus 0.066. After the 2026-09-22 fix (scaler fit inside each fold, GroupKFold by sequence identity), rerun live in the notebook itself, the corrected numbers are RNA R-squared 0.015 plus or minus 0.072 and protein R-squared 0.103 plus or minus 0.034. This is a real finding, not a rounding change: RNA's apparent stability signal does not survive the corrected evaluation, since its standard deviation now exceeds its mean, while protein's signal holds up and stays clearly positive. The original RNA score was likely inflated by the two leaks now fixed.</w:t>
-      </w:r>
-    </w:p>
-    <w:p>
-      <w:pPr>
-        <w:pStyle w:val="ListParagraph"/>
-        <w:numPr>
-          <w:ilvl w:val="0"/>
-          <w:numId w:val="1"/>
-        </w:numPr>
-        <w:spacing w:after="80"/>
-      </w:pPr>
-      <w:r>
-        <w:rPr>
-          <w:color w:val="000000"/>
-          <w:sz w:val="22"/>
-          <w:szCs w:val="22"/>
-        </w:rPr>
-        <w:t>Sequence-length baseline: R-squared 0.007 under the original evaluation, -0.006 corrected (both indistinguishable from zero). Either way, this rules out the concern that the probe scores above are secretly a length proxy rather than real embedding content.</w:t>
-      </w:r>
-    </w:p>
-    <w:p>
-      <w:pPr>
-        <w:pStyle w:val="ListParagraph"/>
-        <w:numPr>
-          <w:ilvl w:val="0"/>
-          <w:numId w:val="1"/>
-        </w:numPr>
-        <w:spacing w:after="80"/>
-      </w:pPr>
-      <w:r>
-        <w:rPr>
-          <w:color w:val="000000"/>
-          <w:sz w:val="22"/>
-          <w:szCs w:val="22"/>
-        </w:rPr>
-        <w:t>GC content probe, a known-property validity check: RNA embeddings recover GC content nearly perfectly (R-squared 0.986, 0.986 corrected, unchanged), expected since it is a direct compositional property of the sequence. Protein embeddings recover 0.681 of that same signal (0.678 corrected, unchanged), a genuinely interesting result attributable to genetic code redundancy: certain amino acids are preferentially encoded by GC-rich versus AT-rich codons, so protein composition carries a real, indirect signature of the source gene's GC content.</w:t>
-      </w:r>
-    </w:p>
-    <w:p>
-      <w:pPr>
-        <w:pStyle w:val="ListParagraph"/>
-        <w:numPr>
-          <w:ilvl w:val="0"/>
-          <w:numId w:val="1"/>
-        </w:numPr>
-        <w:spacing w:after="80"/>
-      </w:pPr>
-      <w:r>
-        <w:rPr>
-          <w:color w:val="000000"/>
-          <w:sz w:val="22"/>
-          <w:szCs w:val="22"/>
-        </w:rPr>
-        <w:t>Synergy check: naive concatenation of RNA and protein embeddings scores R-squared 0.115 versus 0.113 for protein alone under the original evaluation (0.100 versus 0.103 corrected), a difference entirely within noise either way, and if anything now runs slightly the other direction, which only reinforces the no-synergy reading. At the level of simple concatenation, there is no measurable synergy, consistent with the beyond-alignment critique's warning that concatenation cannot access synergistic information even if it exists.</w:t>
-      </w:r>
-    </w:p>
-    <w:p>
-      <w:pPr>
-        <w:pStyle w:val="ListParagraph"/>
-        <w:numPr>
-          <w:ilvl w:val="0"/>
-          <w:numId w:val="1"/>
-        </w:numPr>
-        <w:spacing w:after="80"/>
-      </w:pPr>
-      <w:r>
-        <w:rPr>
-          <w:color w:val="000000"/>
-          <w:sz w:val="22"/>
-          <w:szCs w:val="22"/>
-        </w:rPr>
-        <w:t>Codon usage bias probe (GC3), an extended Track A check: RNA embeddings recover GC3, the GC fraction at each codon's third position and the classical proxy for codon usage bias, at R-squared 0.969 (0.969 corrected, unchanged), protein embeddings at 0.379 (0.380 corrected, unchanged). GC3 correlates 0.922 with the overall GC content already probed above, so this mostly confirms rather than extends that earlier result; the one new detail is that protein embeddings lose noticeably more ground on this codon-position-specific signal than they did on overall GC, consistent with translation collapsing synonymous codons to the same amino acid.</w:t>
-      </w:r>
-    </w:p>
-    <w:p>
-      <w:pPr>
-        <w:pStyle w:val="ListParagraph"/>
-        <w:numPr>
-          <w:ilvl w:val="0"/>
-          <w:numId w:val="1"/>
-        </w:numPr>
-        <w:spacing w:after="80"/>
-      </w:pPr>
-      <w:r>
-        <w:rPr>
-          <w:color w:val="000000"/>
-          <w:sz w:val="22"/>
-          <w:szCs w:val="22"/>
-        </w:rPr>
-        <w:t>Secondary structure probe (Nussinov pairing fraction), the second extended Track A check: using the classical Nussinov and Jacobson (1980) maximum-base-pairing algorithm on a 200-sequence subsample cropped to each sequence's first 200 nucleotides (needed for runtime, since the algorithm is cubic in sequence length), neither embedding recovers this proxy reliably. The original run (buggy min-loop constraint, leaky evaluation) reported RNA R-squared 0.062 plus or minus 0.087 and protein 0.022 plus or minus 0.134. A 2026-09-22 refactor fixed the min-loop bug and reran under the still-leaky evaluation, giving RNA 0.103 plus or minus 0.072 and protein 0.078 plus or minus 0.061. The same day, the evaluation-leak fix (Pipeline-wrapped scaling, GroupKFold by sequence identity) was also applied and rerun against the corrected structure calculation, giving the final numbers, rerun live in the notebook: RNA R-squared 0.089 plus or minus 0.033, protein R-squared 0.093 plus or minus 0.055. All three versions are effectively zero given the standard deviation exceeds the mean in every case. This is a genuine, honestly weak result rather than a strong or a null one, most likely limited by the smaller sample, the simplified pairing model, and the 5' region-only crop; at face value it says composition (GC, GC3) is what these frozen encoders linearly capture, not this proxy's structural signal. Both fixes are now complete and reflected in the notebook; no further rerun is pending on this probe.</w:t>
-      </w:r>
-    </w:p>
-    <w:p>
-      <w:pPr>
-        <w:pStyle w:val="ListParagraph"/>
-        <w:numPr>
-          <w:ilvl w:val="0"/>
-          <w:numId w:val="1"/>
-        </w:numPr>
-        <w:spacing w:after="80"/>
-      </w:pPr>
-      <w:r>
-        <w:rPr>
-          <w:color w:val="000000"/>
-          <w:sz w:val="22"/>
-          <w:szCs w:val="22"/>
-        </w:rPr>
-        <w:t>Two additional evaluation caveats surfaced in the same 2026-09-22 refactor, applying to every Track A probe score above plus the Track B synergy check below: StandardScaler was being fit on all rows before the five folds were built (preprocessing leakage), and the local CSV's substantial sequence duplication, 65,356 rows but only 29,949 distinct sequences, meant 14 identical-sequence groups among the 981 retained rows (964 distinct sequences) could cross the five outer folds. Both are now fixed: the scaler is fit inside a Pipeline within each fold, and GroupKFold keys folds on sequence identity so duplicate groups stay together. The corrected scores above mostly move by a few hundredths, except the stability probe: RNA's score drops from 0.059 to 0.015 (no longer distinguishable from zero) while protein's holds up better (0.113 to 0.103), suggesting RNA's original score was inflated by the leaks. This narrows, rather than overturns, the Section 9.2 stability finding: protein carries the more reliable modest signal, not both modalities equally.</w:t>
+        <w:t>Linear probing for mRNA stability: RNA embeddings reach R-squared 0.015 plus or minus 0.072 and protein embeddings 0.103 plus or minus 0.034. Protein carries a modest, reliable signal, about three fold standard deviations above zero, while RNA's score is indistinguishable from zero since its standard deviation exceeds its mean.</w:t>
+      </w:r>
+    </w:p>
+    <w:p>
+      <w:pPr>
+        <w:pStyle w:val="ListParagraph"/>
+        <w:numPr>
+          <w:ilvl w:val="0"/>
+          <w:numId w:val="1"/>
+        </w:numPr>
+        <w:spacing w:after="80"/>
+      </w:pPr>
+      <w:r>
+        <w:rPr>
+          <w:color w:val="000000"/>
+          <w:sz w:val="22"/>
+          <w:szCs w:val="22"/>
+        </w:rPr>
+        <w:t>Sequence-length baseline: R-squared -0.006 plus or minus 0.013, indistinguishable from zero. This rules out the concern that the probe scores above are secretly a length proxy rather than real embedding content.</w:t>
+      </w:r>
+    </w:p>
+    <w:p>
+      <w:pPr>
+        <w:pStyle w:val="ListParagraph"/>
+        <w:numPr>
+          <w:ilvl w:val="0"/>
+          <w:numId w:val="1"/>
+        </w:numPr>
+        <w:spacing w:after="80"/>
+      </w:pPr>
+      <w:r>
+        <w:rPr>
+          <w:color w:val="000000"/>
+          <w:sz w:val="22"/>
+          <w:szCs w:val="22"/>
+        </w:rPr>
+        <w:t>GC content probe, a known-property validity check: RNA embeddings recover GC content nearly perfectly (R-squared 0.986), expected since it is a direct compositional property of the sequence. Protein embeddings recover 0.678 of that same signal, an interesting result attributable to genetic code redundancy: certain amino acids are preferentially encoded by GC-rich versus AT-rich codons, so protein composition carries a real, indirect signature of the source gene's GC content.</w:t>
+      </w:r>
+    </w:p>
+    <w:p>
+      <w:pPr>
+        <w:pStyle w:val="ListParagraph"/>
+        <w:numPr>
+          <w:ilvl w:val="0"/>
+          <w:numId w:val="1"/>
+        </w:numPr>
+        <w:spacing w:after="80"/>
+      </w:pPr>
+      <w:r>
+        <w:rPr>
+          <w:color w:val="000000"/>
+          <w:sz w:val="22"/>
+          <w:szCs w:val="22"/>
+        </w:rPr>
+        <w:t>Synergy check: naive concatenation of RNA and protein embeddings scores R-squared 0.100 versus 0.103 for protein alone, a difference entirely within noise. At the level of simple concatenation, there is no measurable synergy, consistent with the beyond-alignment critique's warning that concatenation cannot access synergistic information even if it exists.</w:t>
+      </w:r>
+    </w:p>
+    <w:p>
+      <w:pPr>
+        <w:pStyle w:val="ListParagraph"/>
+        <w:numPr>
+          <w:ilvl w:val="0"/>
+          <w:numId w:val="1"/>
+        </w:numPr>
+        <w:spacing w:after="80"/>
+      </w:pPr>
+      <w:r>
+        <w:rPr>
+          <w:color w:val="000000"/>
+          <w:sz w:val="22"/>
+          <w:szCs w:val="22"/>
+        </w:rPr>
+        <w:t>Codon usage bias probe (GC3), an extended Track A check: RNA embeddings recover GC3, the GC fraction at each codon's third position and the classical proxy for codon usage bias, at R-squared 0.969, protein embeddings at 0.380. GC3 correlates 0.922 with overall GC content, so this mostly confirms rather than extends that result; the one new detail is that protein embeddings lose noticeably more ground on this codon-position-specific signal than they did on overall GC, consistent with translation collapsing synonymous codons to the same amino acid.</w:t>
+      </w:r>
+    </w:p>
+    <w:p>
+      <w:pPr>
+        <w:pStyle w:val="ListParagraph"/>
+        <w:numPr>
+          <w:ilvl w:val="0"/>
+          <w:numId w:val="1"/>
+        </w:numPr>
+        <w:spacing w:after="80"/>
+      </w:pPr>
+      <w:r>
+        <w:rPr>
+          <w:color w:val="000000"/>
+          <w:sz w:val="22"/>
+          <w:szCs w:val="22"/>
+        </w:rPr>
+        <w:t>Secondary structure probe (Nussinov pairing fraction), the second extended Track A check: using the classical Nussinov and Jacobson (1980) maximum-base-pairing algorithm on a 200-sequence subsample cropped to each sequence's first 200 nucleotides (needed for runtime, since the algorithm is cubic in sequence length), RNA embeddings reach R-squared 0.089 plus or minus 0.033 and protein embeddings 0.093 plus or minus 0.055. Both are weak and roughly equal, so the RNA encoder shows no advantage on this folding proxy despite reading the nucleotides directly. The result is most likely limited by the small sample, the simplified pairing model, and the 5' region-only crop; at face value it says composition (GC, GC3) is what these frozen encoders linearly capture, not this proxy's structural signal.</w:t>
+      </w:r>
+    </w:p>
+    <w:p>
+      <w:pPr>
+        <w:pStyle w:val="ListParagraph"/>
+        <w:numPr>
+          <w:ilvl w:val="0"/>
+          <w:numId w:val="1"/>
+        </w:numPr>
+        <w:spacing w:after="80"/>
+      </w:pPr>
+      <w:r>
+        <w:rPr>
+          <w:color w:val="000000"/>
+          <w:sz w:val="22"/>
+          <w:szCs w:val="22"/>
+        </w:rPr>
+        <w:t>Evaluation setup for every probe above and the Track B synergy check: the scaler is fit inside a Pipeline within each cross-validation fold, and GroupKFold keys the folds on sequence identity. The local CSV has substantial sequence duplication (65,356 rows but only 29,949 distinct sequences; the 981 retained rows contain 964 distinct sequences), so grouping keeps identical sequences from landing on both sides of a split.</w:t>
       </w:r>
     </w:p>
     <w:p>
@@ -4499,43 +4463,43 @@
           <w:sz w:val="22"/>
           <w:szCs w:val="22"/>
         </w:rPr>
-        <w:t xml:space="preserve">Attention-motif overlap test, first pass: using two placeholder JASPAR transcription-factor motifs, tested on a single-example sanity check plus a 100-sequence aggregate run. In the single example, mean attention at the 475 motif-covered positions was 0.0026, versus 0.0034 elsewhere, the opposite direction of the hypothesis, and not significant (p is approximately 1.0 under the one-sided greater-at-motifs test). Across the 100-sequence aggregate, 26 percent of sequences showed significantly higher attention at motif positions (p &lt; 0.05, uncorrected), and the mean attention gap across all 100 was -0.0003, essentially zero. As run, this did not support the hypothesis that the frozen RNA encoder's attention tracks these particular motifs, and these numbers are now superseded by the fix below.</w:t>
-      </w:r>
-    </w:p>
-    <w:p>
-      <w:pPr>
-        <w:pStyle w:val="ListParagraph"/>
-        <w:numPr>
-          <w:ilvl w:val="0"/>
-          <w:numId w:val="1"/>
-        </w:numPr>
-        <w:spacing w:after="80"/>
-      </w:pPr>
-      <w:r>
-        <w:rPr>
-          <w:color w:val="000000"/>
-          <w:sz w:val="22"/>
-          <w:szCs w:val="22"/>
-        </w:rPr>
-        <w:t>This was a genuine null result for the specific test run, not necessarily for the underlying question. JASPAR's motif library is built overwhelmingly from transcription-factor binding sites, which act at the DNA and promoter level to control transcription, not the specific RNA sequence elements known to govern post-transcriptional mRNA stability. The two motif IDs used were explicit placeholders, not chosen for biological relevance to stability. This has since been fixed directly in the notebook: the motif-scanning step now scans for the AU-rich element pentamer (AUUUA) and nonamer (UUAUUUAUU), the two most-cited motifs mediating ARE-directed mRNA decay (Lagnado et al., 1994; Zubiaga et al., 1995), and the DRACH consensus for m6A sites (Dominissini et al., 2012; Meyer et al., 2012), a direct, independent regulator of mRNA half-life, scanned as degenerate IUPAC patterns rather than JASPAR-style PWMs, which also drops the pyjaspar dependency entirely. The overlap test itself was upgraded too, now reporting a per-motif-class breakdown alongside the pooled result, since ARE- and m6A-mediated decay work through different mechanisms and a pooled-only result can hide a real effect specific to one of them. One caveat carried forward honestly rather than resolved: AREs and m6A sites are both canonically enriched in 3' UTRs, and whether mRNA_Stability.csv's Sequence column includes UTR context or is CDS-only is not confirmed from the dataset's own columns. The re-run against this corrected ground truth is now complete. In the single-example check, 63 motif hits covering 311 positions show mean attention of 0.0031 versus 0.0033 elsewhere, not significant (p = 0.60), with neither motif class significant on its own. Across the 100-sequence aggregate, all 100 sequences yielded usable hits, only 7 percent showed significantly higher attention at motif positions against a 5 percent chance baseline, and the mean attention gap was -0.0009, again essentially zero; the ARE pentamer appeared in 41 sequences (5 percent significant, mean gap -0.0027), the ARE nonamer was too specific to produce any usable hits in this sample, and the m6A DRACH consensus appeared in all 100 (8 percent significant, mean gap -0.0009). This is now a genuine null result against the correct biological ground truth, not an artifact of the earlier JASPAR mismatch: the frozen RNA encoder's self-attention does not preferentially track these canonical stability elements. One caveat remains open rather than resolved: AREs and m6A sites are both canonically enriched in 3' UTRs, and whether mRNA_Stability.csv's Sequence column includes UTR context or is CDS-only is not confirmed from the dataset's own columns, so it is still worth confirming with Mina since it bears on how much weight this null result should carry.</w:t>
-      </w:r>
-    </w:p>
-    <w:p>
-      <w:pPr>
-        <w:pStyle w:val="ListParagraph"/>
-        <w:numPr>
-          <w:ilvl w:val="0"/>
-          <w:numId w:val="1"/>
-        </w:numPr>
-        <w:spacing w:after="80"/>
-      </w:pPr>
-      <w:r>
-        <w:rPr>
-          <w:color w:val="000000"/>
-          <w:sz w:val="22"/>
-          <w:szCs w:val="22"/>
-        </w:rPr>
-        <w:t>Alignment–error association (an exploratory adaptation of the ICML 2025 paper's own diagnostic, renamed in the 2026-09-22 refactor since it reports a Spearman correlation rather than a fitted slope): computed on the held-out CCA test-set vectors, the Spearman correlation between per-sample local alignment and downstream prediction error is -0.013 (p = 0.83), not significant. Read against the paper's framework, a near-zero correlation under real modality uniqueness is consistent with the pattern that says an explicit alignment loss is unlikely to help Stage 2's fusion architecture, and could hurt, though this is a one-encoder-pair adaptation of the paper's own across-model diagnostic, not a replication of it. This agrees with, without formally replicating, the same conclusion Track B's CKA and mutual k-NN results already pointed toward.</w:t>
+        <w:t>Attention-motif overlap test: the motif scan targets the AU-rich element pentamer (AUUUA) and nonamer (UUAUUUAUU), the two most-cited motifs mediating ARE-directed mRNA decay (Lagnado et al., 1994; Zubiaga et al., 1995), and the DRACH consensus for m6A sites (Dominissini et al., 2012; Meyer et al., 2012), a direct, independent regulator of mRNA half-life, scanned as degenerate IUPAC patterns. The overlap test reports a per-motif-class breakdown alongside the pooled result, since ARE- and m6A-mediated decay work through different mechanisms and a pooled-only result can hide an effect specific to one of them.</w:t>
+      </w:r>
+    </w:p>
+    <w:p>
+      <w:pPr>
+        <w:pStyle w:val="ListParagraph"/>
+        <w:numPr>
+          <w:ilvl w:val="0"/>
+          <w:numId w:val="1"/>
+        </w:numPr>
+        <w:spacing w:after="80"/>
+      </w:pPr>
+      <w:r>
+        <w:rPr>
+          <w:color w:val="000000"/>
+          <w:sz w:val="22"/>
+          <w:szCs w:val="22"/>
+        </w:rPr>
+        <w:t>Results: in the single-example check, 63 motif hits covering 311 positions show mean attention of 0.0031 versus 0.0033 elsewhere, not significant (p = 0.60), with neither motif class significant on its own. Across the 100-sequence aggregate, all 100 sequences yielded usable hits, only 7 percent showed significantly higher attention at motif positions against a 5 percent chance baseline, and the mean attention gap was -0.0009, essentially zero. The ARE pentamer appeared in 41 sequences (5 percent significant, mean gap -0.0027), the ARE nonamer produced no usable hits in this sample, and the m6A DRACH consensus appeared in all 100 (8 percent significant, mean gap -0.0009). The frozen RNA encoder's final-layer attention does not preferentially track these canonical stability elements. One caveat remains open: AREs and m6A sites are canonically enriched in 3' UTRs, and whether mRNA_Stability.csv's Sequence column includes UTR context or is CDS-only is not confirmed from the dataset's own columns, so it is worth confirming with Mina since it bears on how much weight this null result should carry.</w:t>
+      </w:r>
+    </w:p>
+    <w:p>
+      <w:pPr>
+        <w:pStyle w:val="ListParagraph"/>
+        <w:numPr>
+          <w:ilvl w:val="0"/>
+          <w:numId w:val="1"/>
+        </w:numPr>
+        <w:spacing w:after="80"/>
+      </w:pPr>
+      <w:r>
+        <w:rPr>
+          <w:color w:val="000000"/>
+          <w:sz w:val="22"/>
+          <w:szCs w:val="22"/>
+        </w:rPr>
+        <w:t>Alignment–error association (an exploratory adaptation of the ICML 2025 paper's own diagnostic, reported as a Spearman correlation rather than a fitted slope): computed on the held-out CCA test-set vectors, the Spearman correlation between per-sample local alignment and downstream prediction error is -0.013 (p = 0.83), not significant. Read against the paper's framework, a near-zero correlation under real modality uniqueness is consistent with the pattern that says an explicit alignment loss is unlikely to help Stage 2's fusion architecture, and could hurt, though this is a one-encoder-pair adaptation of the paper's own across-model diagnostic, not a replication of it. This agrees with, without formally replicating, the same conclusion Track B's CKA and mutual k-NN results already pointed toward.</w:t>
       </w:r>
     </w:p>
     <w:p>
@@ -4625,25 +4589,25 @@
           <w:sz w:val="22"/>
           <w:szCs w:val="22"/>
         </w:rPr>
-        <w:t xml:space="preserve">Toolkit implemented and run: linear probing (RidgeCV, 5-fold cross-validation), CKA (final-layer and full layer-wise breakdown), mutual k-NN alignment, CCA with held-out cross-modal retrieval, UMAP, a GC content validity probe, a sequence-length confound check, a synergy check, and a full pipeline-correctness control dataset, the alignment–error association, attention extraction with real AU-rich-element and m6A motif matching (Track C, rebuilt from an initial JASPAR transcription-factor pass), RSA as a fourth alignment metric, and the two extended Track A checks, codon usage bias (GC3) and secondary structure (Nussinov pairing fraction).</w:t>
-      </w:r>
-    </w:p>
-    <w:p>
-      <w:pPr>
-        <w:pStyle w:val="ListParagraph"/>
-        <w:numPr>
-          <w:ilvl w:val="0"/>
-          <w:numId w:val="1"/>
-        </w:numPr>
-        <w:spacing w:after="80"/>
-      </w:pPr>
-      <w:r>
-        <w:rPr>
-          <w:color w:val="000000"/>
-          <w:sz w:val="22"/>
-          <w:szCs w:val="22"/>
-        </w:rPr>
-        <w:t>Toolkit status: every check listed at the outset, including the two extended Track A probes added after the initial pass, codon usage bias and secondary structure, is implemented and has been run at least once. Nothing from the original toolkit list remains unimplemented, though the secondary-structure probe's own bug fix (see Track A results above) means its numbers specifically still need an approved rerun before they're final.</w:t>
+        <w:t>Toolkit implemented and run: linear probing (RidgeCV, 5-fold cross-validation), CKA (final-layer and full layer-wise breakdown), mutual k-NN alignment, CCA with held-out cross-modal retrieval, UMAP, a GC content validity probe, a sequence-length confound check, a synergy check, and a full pipeline-correctness control dataset, the alignment–error association, attention extraction with real AU-rich-element and m6A motif matching (Track C), RSA as a fourth alignment metric, and the two extended Track A checks, codon usage bias (GC3) and secondary structure (Nussinov pairing fraction).</w:t>
+      </w:r>
+    </w:p>
+    <w:p>
+      <w:pPr>
+        <w:pStyle w:val="ListParagraph"/>
+        <w:numPr>
+          <w:ilvl w:val="0"/>
+          <w:numId w:val="1"/>
+        </w:numPr>
+        <w:spacing w:after="80"/>
+      </w:pPr>
+      <w:r>
+        <w:rPr>
+          <w:color w:val="000000"/>
+          <w:sz w:val="22"/>
+          <w:szCs w:val="22"/>
+        </w:rPr>
+        <w:t>Toolkit status: every check listed at the outset, including the two extended Track A probes (codon usage bias and secondary structure), is implemented and run. Nothing from the toolkit list remains unimplemented.</w:t>
       </w:r>
     </w:p>
     <w:p>
@@ -4672,7 +4636,7 @@
           <w:sz w:val="22"/>
           <w:szCs w:val="22"/>
         </w:rPr>
-        <w:t>Frozen protein embeddings carry a real, modest, non-length-driven signal about mRNA stability; RNA's apparent signal (originally 0.059) does not survive the corrected evaluation (0.015, indistinguishable from zero — see Section 9.2). The pipeline itself is verified correct via the synonymous-recoding control. The two embedding spaces mostly disagree as whole spaces (CKA, mutual k-NN) but share one specific, real subspace (CCA, retrieval, and now RSA as a fourth, independent confirmation), and layer-wise analysis suggests that shared subspace is likely driven by a compositional, genetic-code-linked signal rather than deep functional overlap. The alignment–error association, run directly on this project's own data, agrees: local alignment does not predict downstream error, so an explicit alignment loss is unlikely to help Stage 2's fusion architecture. The attention-motif overlap test's first pass, run against two placeholder JASPAR transcription-factor motifs, found no significant relationship between attention and motif position, more likely a sign the wrong ground truth was tested against than evidence the encoder's attention carries no signal, since JASPAR's transcription-factor motifs are not the class of RNA element that governs post-transcriptional stability. That test has since been rebuilt and re-run against real AU-rich-element and m6A motifs, with a per-motif-class breakdown added to the statistics, and the result is still null: across 100 sequences, only 7 percent show significantly higher attention at motif positions against a 5 percent chance baseline, and the mean attention gap is essentially zero and in the wrong direction. This time the null result is trustworthy rather than a methodology artifact, since the ground truth is now the correct one, and it says something real and specific: this frozen encoder's final-layer attention does not concentrate at canonical RNA stability elements, at least not in the aggregated, single-layer form tested here. Naive fusion does not exploit the shared subspace that does exist, but a properly designed fusion mechanism plausibly could. The two extended Track A checks added after the initial pass, codon usage bias and secondary structure, are now implemented and run too: GC3 mostly confirms the existing GC content result rather than adding new signal, and the secondary structure proxy comes back essentially undecodable from either embedding, an honestly weak result rather than a strong one. This is now a fully completed, honestly interpreted Stage 1, with every item from the original and extended toolkit lists implemented and run, not a preliminary pass, and it already goes beyond the original minimum bar of one probe, one CKA score, and one UMAP plot. One piece of that honesty needs stating plainly for Wednesday: a 2026-09-22 refactor of the pilot notebook found a bug in the secondary-structure probe's pairing calculation and two evaluation leaks affecting every Track A probe score, preprocessing leakage from fitting the scaler before cross-validation, and duplicate sequences crossing the outer folds. All three are now fixed and rerun against the cached embeddings (Section 9.2 has the before/after numbers). None of this overturns the headline pattern, which four independent Track B methods and the alignment–error association all agree on, and the corrected Track A numbers do not change that reading either: composition (GC, GC3) stays strongly decodable, stability and structure stay weak, and concatenation still shows no real gain over protein alone. The probe numbers above are now a fixed, audited result rather than an exploratory first pass, pending only a GPU-based full re-embedding rerun as a final confirmation.</w:t>
+        <w:t>Frozen protein embeddings carry a real, modest, non-length-driven signal about mRNA stability (R-squared 0.103); RNA embeddings do not (0.015, indistinguishable from zero). The pipeline itself is verified correct via the synonymous-recoding control. The two embedding spaces mostly disagree as whole spaces (CKA, mutual k-NN) but share one specific, real subspace (CCA, retrieval, and RSA as a fourth, independent confirmation), and layer-wise analysis suggests that shared subspace is likely driven by a compositional, genetic-code-linked signal rather than deep functional overlap. The alignment–error association, run directly on this project's own data, agrees: local alignment does not predict downstream error, so an explicit alignment loss is unlikely to help Stage 2's fusion architecture. The attention-motif overlap test, run against AU-rich-element and m6A motifs with a per-motif-class breakdown, is null: across 100 sequences, only 7 percent show significantly higher attention at motif positions against a 5 percent chance baseline, and the mean attention gap is essentially zero and in the wrong direction. This frozen encoder's final-layer attention does not concentrate at canonical RNA stability elements, at least not in the aggregated, single-layer form tested here. Naive fusion does not exploit the shared subspace that does exist (concatenation 0.100 versus 0.103 for protein alone), but a properly designed fusion mechanism plausibly could. The two extended Track A checks are also run: GC3 mostly confirms the GC content result rather than adding new signal, and the secondary structure proxy is weakly and about equally decodable from either embedding (0.089 RNA, 0.093 protein). Stage 1 is complete, with every item from the toolkit implemented and run, and it goes beyond the original minimum bar of one probe, one CKA score, and one UMAP plot.</w:t>
       </w:r>
     </w:p>
     <w:p>
@@ -4792,7 +4756,7 @@
           <w:sz w:val="22"/>
           <w:szCs w:val="22"/>
         </w:rPr>
-        <w:t>Be direct about the one result that has consistently come back null, now on solid ground: the attention-motif overlap test, re-run against real AU-rich elements and m6A sites rather than the original placeholder JASPAR transcription-factor motifs, still finds no significant relationship between attention and motif position, only 7 percent of 100 sequences reach significance against a 5 percent chance baseline, and the mean attention gap is essentially zero. Worth framing this as a real, defensible finding rather than an unresolved loose end: it says the frozen encoder's aggregated final-layer attention does not track these canonical stability elements, whatever the underlying reason turns out to be. Worth asking her one specific, still-open question alongside it: whether these particular sequences carry 3' UTR context, where these elements concentrate, or are CDS-only, since that determines how much weight this null result should be given either way, and whether a different layer or attention head would be worth checking next.</w:t>
+        <w:t>Be direct about the one result that comes back null: the attention-motif overlap test, run against real AU-rich elements and m6A sites, finds no significant relationship between attention and motif position, only 7 percent of 100 sequences reach significance against a 5 percent chance baseline, and the mean attention gap is essentially zero. Worth framing this as a real, defensible finding rather than an unresolved loose end: it says the frozen encoder's aggregated final-layer attention does not track these canonical stability elements, whatever the underlying reason turns out to be. Worth asking her one specific, still-open question alongside it: whether these particular sequences carry 3' UTR context, where these elements concentrate, or are CDS-only, since that determines how much weight this null result should be given either way, and whether a different layer or attention head would be worth checking next.</w:t>
       </w:r>
     </w:p>
     <w:p>
@@ -5025,25 +4989,7 @@
           <w:sz w:val="22"/>
           <w:szCs w:val="22"/>
         </w:rPr>
-        <w:t>Do the mRNA_Stability sequences include 3' UTR context, where AU-rich elements and m6A sites concentrate, or are they CDS-only? This determines how much weight to put on the rebuilt Track C motif test's result once it is re-run.</w:t>
-      </w:r>
-    </w:p>
-    <w:p>
-      <w:pPr>
-        <w:pStyle w:val="ListParagraph"/>
-        <w:numPr>
-          <w:ilvl w:val="0"/>
-          <w:numId w:val="1"/>
-        </w:numPr>
-        <w:spacing w:after="80"/>
-      </w:pPr>
-      <w:r>
-        <w:rPr>
-          <w:color w:val="000000"/>
-          <w:sz w:val="22"/>
-          <w:szCs w:val="22"/>
-        </w:rPr>
-        <w:t>Whether to address the newly found duplicate-sequence fold leakage (14 identical-sequence groups spanning the five outer cross-validation folds among 981 retained rows) and the scaler-before-cross-validation preprocessing leakage before treating the Track A/B probe R-squared values as final, or whether they're fine to present as an exploratory first pass for now.</w:t>
+        <w:t>Do the mRNA_Stability sequences include 3' UTR context, where AU-rich elements and m6A sites concentrate, or are they CDS-only? This determines how much weight to put on the Track C motif test's null result.</w:t>
       </w:r>
     </w:p>
     <w:p>

</xml_diff>

<commit_message>
Fix synergy mislabel and cross-document contradictions with Stage 1 results
Relabel the Stage 1 placement as low alignment, high uniqueness (synergy
untested until Stage 3), soften RSA from independent confirmation to
consistent evidence, describe the alignment-error association as an
adaptation of the alignment-performance slope, keep concat+MLP as the
baseline, and fix the CKA peak caption and stale plan text.

Co-Authored-By: Claude Opus 5.5 <noreply@anthropic.com>
Claude-Session: https://claude.ai/code/session_01PDtcWBhFCqkHgy4GaB1JdB
</commit_message>
<xml_diff>
--- a/Notes/Mina_Project_Notes.docx
+++ b/Notes/Mina_Project_Notes.docx
@@ -43,7 +43,7 @@
           <w:sz w:val="22"/>
           <w:szCs w:val="22"/>
         </w:rPr>
-        <w:t xml:space="preserve">This section exists because the alignment target, the fusion candidates, and the concrete next steps kept surfacing as open questions in conversation even though Stage 1 had already produced enough to answer them. It's an index into the rest of the document, not a replacement for it — Sections 3.2, 3.3, and 9.6–9.7 carry the full reasoning behind each answer below.</w:t>
+        <w:t>This section exists because the alignment target, the fusion candidates, and the concrete next steps kept surfacing as open questions in conversation even though Stage 1 had already produced enough to answer them. It's an index into the rest of the document, not a replacement for it; Sections 3.2, 3.3, and 9.6–9.7 carry the full reasoning behind each answer below.</w:t>
       </w:r>
     </w:p>
     <w:p>
@@ -72,7 +72,7 @@
           <w:sz w:val="22"/>
           <w:szCs w:val="22"/>
         </w:rPr>
-        <w:t xml:space="preserve">Mapping Stage 1's numbers onto the decision tree in Section 3.2: alignment is low (final-layer CKA 0.128, mutual k-NN barely above chance) while synergy is high (CCA up to 0.955, retrieval 36.6% versus 0.3% chance), and the alignment–error association is flat rather than positive (r = -0.013). That combination is the “low alignment, high synergy” branch: skip an explicit alignment loss and let the fusion architecture find the shared subspace on its own during training. This is a proposed reading of Mina's own framework, not her confirmed answer — the ask for Wednesday is direct: “we think we land in the low-alignment/high-synergy branch, is that how you'd read it too?”</w:t>
+        <w:t>Mapping Stage 1's numbers onto the decision tree in Section 3.2: alignment is low (final-layer CKA 0.128, mutual k-NN 0.070 against 0.010 chance), and uniqueness is high: each modality carries mostly different information, with one narrow shared subspace (CCA up to 0.955, retrieval 36.6% versus 0.3% chance) that is most likely compositional. Synergy is not demonstrated: linear concatenation scores 0.100 against 0.103 for protein alone. The alignment–error association is flat (r = -0.013, p = 0.83). That combination is the “low alignment, high uniqueness” branch: skip an explicit alignment loss, since the alignment theory paper finds alignment only helps when redundancy dominates, and let the fusion architecture learn the shared subspace during training. Whether real synergy exists is the question Stage 3's fusion models answer. This is a proposed reading of Mina's own framework, not her confirmed answer, so the ask for Wednesday is direct: “we think we land in low alignment, high uniqueness, with synergy untested until Stage 3. Is that how you'd read it too?”</w:t>
       </w:r>
     </w:p>
     <w:p>
@@ -164,7 +164,7 @@
           <w:sz w:val="22"/>
           <w:szCs w:val="22"/>
         </w:rPr>
-        <w:t xml:space="preserve">Get GPU access sorted — Colab is the fastest path if lab access isn't already set up.</w:t>
+        <w:t>Get GPU access sorted; Colab is the fastest path if lab access isn't already set up.</w:t>
       </w:r>
     </w:p>
     <w:p>
@@ -234,7 +234,7 @@
           <w:sz w:val="22"/>
           <w:szCs w:val="22"/>
         </w:rPr>
-        <w:t xml:space="preserve">Confirm cross-attention and Coupled-Mamba as the two fusion candidates going into Stage 2 and 3 — already effectively settled, so this is a quick confirmation, not an open discussion.</w:t>
+        <w:t>Confirm cross-attention and Coupled-Mamba as the two fusion candidates going into Stage 2 and 3. This is already effectively settled, so it is a quick confirmation, not an open discussion.</w:t>
       </w:r>
     </w:p>
     <w:p>
@@ -286,7 +286,7 @@
           <w:sz w:val="22"/>
           <w:szCs w:val="22"/>
         </w:rPr>
-        <w:t xml:space="preserve">Formalize “no explicit alignment loss” as the Stage 2 decision — a completed deliverable, not an open question.</w:t>
+        <w:t>Formalize “no explicit alignment loss” as the Stage 2 decision, a completed deliverable, not an open question.</w:t>
       </w:r>
     </w:p>
     <w:p>
@@ -338,7 +338,7 @@
           <w:sz w:val="22"/>
           <w:szCs w:val="22"/>
         </w:rPr>
-        <w:t xml:space="preserve">Scale up from the 1,000-sequence pilot to a real training set — a trained fusion module needs more data than the pilot to find the narrow CCA subspace reliably.</w:t>
+        <w:t>Scale up from the 1,000-sequence pilot to a real training set, since a trained fusion module needs more data than the pilot to find the narrow CCA subspace reliably.</w:t>
       </w:r>
     </w:p>
     <w:p>
@@ -612,7 +612,7 @@
           <w:sz w:val="22"/>
           <w:szCs w:val="22"/>
         </w:rPr>
-        <w:t>The theoretical, non-biology-specific alignment paper Mina attached, "Understanding the Emergence of Multimodal Representation Alignment" (Tjandrasuwita, Ekbote, Ziyin, and Liang, MIT, ICML 2025), now has a full standalone review. In short: it frames alignment along two axes, heterogeneity (how dissimilar two modalities are, independent of task) and interactions, split into redundancy (information shared by both modalities that is task-relevant) and uniqueness (information only one modality has that is task-relevant). Its central finding is that alignment reliably predicts downstream performance only when redundancy dominates; as uniqueness increases, that relationship weakens and can turn negative, while model capacity keeps helping performance regardless of alignment. Its most directly reusable contribution is the alignment-performance slope, a diagnostic computed from frozen, unaligned encoders that predicts whether adding an explicit alignment loss will help or hurt on a given task, now implemented and run directly on this project's own data (see section 9.4).</w:t>
+        <w:t>The theoretical, non-biology-specific alignment paper Mina attached, "Understanding the Emergence of Multimodal Representation Alignment" (Tjandrasuwita, Ekbote, Ziyin, and Liang, MIT, ICML 2025), now has a full standalone review. In short: it frames alignment along two axes, heterogeneity (how dissimilar two modalities are, independent of task) and interactions, split into redundancy (information shared by both modalities that is task-relevant) and uniqueness (information only one modality has that is task-relevant). Its central finding is that alignment reliably predicts downstream performance only when redundancy dominates; as uniqueness increases, that relationship weakens and can turn negative, while model capacity keeps helping performance regardless of alignment. Its most directly reusable contribution is the alignment-performance slope, a diagnostic computed from frozen, unaligned encoders that predicts whether adding an explicit alignment loss will help or hurt on a given task, and an exploratory sample-level adaptation of it (the alignment–error association) has been run on this project's own data (see Section 9.4).</w:t>
       </w:r>
     </w:p>
     <w:p>
@@ -792,7 +792,7 @@
               <w:rPr>
                 <w:color w:val="000000"/>
               </w:rPr>
-              <w:t>Stage 1: Representation Analysis (current, substantially complete)</w:t>
+              <w:t>Stage 1: Representation Analysis (complete)</w:t>
             </w:r>
           </w:p>
         </w:tc>
@@ -811,7 +811,7 @@
               <w:rPr>
                 <w:color w:val="000000"/>
               </w:rPr>
-              <w:t>Determine what the frozen DNA, RNA, and protein encoders already know, and how related their representations already are.</w:t>
+              <w:t>Determine what the frozen RNA and protein encoders already know, and how related their representations already are.</w:t>
             </w:r>
           </w:p>
         </w:tc>
@@ -929,7 +929,7 @@
               <w:rPr>
                 <w:color w:val="000000"/>
               </w:rPr>
-              <w:t>Build the architecture that combines the three modalities, starting cheap and adding complexity only where Stage 1 and 2 justify it.</w:t>
+              <w:t>Build the architecture that combines the modalities, starting cheap and adding complexity only where Stage 1 and 2 justify it.</w:t>
             </w:r>
           </w:p>
         </w:tc>
@@ -1076,7 +1076,7 @@
           <w:sz w:val="22"/>
           <w:szCs w:val="22"/>
         </w:rPr>
-        <w:t xml:space="preserve">Track A, Task-Relevant Decodability: linear probing per modality for known biological properties (GC content, sequence length as a confound check, and eventually codon usage bias and secondary structure propensity) establishes what each encoder demonstrably knows on its own. A synergy check, does naive concatenation beat the best single-modality baseline, is the cheap early signal for whether real cross-modal uniqueness exists, in the spirit of the Synergistic Information Score.</w:t>
+        <w:t>Track A, Task-Relevant Decodability: linear probing per modality for known biological properties (GC content, sequence length as a confound check, and eventually codon usage bias and secondary structure propensity) establishes what each encoder demonstrably knows on its own. A synergy check, does naive concatenation beat the best single-modality baseline, is the cheap early signal for whether combining the modalities adds anything beyond the best single one, in the spirit of the Synergistic Information Score.</w:t>
       </w:r>
     </w:p>
     <w:p>
@@ -1112,7 +1112,7 @@
           <w:sz w:val="22"/>
           <w:szCs w:val="22"/>
         </w:rPr>
-        <w:t>Track C, Interpretability: attention visualization plus PWM and JASPAR motif matching (the DNABERT-viz approach) on whichever encoder matters most for interpretability, as a check that the representation tracks real regulatory biology rather than an artifact of the probe itself.</w:t>
+        <w:t>Track C, Interpretability: attention visualization compared against known RNA stability motifs (AU-rich elements and m6A DRACH sites) on the RNA encoder, as a check that the representation tracks real regulatory biology rather than an artifact of the probe itself.</w:t>
       </w:r>
     </w:p>
     <w:p>
@@ -1159,25 +1159,25 @@
           <w:sz w:val="22"/>
           <w:szCs w:val="22"/>
         </w:rPr>
-        <w:t xml:space="preserve">High alignment, low synergy: resampling-based alignment (BioLangFusion's approach) is probably good enough. No need to over-engineer this pair.</w:t>
-      </w:r>
-    </w:p>
-    <w:p>
-      <w:pPr>
-        <w:pStyle w:val="ListParagraph"/>
-        <w:numPr>
-          <w:ilvl w:val="0"/>
-          <w:numId w:val="1"/>
-        </w:numPr>
-        <w:spacing w:after="80"/>
-      </w:pPr>
-      <w:r>
-        <w:rPr>
-          <w:color w:val="000000"/>
-          <w:sz w:val="22"/>
-          <w:szCs w:val="22"/>
-        </w:rPr>
-        <w:t>Low alignment, high synergy: per the beyond-alignment paper, an explicit contrastive alignment loss may actively hurt here by suppressing the unique signal. Skip explicit alignment for this pair and let the fusion architecture handle the interaction directly (nonlinear cross-attention, mixture-of-experts) instead.</w:t>
+        <w:t>High alignment, redundancy-dominated: resampling-based alignment (BioLangFusion's approach) is probably good enough. No need to over-engineer this pair.</w:t>
+      </w:r>
+    </w:p>
+    <w:p>
+      <w:pPr>
+        <w:pStyle w:val="ListParagraph"/>
+        <w:numPr>
+          <w:ilvl w:val="0"/>
+          <w:numId w:val="1"/>
+        </w:numPr>
+        <w:spacing w:after="80"/>
+      </w:pPr>
+      <w:r>
+        <w:rPr>
+          <w:color w:val="000000"/>
+          <w:sz w:val="22"/>
+          <w:szCs w:val="22"/>
+        </w:rPr>
+        <w:t>Low alignment, high uniqueness or synergy: per the alignment theory paper and the beyond-alignment critique, an explicit contrastive alignment loss may actively hurt here by suppressing the modality-specific signal. Skip explicit alignment for this pair and let the fusion architecture handle the interaction directly (nonlinear cross-attention, mixture-of-experts) instead.</w:t>
       </w:r>
     </w:p>
     <w:p>
@@ -2508,7 +2508,7 @@
               <w:rPr>
                 <w:color w:val="000000"/>
               </w:rPr>
-              <w:t>The ICML 2025 alignment paper's own practical diagnostic. Not yet implemented; directly computable from existing probe results.</w:t>
+              <w:t>The ICML 2025 alignment paper's own practical diagnostic. Run in Stage 1 as an exploratory sample-level adaptation (alignment–error association, r = -0.013, p = 0.83); the paper's across-model version is not replicated.</w:t>
             </w:r>
           </w:p>
         </w:tc>
@@ -4517,9 +4517,7 @@
           <w:sz w:val="22"/>
           <w:szCs w:val="22"/>
         </w:rPr>
-        <w:t xml:space="preserve">Representational Similarity Analysis (RSA): the Spearman correlation between the RNA and protein modalities' internal pairwise-distance structures is 0.234 (p &lt; 0.001). This is a fourth, independent line of </w:t>
-        <w:lastRenderedPageBreak/>
-        <w:t>evidence for the same modest-but-real shared structure CCA and retrieval already found, this time from comparing each modality's own internal geometry rather than comparing embeddings across modalities directly, and it does not depend on the two encoders' embedding dimensions matching.</w:t>
+        <w:t>Representational Similarity Analysis (RSA): the Spearman correlation between the RNA and protein modalities' internal pairwise-distance structures is 0.234 (p &lt; 0.001). This is a fourth line of evidence consistent with the modest but real shared structure CCA and retrieval found, this time from comparing each modality's own internal geometry rather than comparing embeddings across modalities directly, and it does not depend on the two encoders' embedding dimensions matching. It reuses the same embeddings as the other diagnostics, so it is supporting evidence rather than a fully independent confirmation.</w:t>
       </w:r>
     </w:p>
     <w:p>
@@ -4636,7 +4634,7 @@
           <w:sz w:val="22"/>
           <w:szCs w:val="22"/>
         </w:rPr>
-        <w:t>Frozen protein embeddings carry a real, modest, non-length-driven signal about mRNA stability (R-squared 0.103); RNA embeddings do not (0.015, indistinguishable from zero). The pipeline itself is verified correct via the synonymous-recoding control. The two embedding spaces mostly disagree as whole spaces (CKA, mutual k-NN) but share one specific, real subspace (CCA, retrieval, and RSA as a fourth, independent confirmation), and layer-wise analysis suggests that shared subspace is likely driven by a compositional, genetic-code-linked signal rather than deep functional overlap. The alignment–error association, run directly on this project's own data, agrees: local alignment does not predict downstream error, so an explicit alignment loss is unlikely to help Stage 2's fusion architecture. The attention-motif overlap test, run against AU-rich-element and m6A motifs with a per-motif-class breakdown, is null: across 100 sequences, only 7 percent show significantly higher attention at motif positions against a 5 percent chance baseline, and the mean attention gap is essentially zero and in the wrong direction. This frozen encoder's final-layer attention does not concentrate at canonical RNA stability elements, at least not in the aggregated, single-layer form tested here. Naive fusion does not exploit the shared subspace that does exist (concatenation 0.100 versus 0.103 for protein alone), but a properly designed fusion mechanism plausibly could. The two extended Track A checks are also run: GC3 mostly confirms the GC content result rather than adding new signal, and the secondary structure proxy is weakly and about equally decodable from either embedding (0.089 RNA, 0.093 protein). Stage 1 is complete, with every item from the toolkit implemented and run, and it goes beyond the original minimum bar of one probe, one CKA score, and one UMAP plot.</w:t>
+        <w:t>Frozen protein embeddings carry a real, modest, non-length-driven signal about mRNA stability (R-squared 0.103); RNA embeddings do not (0.015, indistinguishable from zero). The pipeline itself is verified correct via the synonymous-recoding control. The two embedding spaces mostly disagree as whole spaces (CKA, mutual k-NN) but share one specific, real subspace (CCA and retrieval, with RSA consistent), and layer-wise analysis suggests that shared subspace is likely driven by a compositional, genetic-code-linked signal rather than deep functional overlap. The alignment–error association, run directly on this project's own data, agrees: local alignment does not predict downstream error, so an explicit alignment loss is unlikely to help Stage 2's fusion architecture. The attention-motif overlap test, run against AU-rich-element and m6A motifs with a per-motif-class breakdown, is null: across 100 sequences, only 7 percent show significantly higher attention at motif positions against a 5 percent chance baseline, and the mean attention gap is essentially zero and in the wrong direction. This frozen encoder's final-layer attention does not concentrate at canonical RNA stability elements, at least not in the aggregated, single-layer form tested here. Linear concatenation shows no synergy and does not exploit the shared subspace that does exist (0.100 versus 0.103 for protein alone); whether a learned fusion mechanism can is the Stage 3 question. The two extended Track A checks are also run: GC3 mostly confirms the GC content result rather than adding new signal, and the secondary structure proxy is weakly and about equally decodable from either embedding (0.089 RNA, 0.093 protein). Stage 1 is complete, with every item from the toolkit implemented and run, and it goes beyond the original minimum bar of one probe, one CKA score, and one UMAP plot.</w:t>
       </w:r>
     </w:p>
     <w:p>
@@ -4683,44 +4681,43 @@
           <w:sz w:val="22"/>
           <w:szCs w:val="22"/>
         </w:rPr>
-        <w:lastRenderedPageBreak/>
-        <w:t>Lead with the tension between the alignment metrics rather than a single number: CKA and mutual k-NN say the two embedding spaces mostly disagree, while CCA, retrieval, and now RSA all independently find one specific, strong, learnable shared subspace within them. That disagreement between metrics is the actual finding worth presenting, not a gap to explain away.</w:t>
-      </w:r>
-    </w:p>
-    <w:p>
-      <w:pPr>
-        <w:pStyle w:val="ListParagraph"/>
-        <w:numPr>
-          <w:ilvl w:val="0"/>
-          <w:numId w:val="1"/>
-        </w:numPr>
-        <w:spacing w:after="80"/>
-      </w:pPr>
-      <w:r>
-        <w:rPr>
-          <w:color w:val="000000"/>
-          <w:sz w:val="22"/>
-          <w:szCs w:val="22"/>
-        </w:rPr>
-        <w:t>Propose an answer to Mina's own open question, what alignment means here: Stage 1 suggests this modality pair is a case of high uniqueness with a narrow pocket of real redundancy, not uniformly redundant or uniformly unique. That is the redundancy, uniqueness, and heterogeneity framing from the alignment theory paper she pointed to, now backed by four independent methods, not just one or two.</w:t>
-      </w:r>
-    </w:p>
-    <w:p>
-      <w:pPr>
-        <w:pStyle w:val="ListParagraph"/>
-        <w:numPr>
-          <w:ilvl w:val="0"/>
-          <w:numId w:val="1"/>
-        </w:numPr>
-        <w:spacing w:after="80"/>
-      </w:pPr>
-      <w:r>
-        <w:rPr>
-          <w:color w:val="000000"/>
-          <w:sz w:val="22"/>
-          <w:szCs w:val="22"/>
-        </w:rPr>
-        <w:t>State the fusion architecture implication directly: naive concatenation shows zero synergy, while a targeted method, CCA, finds real structure the same two encoders already contain. That is direct evidence for prioritizing a learned fusion mechanism, gated fusion or cross-attention, over treating the concatenation-plus-MLP baseline as a serious candidate, since concatenation has already been shown not to reach what is there.</w:t>
+        <w:t>Lead with the tension between the alignment metrics rather than a single number: CKA and mutual k-NN say the two embedding spaces mostly disagree, while CCA and retrieval find, and RSA is consistent with, one specific, strong, learnable shared subspace within them. That disagreement between metrics is the actual finding worth presenting, not a gap to explain away.</w:t>
+      </w:r>
+    </w:p>
+    <w:p>
+      <w:pPr>
+        <w:pStyle w:val="ListParagraph"/>
+        <w:numPr>
+          <w:ilvl w:val="0"/>
+          <w:numId w:val="1"/>
+        </w:numPr>
+        <w:spacing w:after="80"/>
+      </w:pPr>
+      <w:r>
+        <w:rPr>
+          <w:color w:val="000000"/>
+          <w:sz w:val="22"/>
+          <w:szCs w:val="22"/>
+        </w:rPr>
+        <w:t>Propose an answer to Mina's own open question, what alignment means here: Stage 1 suggests this modality pair is a case of high uniqueness with a narrow pocket of real redundancy, not uniformly redundant or uniformly unique. That is the redundancy, uniqueness, and heterogeneity framing from the alignment theory paper she pointed to, backed by several methods (CKA, mutual k-NN, CCA, retrieval, RSA), not just one or two. Synergy is a separate question: linear concatenation shows none, and Stage 3 tests it properly.</w:t>
+      </w:r>
+    </w:p>
+    <w:p>
+      <w:pPr>
+        <w:pStyle w:val="ListParagraph"/>
+        <w:numPr>
+          <w:ilvl w:val="0"/>
+          <w:numId w:val="1"/>
+        </w:numPr>
+        <w:spacing w:after="80"/>
+      </w:pPr>
+      <w:r>
+        <w:rPr>
+          <w:color w:val="000000"/>
+          <w:sz w:val="22"/>
+          <w:szCs w:val="22"/>
+        </w:rPr>
+        <w:t>State the fusion architecture implication directly: linear concatenation shows no synergy (0.100 versus 0.103 for protein alone), while a targeted method, CCA, finds real structure the same two encoders already contain. That supports prioritizing a learned fusion mechanism, cross-attention or Coupled Mamba, which can learn where that structure is. Concatenation plus an MLP stays in as the baseline to beat, since Stage 1 only tested a linear probe on concatenated embeddings, not a nonlinear head.</w:t>
       </w:r>
     </w:p>
     <w:p>

</xml_diff>

<commit_message>
Rework Next Steps slide and sync notes: fusion candidate list, coding-only sequences
Co-Authored-By: Claude Opus 5.5 <noreply@anthropic.com>
Claude-Session: https://claude.ai/code/session_01PDtcWBhFCqkHgy4GaB1JdB
</commit_message>
<xml_diff>
--- a/Notes/Mina_Project_Notes.docx
+++ b/Notes/Mina_Project_Notes.docx
@@ -101,7 +101,7 @@
           <w:sz w:val="22"/>
           <w:szCs w:val="22"/>
         </w:rPr>
-        <w:t xml:space="preserve">Settled, not open. Per Mina's September 15 email, cross-attention (Isoformer-style) and Coupled-Mamba are the two primary candidates; both get built and benchmarked. Fallbacks if either underperforms: Cross-Mamba/BiMamba (an interaction module purpose-built for RNA-protein pairs) and mixture-of-experts fusion. Mamba-3 is the upgrade path if Coupled-Mamba's specific implementation is the bottleneck rather than the coupling idea itself. Full staged list in Section 3.3.</w:t>
+        <w:t>Settled, not open. Per Mina's September 15 email, cross-attention (Isoformer-style) and Coupled-Mamba are the two primary candidates; both get built and benchmarked. Concatenation plus an MLP runs as the baseline every candidate must beat. Fallbacks if either underperforms: Cross-Mamba/BiMamba (an interaction module purpose-built for RNA-protein pairs) and mixture-of-experts fusion. Mamba-3 is the upgrade path if Coupled-Mamba's specific implementation is the bottleneck rather than the coupling idea itself. Full staged list in Section 3.3.</w:t>
       </w:r>
     </w:p>
     <w:p>
@@ -252,7 +252,7 @@
           <w:sz w:val="22"/>
           <w:szCs w:val="22"/>
         </w:rPr>
-        <w:t xml:space="preserve">Ask the three prioritized open questions from Section 10: whether to swap datasets for a genuine all-three-modalities comparison or keep DNA-optional, whether these sequences include 3' UTR context, and whether Stage 2 should treat alignment asymmetrically per pair.</w:t>
+        <w:t>Ask the three prioritized open questions from Section 10: whether mRNA stability becomes the confirmed Stage 4 benchmark given DNA-optional scoping, whether Stage 2 should treat alignment asymmetrically per pair, and whether the shared subspace is compositional (GC-linked) or something more specific.</w:t>
       </w:r>
     </w:p>
     <w:p>
@@ -4481,7 +4481,7 @@
           <w:sz w:val="22"/>
           <w:szCs w:val="22"/>
         </w:rPr>
-        <w:t>Results: in the single-example check, 63 motif hits covering 311 positions show mean attention of 0.0031 versus 0.0033 elsewhere, not significant (p = 0.60), with neither motif class significant on its own. Across the 100-sequence aggregate, all 100 sequences yielded usable hits, only 7 percent showed significantly higher attention at motif positions against a 5 percent chance baseline, and the mean attention gap was -0.0009, essentially zero. The ARE pentamer appeared in 41 sequences (5 percent significant, mean gap -0.0027), the ARE nonamer produced no usable hits in this sample, and the m6A DRACH consensus appeared in all 100 (8 percent significant, mean gap -0.0009). The frozen RNA encoder's final-layer attention does not preferentially track these canonical stability elements. One caveat remains open: AREs and m6A sites are canonically enriched in 3' UTRs, and whether mRNA_Stability.csv's Sequence column includes UTR context or is CDS-only is not confirmed from the dataset's own columns, so it is worth confirming with Mina since it bears on how much weight this null result should carry.</w:t>
+        <w:t>Results: in the single-example check, 63 motif hits covering 311 positions show mean attention of 0.0031 versus 0.0033 elsewhere, not significant (p = 0.60), with neither motif class significant on its own. Across the 100-sequence aggregate, all 100 sequences yielded usable hits, only 7 percent showed significantly higher attention at motif positions against a 5 percent chance baseline, and the mean attention gap was -0.0009, essentially zero. The ARE pentamer appeared in 41 sequences (5 percent significant, mean gap -0.0027), the ARE nonamer produced no usable hits in this sample, and the m6A DRACH consensus appeared in all 100 (8 percent significant, mean gap -0.0009). The frozen RNA encoder's final-layer attention does not preferentially track these canonical stability elements. One important limit: the mRNA_Stability sequences are coding-only. Every length is a multiple of three, 98.5 percent start with ATG, and 99.3 percent end exactly at their first in-frame stop codon, so there is no UTR context. AREs and m6A sites are canonically enriched in 3' UTRs, so this test only covers coding regions, where these elements are less concentrated, and the null result should be given limited weight.</w:t>
       </w:r>
     </w:p>
     <w:p>
@@ -4634,7 +4634,7 @@
           <w:sz w:val="22"/>
           <w:szCs w:val="22"/>
         </w:rPr>
-        <w:t>Frozen protein embeddings carry a real, modest, non-length-driven signal about mRNA stability (R-squared 0.103); RNA embeddings do not (0.015, indistinguishable from zero). The pipeline itself is verified correct via the synonymous-recoding control. The two embedding spaces mostly disagree as whole spaces (CKA, mutual k-NN) but share one specific, real subspace (CCA and retrieval, with RSA consistent), and layer-wise analysis suggests that shared subspace is likely driven by a compositional, genetic-code-linked signal rather than deep functional overlap. The alignment–error association, run directly on this project's own data, agrees: local alignment does not predict downstream error, so an explicit alignment loss is unlikely to help Stage 2's fusion architecture. The attention-motif overlap test, run against AU-rich-element and m6A motifs with a per-motif-class breakdown, is null: across 100 sequences, only 7 percent show significantly higher attention at motif positions against a 5 percent chance baseline, and the mean attention gap is essentially zero and in the wrong direction. This frozen encoder's final-layer attention does not concentrate at canonical RNA stability elements, at least not in the aggregated, single-layer form tested here. Linear concatenation shows no synergy and does not exploit the shared subspace that does exist (0.100 versus 0.103 for protein alone); whether a learned fusion mechanism can is the Stage 3 question. The two extended Track A checks are also run: GC3 mostly confirms the GC content result rather than adding new signal, and the secondary structure proxy is weakly and about equally decodable from either embedding (0.089 RNA, 0.093 protein). Stage 1 is complete, with every item from the toolkit implemented and run, and it goes beyond the original minimum bar of one probe, one CKA score, and one UMAP plot.</w:t>
+        <w:t>Frozen protein embeddings carry a real, modest, non-length-driven signal about mRNA stability (R-squared 0.103); RNA embeddings do not (0.015, indistinguishable from zero). The pipeline itself is verified correct via the synonymous-recoding control. The two embedding spaces mostly disagree as whole spaces (CKA, mutual k-NN) but share one specific, real subspace (CCA and retrieval, with RSA consistent), and layer-wise analysis suggests that shared subspace is likely driven by a compositional, genetic-code-linked signal rather than deep functional overlap. The alignment–error association, run directly on this project's own data, agrees: local alignment does not predict downstream error, so an explicit alignment loss is unlikely to help Stage 2's fusion architecture. The attention-motif overlap test, run against AU-rich-element and m6A motifs with a per-motif-class breakdown, is null: across 100 sequences, only 7 percent show significantly higher attention at motif positions against a 5 percent chance baseline, and the mean attention gap is essentially zero and in the wrong direction. This frozen encoder's final-layer attention does not concentrate at canonical RNA stability elements, at least not in the aggregated, single-layer form tested here, and only within coding sequence, since the dataset has no UTR context. Linear concatenation shows no synergy and does not exploit the shared subspace that does exist (0.100 versus 0.103 for protein alone); whether a learned fusion mechanism can is the Stage 3 question. The two extended Track A checks are also run: GC3 mostly confirms the GC content result rather than adding new signal, and the secondary structure proxy is weakly and about equally decodable from either embedding (0.089 RNA, 0.093 protein). Stage 1 is complete, with every item from the toolkit implemented and run, and it goes beyond the original minimum bar of one probe, one CKA score, and one UMAP plot.</w:t>
       </w:r>
     </w:p>
     <w:p>
@@ -4753,7 +4753,7 @@
           <w:sz w:val="22"/>
           <w:szCs w:val="22"/>
         </w:rPr>
-        <w:t>Be direct about the one result that comes back null: the attention-motif overlap test, run against real AU-rich elements and m6A sites, finds no significant relationship between attention and motif position, only 7 percent of 100 sequences reach significance against a 5 percent chance baseline, and the mean attention gap is essentially zero. Worth framing this as a real, defensible finding rather than an unresolved loose end: it says the frozen encoder's aggregated final-layer attention does not track these canonical stability elements, whatever the underlying reason turns out to be. Worth asking her one specific, still-open question alongside it: whether these particular sequences carry 3' UTR context, where these elements concentrate, or are CDS-only, since that determines how much weight this null result should be given either way, and whether a different layer or attention head would be worth checking next.</w:t>
+        <w:t>Be direct about the one result that comes back null: the attention-motif overlap test, run against real AU-rich elements and m6A sites, finds no significant relationship between attention and motif position, only 7 percent of 100 sequences reach significance against a 5 percent chance baseline, and the mean attention gap is essentially zero. Worth framing this as a real, defensible finding rather than an unresolved loose end: it says the frozen encoder's aggregated final-layer attention does not track these canonical stability elements, whatever the underlying reason turns out to be. State the limit alongside it: the sequences are coding-only, so the test could not reach the 3' UTRs where these elements concentrate. Ask whether a different layer or attention head, or a dataset with UTR context, would be worth checking next.</w:t>
       </w:r>
     </w:p>
     <w:p>
@@ -4969,24 +4969,6 @@
           <w:szCs w:val="22"/>
         </w:rPr>
         <w:t>Does the mRNA-stability task become the confirmed Stage 4 benchmark, or is it one of several candidates? The DNA-optional scoping (Section 4) has been necessary given the dataset's missing gene and transcript IDs; worth confirming this is an acceptable path forward rather than a gap.</w:t>
-      </w:r>
-    </w:p>
-    <w:p>
-      <w:pPr>
-        <w:pStyle w:val="ListParagraph"/>
-        <w:numPr>
-          <w:ilvl w:val="0"/>
-          <w:numId w:val="1"/>
-        </w:numPr>
-        <w:spacing w:after="80"/>
-      </w:pPr>
-      <w:r>
-        <w:rPr>
-          <w:color w:val="000000"/>
-          <w:sz w:val="22"/>
-          <w:szCs w:val="22"/>
-        </w:rPr>
-        <w:t>Do the mRNA_Stability sequences include 3' UTR context, where AU-rich elements and m6A sites concentrate, or are they CDS-only? This determines how much weight to put on the Track C motif test's null result.</w:t>
       </w:r>
     </w:p>
     <w:p>

</xml_diff>

<commit_message>
Sync Gantt and research canvas with notes, slides, and notebook
Gantt: mark pilot analysis done, map fusion tasks to Stages 2-4, refresh
follow-up and meeting wording, point Notes sheet at Stage1_refactor.
Canvas: Stage 1 pilot results header, Stages 2-4 methods line, Coupled
Mamba described as needing no alignment loss. Notes and slide 3 aligned
on the same Coupled Mamba wording; slide 3 codon-grid and Q2 tags fixed.

Co-Authored-By: Claude Opus 5.5 <noreply@anthropic.com>
Claude-Session: https://claude.ai/code/session_01PDtcWBhFCqkHgy4GaB1JdB
</commit_message>
<xml_diff>
--- a/Notes/Mina_Project_Notes.docx
+++ b/Notes/Mina_Project_Notes.docx
@@ -539,7 +539,7 @@
           <w:sz w:val="22"/>
           <w:szCs w:val="22"/>
         </w:rPr>
-        <w:t xml:space="preserve">Five papers plus one general-purpose fusion mechanism cover the core reading; full individual reviews for each exist as separate files, so only the landscape is summarized here. Two broad strategies show up across the papers. The first keeps existing single-modality models frozen and adds a lightweight fusion module on top (BioLangFusion, Isoformer, Central Dogma Transformer). This is cheap and reuses existing pretraining investment, but it requires solving an alignment problem first, since the different models tokenize sequences at different resolutions. The second strategy trains one model from scratch on a shared vocabulary spanning both nucleotides and amino acids, so cross-modal structure has to emerge from pretraining itself (LucaOne). Coupled Mamba does not fit cleanly into either category; it is a general-purpose fusion mechanism, not a biology paper, offered as an alignment-free alternative to attention-based fusion.</w:t>
+        <w:t>Five papers plus one general-purpose fusion mechanism cover the core reading; full individual reviews for each exist as separate files, so only the landscape is summarized here. Two broad strategies show up across the papers. The first keeps existing single-modality models frozen and adds a lightweight fusion module on top (BioLangFusion, Isoformer, Central Dogma Transformer). This is cheap and reuses existing pretraining investment, but it requires solving an alignment problem first, since the different models tokenize sequences at different resolutions. The second strategy trains one model from scratch on a shared vocabulary spanning both nucleotides and amino acids, so cross-modal structure has to emerge from pretraining itself (LucaOne). Coupled Mamba does not fit cleanly into either category; it is a general-purpose fusion mechanism, not a biology paper, offered as an alternative to attention-based fusion that needs no alignment loss.</w:t>
       </w:r>
     </w:p>
     <w:p>
@@ -1296,7 +1296,7 @@
           <w:sz w:val="22"/>
           <w:szCs w:val="22"/>
         </w:rPr>
-        <w:t>Coupled Mamba (already planned, per Mina's ask): linear cost, alignment-free by design.</w:t>
+        <w:t>Coupled Mamba (already planned, per Mina's ask): linear cost, and no alignment loss needed by design, though both streams must share a step grid (the codon grid here).</w:t>
       </w:r>
     </w:p>
     <w:p>
@@ -3999,7 +3999,7 @@
               <w:rPr>
                 <w:color w:val="000000"/>
               </w:rPr>
-              <w:t>Fusing modalities not resampled to a shared resolution</w:t>
+              <w:t>Linear-cost fusion with no alignment loss, once both streams share a step grid (the codon grid here)</w:t>
             </w:r>
           </w:p>
         </w:tc>
@@ -4859,7 +4859,7 @@
           <w:sz w:val="22"/>
           <w:szCs w:val="22"/>
         </w:rPr>
-        <w:t>Whether Coupled Mamba is a serious architecture candidate to prototype or a pointer to alignment-free fusion generally, and whether Cross-Mamba or Mamba-3 are worth adding as fallback options.</w:t>
+        <w:t>Whether Coupled Mamba is a serious architecture candidate to prototype or a pointer to fusion without an alignment loss generally, and whether Cross-Mamba or Mamba-3 are worth adding as fallback options.</w:t>
       </w:r>
     </w:p>
     <w:p>

</xml_diff>

<commit_message>
docs: rename to Multimodal Biology and add the DNA modality
- Rename the team skills from rna-fusion-* to multimodal-bio-* and update links
- README, docs, and research context: Multimodal Biology title, DNA-pretrained
  nucleotide encoder labeling, planned DNA/RNA/protein multi-encoder extension,
  stability dataset audit, Overleaf project links, new retained sources
- Notebooks: Markdown-only modality notes (no code or outputs changed)
- Shared project notes: DNA scope, Stage 1 extension steps, numbers synced to
  the current Stage1_refactor.ipynb outputs
- Julian's reviews: relevance sections updated for DNA, RNA, and protein
- Bibliography, Research Canvas, and Gantt: DNA-scope revision

Co-Authored-By: Claude Opus 5.5 <noreply@anthropic.com>
Claude-Session: https://claude.ai/code/session_01EXPvTz3oCycFbJjDeAyu2R
</commit_message>
<xml_diff>
--- a/Notes/Mina_Project_Notes.docx
+++ b/Notes/Mina_Project_Notes.docx
@@ -14,7 +14,7 @@
           <w:sz w:val="40"/>
           <w:szCs w:val="40"/>
         </w:rPr>
-        <w:t xml:space="preserve">RNA and Protein Fusion Project</w:t>
+        <w:t>Multimodal Biology</w:t>
       </w:r>
     </w:p>
     <w:p>
@@ -96,7 +96,7 @@
         <w:t xml:space="preserve">Source of results:</w:t>
       </w:r>
       <w:r>
-        <w:t xml:space="preserve"> every Stage 1 number reported here comes from the saved outputs of Code/Stage1_refactor.ipynb in the project repository (RNA-Protein-Multimodal-Fusion on GitHub).</w:t>
+        <w:t xml:space="preserve"> every Stage 1 number reported here comes from the saved outputs of Code/Stage1_refactor.ipynb in the project repository (the Multimodal Biology repository on GitHub).</w:t>
       </w:r>
     </w:p>
     <w:p>
@@ -116,7 +116,7 @@
         <w:t xml:space="preserve">Manuscript:</w:t>
       </w:r>
       <w:r>
-        <w:t xml:space="preserve"> the project paper is written in Overleaf at https://www.overleaf.com/project/6ab8535fb63c8540bed7e56f</w:t>
+        <w:t xml:space="preserve"> the project paper is written in the Overleaf project “Multimodal Biology” at https://www.overleaf.com/project/6ab8535fb63c8540bed7e56f, which also records the Stage 1 methods and what each metric means.</w:t>
       </w:r>
     </w:p>
     <w:p>
@@ -160,7 +160,7 @@
         <w:spacing w:after="160"/>
       </w:pPr>
       <w:r>
-        <w:t xml:space="preserve">Stage 1 (Representation Analysis) is complete. Stage 2 (Define Alignment) is next. The encoders are Nucleotide Transformer for RNA and ESM-2 for protein, both kept frozen throughout.</w:t>
+        <w:t>Stage 1 (Representation Analysis) is complete for the first encoder pair: Nucleotide Transformer, a DNA-pretrained model reading the coding sequence, and ESM-2 for protein, both kept frozen throughout. The next step extends Stage 1 to DNA, RNA, and protein encoders, with more than one model per modality, and compares against BioLangFusion and IsoFormer on their own datasets (Sections 4 and 10). Stage 2 (Define Alignment) follows.</w:t>
       </w:r>
     </w:p>
     <w:p>
@@ -181,46 +181,46 @@
         <w:spacing w:after="100"/>
       </w:pPr>
       <w:r>
-        <w:t xml:space="preserve">Frozen protein embeddings carry a modest but reliable signal about mRNA stability (R² = 0.103). RNA embeddings do not (R² = 0.015, indistinguishable from zero).</w:t>
-      </w:r>
-    </w:p>
-    <w:p>
-      <w:pPr>
-        <w:pStyle w:val="ListParagraph"/>
-        <w:numPr>
-          <w:ilvl w:val="0"/>
-          <w:numId w:val="2"/>
-        </w:numPr>
-        <w:spacing w:after="100"/>
-      </w:pPr>
-      <w:r>
-        <w:t xml:space="preserve">The two embedding spaces mostly differ as wholes (final-layer CKA 0.128; mutual k-NN 0.070 against a 0.010 chance level), but they share one strong, learnable subspace (canonical correlations up to 0.955; cross-modal retrieval finds the correct match first 36.6% of the time against 0.3% chance). That shared subspace is most likely compositional, tied to GC content through the genetic code.</w:t>
-      </w:r>
-    </w:p>
-    <w:p>
-      <w:pPr>
-        <w:pStyle w:val="ListParagraph"/>
-        <w:numPr>
-          <w:ilvl w:val="0"/>
-          <w:numId w:val="2"/>
-        </w:numPr>
-        <w:spacing w:after="100"/>
-      </w:pPr>
-      <w:r>
-        <w:t xml:space="preserve">Simple linear concatenation of the two embeddings shows no synergy (R² 0.100 against 0.103 for protein alone).</w:t>
-      </w:r>
-    </w:p>
-    <w:p>
-      <w:pPr>
-        <w:pStyle w:val="ListParagraph"/>
-        <w:numPr>
-          <w:ilvl w:val="0"/>
-          <w:numId w:val="2"/>
-        </w:numPr>
-        <w:spacing w:after="100"/>
-      </w:pPr>
-      <w:r>
-        <w:t xml:space="preserve">The RNA encoder's final-layer attention does not concentrate at known mRNA stability motifs (AU-rich elements and m6A sites) within coding sequence.</w:t>
+        <w:t>Frozen protein embeddings carry a modest but reliable signal about mRNA stability (R² = 0.115). The nucleotide (DNA-model) embeddings carry a weaker, less consistent signal (R² = 0.048).</w:t>
+      </w:r>
+    </w:p>
+    <w:p>
+      <w:pPr>
+        <w:pStyle w:val="ListParagraph"/>
+        <w:numPr>
+          <w:ilvl w:val="0"/>
+          <w:numId w:val="2"/>
+        </w:numPr>
+        <w:spacing w:after="100"/>
+      </w:pPr>
+      <w:r>
+        <w:t>The two embedding spaces mostly differ as wholes (final-layer CKA 0.128; mutual k-NN 0.069 against a 0.010 chance level), but they share one strong, learnable subspace (canonical correlations up to 0.955; cross-modal retrieval finds the correct match first 36.6% of the time against 0.3% chance). That shared subspace is most likely compositional, tied to GC content through the genetic code.</w:t>
+      </w:r>
+    </w:p>
+    <w:p>
+      <w:pPr>
+        <w:pStyle w:val="ListParagraph"/>
+        <w:numPr>
+          <w:ilvl w:val="0"/>
+          <w:numId w:val="2"/>
+        </w:numPr>
+        <w:spacing w:after="100"/>
+      </w:pPr>
+      <w:r>
+        <w:t>Simple linear concatenation of the two embeddings shows no meaningful synergy (R² 0.118 against 0.115 for protein alone).</w:t>
+      </w:r>
+    </w:p>
+    <w:p>
+      <w:pPr>
+        <w:pStyle w:val="ListParagraph"/>
+        <w:numPr>
+          <w:ilvl w:val="0"/>
+          <w:numId w:val="2"/>
+        </w:numPr>
+        <w:spacing w:after="100"/>
+      </w:pPr>
+      <w:r>
+        <w:t>The nucleotide encoder's final-layer attention does not concentrate at known mRNA stability motifs (AU-rich elements and m6A sites) within coding sequence.</w:t>
       </w:r>
     </w:p>
     <w:p>
@@ -638,7 +638,7 @@
         <w:spacing w:after="160"/>
       </w:pPr>
       <w:r>
-        <w:t xml:space="preserve">Living things run on connected layers of information: DNA holds the instructions, RNA is the working copy of those instructions, and protein is what actually carries out the work in the cell. This project focuses on two of those layers, RNA and protein, which are read today by separately trained foundation models even though they are directly, causally linked. It tests whether combining these two separately pretrained foundation models captures real biological signal that neither sees alone, or whether combining them just adds complexity for no real benefit. DNA was considered too, but the dataset in hand does not carry the gene or transcript IDs needed to bring it in (see Section 4), so the project proceeds as an RNA and protein fusion.</w:t>
+        <w:t>Living things run on connected layers of information: DNA holds the instructions, RNA is the working copy of those instructions, and protein is what actually carries out the work in the cell. Each layer is read today by separately trained foundation models even though the layers are directly, causally linked. The project goal, set with Mina Basirat, is to fuse several separately pretrained DNA, RNA, and protein foundation models, with more than one model per modality, and to test when combining them captures real biological signal that no single model sees, versus adding complexity for no real benefit. Stage 1 so far compared two encoders: Nucleotide Transformer, a DNA-pretrained model reading the coding sequence, and ESM-2 for protein. Section 4 explains how the DNA modality enters with the current data.</w:t>
       </w:r>
     </w:p>
     <w:p>
@@ -656,7 +656,7 @@
         <w:t xml:space="preserve">fusion</w:t>
       </w:r>
       <w:r>
-        <w:t xml:space="preserve">, how the two modalities actually get combined, and </w:t>
+        <w:t xml:space="preserve">, how the modalities actually get combined, and </w:t>
       </w:r>
       <w:r>
         <w:rPr>
@@ -1081,7 +1081,7 @@
                 <w:sz w:val="21"/>
                 <w:szCs w:val="21"/>
               </w:rPr>
-              <w:t xml:space="preserve">Determine what the frozen RNA and protein encoders already know, and how related their representations are.</w:t>
+              <w:t>Determine what the frozen encoders already know, and how related their representations are.</w:t>
             </w:r>
           </w:p>
         </w:tc>
@@ -1461,7 +1461,7 @@
         <w:t xml:space="preserve">Track C, Interpretability:</w:t>
       </w:r>
       <w:r>
-        <w:t xml:space="preserve"> RNA encoder attention compared against known RNA stability motifs (AU-rich elements and m6A DRACH sites), as a check on whether the representation tracks real regulatory biology rather than an artifact of the probe itself.</w:t>
+        <w:t xml:space="preserve"> Nucleotide encoder attention compared against known RNA stability motifs (AU-rich elements and m6A DRACH sites), as a check on whether the representation tracks real regulatory biology rather than an artifact of the probe itself.</w:t>
       </w:r>
     </w:p>
     <w:p>
@@ -1673,7 +1673,7 @@
         <w:t xml:space="preserve">Perceiver-style asymmetric cross-attention (fallback):</w:t>
       </w:r>
       <w:r>
-        <w:t xml:space="preserve"> relevant if DNA ends up in the input set, since it keeps attention cost close to linear over long genomic sequences while still being true attention. It has direct precedent on an expression-prediction task.</w:t>
+        <w:t xml:space="preserve"> relevant now that DNA is in the input set, especially for long genomic sequences such as IsoFormer's, since it keeps attention cost close to linear over long genomic sequences while still being true attention. It has direct precedent on an expression-prediction task.</w:t>
       </w:r>
     </w:p>
     <w:p>
@@ -1854,10 +1854,10 @@
           <w:b/>
           <w:bCs/>
         </w:rPr>
-        <w:t xml:space="preserve">DNA is optional in the project plan.</w:t>
-      </w:r>
-      <w:r>
-        <w:t xml:space="preserve"> It requires the genomic region around the gene, which is feasible only for the human and mouse subset, and only if the CSV carries gene or transcript IDs that can be mapped in Ensembl. Neither mRNA_Stability.csv nor mRFP_Expression.csv carries such IDs (only Sequence, Value, Dataset, and Split columns), so the project proceeds without DNA. This is consistent with the planned Stage 4 comparison of RNA-only, protein-only, RNA plus protein, and all three modalities.</w:t>
+        <w:t xml:space="preserve">DNA modality: </w:t>
+      </w:r>
+      <w:r>
+        <w:t>the stability data carry only the coding sequence, with no gene or transcript IDs (only Sequence, Value, Dataset, and Split columns), so genomic context around each gene is not available without a separate mapping step. As in BioLangFusion, a modality is therefore defined by the encoder: DNA encoders read the coding sequence in DNA letters, RNA encoders read it in RNA letters, and protein encoders read its translation. Nucleotide Transformer 500M human-ref, used in Stage 1, is itself a DNA-pretrained model, so Stage 1 has already compared a DNA-model representation with a protein representation. Because all three inputs derive from one coding sequence, differences between encoders reflect pretraining corpora and tokenization rather than new biological information.</w:t>
       </w:r>
     </w:p>
     <w:p>
@@ -1897,7 +1897,47 @@
         <w:t xml:space="preserve">Pre-checks, both satisfied in the Stage 1 notebook:</w:t>
       </w:r>
       <w:r>
-        <w:t xml:space="preserve"> sequences start at a start codon and stay in frame (needed for a clean translation to protein), and gene or transcript IDs are absent (hence no DNA).</w:t>
+        <w:t xml:space="preserve"> sequences start at a start codon and stay in frame (needed for a clean translation to protein), and gene or transcript IDs are absent (so genomic context is not available from this file).</w:t>
+      </w:r>
+    </w:p>
+    <w:p>
+      <w:pPr>
+        <w:pStyle w:val="ListParagraph"/>
+        <w:numPr>
+          <w:ilvl w:val="0"/>
+          <w:numId w:val="2"/>
+        </w:numPr>
+        <w:spacing w:after="100"/>
+      </w:pPr>
+      <w:r>
+        <w:rPr>
+          <w:b/>
+          <w:bCs/>
+        </w:rPr>
+        <w:t xml:space="preserve">Second dataset with genomic DNA: </w:t>
+      </w:r>
+      <w:r>
+        <w:t>IsoFormer's GTEx transcript-expression dataset (InstaDeepAI/multi_omics_transcript_expression on Hugging Face) provides, per transcript, genomic DNA centered on the transcription start site, the full transcript with UTRs, the protein, and expression across tissues, with a fixed gene-level split. There, DNA carries promoter and regulatory context the protein lacks. It is the planned second dataset, so the Stage 1 measurements can be compared between derived modalities (stability) and genuinely distinct ones (GTEx).</w:t>
+      </w:r>
+    </w:p>
+    <w:p>
+      <w:pPr>
+        <w:pStyle w:val="ListParagraph"/>
+        <w:numPr>
+          <w:ilvl w:val="0"/>
+          <w:numId w:val="2"/>
+        </w:numPr>
+        <w:spacing w:after="100"/>
+      </w:pPr>
+      <w:r>
+        <w:rPr>
+          <w:b/>
+          <w:bCs/>
+        </w:rPr>
+        <w:t xml:space="preserve">Dataset audit (September 29, 2026): </w:t>
+      </w:r>
+      <w:r>
+        <w:t>the Split column assigns 45,749 rows to train, 9,803 to validation, and 9,804 to test, and 5,392 of the 8,283 distinct test sequences also occur in training. 12,775 repeated sequences carry differing labels (median within-sequence standard deviation 0.49), which caps achievable performance. Only 37% of rows are at most 1,000 nucleotides, so encoders with a limit near 1,000 tokens see truncated input for most sequences. BioLangFusion reports 41,123 raw and 23,929 used sequences; whether the repository file is the same version is unresolved. Results should be reported on the official split for comparison with published numbers and on a deduplicated, sequence-disjoint split for leakage-free estimates.</w:t>
       </w:r>
     </w:p>
     <w:p>
@@ -5022,7 +5062,7 @@
         <w:spacing w:after="160"/>
       </w:pPr>
       <w:r>
-        <w:t xml:space="preserve">All results come from Code/Stage1_refactor.ipynb, run on 1,000 sequences sampled from mRNA_Stability.</w:t>
+        <w:t>All results come from the saved outputs of Code/Stage1_refactor.ipynb (GPU run, Python 3.13) on 1,000 sequences sampled from mRNA_Stability.</w:t>
       </w:r>
     </w:p>
     <w:p>
@@ -5050,7 +5090,7 @@
         <w:t xml:space="preserve">Pipeline:</w:t>
       </w:r>
       <w:r>
-        <w:t xml:space="preserve"> the notebook loads mRNA_Stability, keeps valid, in-frame sequences that start with a start codon, translates each kept sequence to its protein via the genetic code, and embeds the RNA (Nucleotide Transformer) and protein (ESM-2) sequences with frozen, off-the-shelf encoders. Of 1,000 sampled sequences, 981 pass the validity filter (98% retention).</w:t>
+        <w:t xml:space="preserve"> the notebook loads mRNA_Stability, keeps valid, in-frame sequences that start with a start codon, translates each kept sequence to its protein via the genetic code, and embeds the nucleotide sequence (Nucleotide Transformer, a DNA-pretrained model) and the protein sequence (ESM-2) with frozen, off-the-shelf encoders. Of 1,000 sampled sequences, 981 pass the validity filter (98% retention).</w:t>
       </w:r>
     </w:p>
     <w:p>
@@ -5070,7 +5110,7 @@
         <w:t xml:space="preserve">Correctness control (mRFP_Expression):</w:t>
       </w:r>
       <w:r>
-        <w:t xml:space="preserve"> all 1,000 synonymous-recoding variants translate to one identical protein, as expected. Protein embeddings for these variants collapse almost to a single point (average distance to centroid 0.00003), while RNA embeddings, which see the codon-level differences, spread out clearly (4.72). This confirms that translation, frame checking, and embedding behave correctly, so the results below are not artifacts of a broken pipeline.</w:t>
+        <w:t xml:space="preserve"> all 1,000 synonymous-recoding variants translate to one identical protein, as expected. Protein embeddings for these variants collapse almost to a single point (average distance to centroid 0.00004), while nucleotide embeddings, which see the codon-level differences, spread out clearly (4.72). This confirms that translation, frame checking, and embedding behave correctly, so the results below are not artifacts of a broken pipeline.</w:t>
       </w:r>
     </w:p>
     <w:p>
@@ -5098,7 +5138,7 @@
         <w:t xml:space="preserve">mRNA stability probe:</w:t>
       </w:r>
       <w:r>
-        <w:t xml:space="preserve"> RNA embeddings reach R² 0.015 ± 0.072 and protein embeddings 0.103 ± 0.034. Protein carries a modest, reliable signal, about three standard deviations above zero, while RNA's score is indistinguishable from zero since its standard deviation exceeds its mean.</w:t>
+        <w:t xml:space="preserve"> nucleotide (DNA-model) embeddings reach R² 0.048 ± 0.034 and protein embeddings 0.115 ± 0.024. Protein carries a modest, reliable signal, nearly five fold standard deviations above zero; the nucleotide signal is weaker and less consistent across folds, about 1.4 standard deviations above zero.</w:t>
       </w:r>
     </w:p>
     <w:p>
@@ -5118,7 +5158,7 @@
         <w:t xml:space="preserve">Sequence-length baseline:</w:t>
       </w:r>
       <w:r>
-        <w:t xml:space="preserve"> R² -0.006 ± 0.013, indistinguishable from zero. This rules out the concern that the probe scores above are just a proxy for sequence length.</w:t>
+        <w:t xml:space="preserve"> R² 0.002 ± 0.014, indistinguishable from zero. This rules out the concern that the probe scores above are just a proxy for sequence length.</w:t>
       </w:r>
     </w:p>
     <w:p>
@@ -5138,7 +5178,7 @@
         <w:t xml:space="preserve">GC content probe (known-property validity check):</w:t>
       </w:r>
       <w:r>
-        <w:t xml:space="preserve"> RNA embeddings recover GC content almost perfectly (R² 0.986), as expected for a direct compositional property. Protein embeddings recover 0.678 of it, which follows from genetic code redundancy: certain amino acids are preferentially encoded by GC-rich or AT-rich codons, so protein composition carries an indirect signature of the source gene's GC content.</w:t>
+        <w:t xml:space="preserve"> Nucleotide embeddings recover GC content almost perfectly (R² 0.985), as expected for a direct compositional property. Protein embeddings recover 0.688 of it, which follows from genetic code redundancy: certain amino acids are preferentially encoded by GC-rich or AT-rich codons, so protein composition carries an indirect signature of the source gene's GC content.</w:t>
       </w:r>
     </w:p>
     <w:p>
@@ -5158,7 +5198,7 @@
         <w:t xml:space="preserve">Synergy check:</w:t>
       </w:r>
       <w:r>
-        <w:t xml:space="preserve"> naive concatenation of RNA and protein embeddings scores R² 0.100 against 0.103 for protein alone, a difference well within noise. At the level of simple concatenation there is no measurable synergy, consistent with the beyond-alignment critique's point that concatenation cannot access synergistic information even if it exists.</w:t>
+        <w:t xml:space="preserve"> naive concatenation of nucleotide and protein embeddings scores R² 0.118 ± 0.029 against 0.115 ± 0.024 for protein alone, a difference well within noise. At the level of simple concatenation there is no measurable synergy, consistent with the beyond-alignment critique's point that concatenation cannot access synergistic information even if it exists.</w:t>
       </w:r>
     </w:p>
     <w:p>
@@ -5178,7 +5218,7 @@
         <w:t xml:space="preserve">Codon usage bias probe (GC3):</w:t>
       </w:r>
       <w:r>
-        <w:t xml:space="preserve"> RNA embeddings recover GC3 (the GC fraction at each codon's third position, the classical proxy for codon usage bias) at R² 0.969, protein embeddings at 0.380. GC3 correlates 0.922 with overall GC content, so this mostly confirms the GC result. The one new detail is that protein embeddings lose noticeably more ground on this codon-position-specific signal, consistent with translation collapsing synonymous codons to the same amino acid.</w:t>
+        <w:t xml:space="preserve"> Nucleotide embeddings recover GC3 (the GC fraction at each codon's third position, the classical proxy for codon usage bias) at R² 0.970, protein embeddings at 0.389. GC3 correlates 0.922 with overall GC content, so this mostly confirms the GC result. The one new detail is that protein embeddings lose noticeably more ground on this codon-position-specific signal, consistent with translation collapsing synonymous codons to the same amino acid.</w:t>
       </w:r>
     </w:p>
     <w:p>
@@ -5198,7 +5238,7 @@
         <w:t xml:space="preserve">Secondary structure probe (Nussinov pairing fraction):</w:t>
       </w:r>
       <w:r>
-        <w:t xml:space="preserve"> using the classical Nussinov and Jacobson (1980) maximum base-pairing algorithm on a 200-sequence subsample, cropped to each sequence's first 200 nucleotides for runtime (the algorithm is cubic in sequence length), RNA embeddings reach R² 0.089 ± 0.033 and protein embeddings 0.093 ± 0.055. Both are weak and roughly equal, so the RNA encoder shows no advantage on this folding proxy despite reading the nucleotides directly. The result is likely limited by the small sample, the simplified pairing model, and the 5' region crop; at face value, composition (GC, GC3) is what these frozen encoders linearly capture, not this structural signal.</w:t>
+        <w:t xml:space="preserve"> using the classical Nussinov and Jacobson (1980) maximum base-pairing algorithm on a 200-sequence subsample, cropped to each sequence's first 200 nucleotides for runtime (the algorithm is cubic in sequence length), nucleotide embeddings reach R² 0.048 ± 0.102 and protein embeddings 0.086 ± 0.122. Both are weak, and their fold standard deviations exceed their means, so the folds do not agree on whether either embedding encodes this proxy; the nucleotide encoder shows no advantage on this folding proxy despite reading the nucleotides directly. The result is likely limited by the small sample, the simplified pairing model, and the 5' region crop; at face value, composition (GC, GC3) is what these frozen encoders linearly capture, not this structural signal.</w:t>
       </w:r>
     </w:p>
     <w:p>
@@ -5266,7 +5306,7 @@
         <w:t xml:space="preserve">Layer-wise CKA</w:t>
       </w:r>
       <w:r>
-        <w:t xml:space="preserve"> across every internal layer of both encoders (25 hidden-state outputs for the 24-layer RNA encoder, 13 for the 12-layer protein encoder): the overall peak is 0.400, at RNA layer 16 against protein layer 0 (the protein encoder's embedding layer, before self-attention mixes in any context). Restricted to the protein encoder's contextualized layers, the peak drops to 0.359, at RNA layer 0 against protein layer 1. Both of the strongest alignment points involve one encoder at or next to its own embedding layer. Together with the GC content probe, this suggests a compositional signal on each side, tied to genetic code redundancy, drives most of the measured cross-modal alignment, rather than deep functional overlap between the encoders. This tempers, without undoing, the case for fusion: the shared structure looks real but more modest than deep semantic convergence.</w:t>
+        <w:t xml:space="preserve"> across every internal layer of both encoders (25 hidden-state outputs for the 24-layer nucleotide encoder, 13 for the 12-layer protein encoder): the overall peak is 0.400, at RNA layer 16 against protein layer 0 (the protein encoder's embedding layer, before self-attention mixes in any context). Restricted to the protein encoder's contextualized layers, the peak drops to 0.359, at RNA layer 0 against protein layer 1. Both of the strongest alignment points involve one encoder at or next to its own embedding layer. Together with the GC content probe, this suggests a compositional signal on each side, tied to genetic code redundancy, drives most of the measured cross-modal alignment, rather than deep functional overlap between the encoders. This tempers, without undoing, the case for fusion: the shared structure looks real but more modest than deep semantic convergence.</w:t>
       </w:r>
     </w:p>
     <w:p>
@@ -5306,7 +5346,7 @@
         <w:t xml:space="preserve">Mutual k-nearest-neighbor alignment (k = 10):</w:t>
       </w:r>
       <w:r>
-        <w:t xml:space="preserve"> 0.070, against a chance level of about 0.010, roughly seven times above random. This corroborates CKA's read of modest but real global alignment.</w:t>
+        <w:t xml:space="preserve"> 0.069, against a chance level of about 0.010, roughly seven times above random. This corroborates CKA's read of modest but real global alignment.</w:t>
       </w:r>
     </w:p>
     <w:p>
@@ -5414,7 +5454,7 @@
         <w:t xml:space="preserve">Attention-motif overlap test (results):</w:t>
       </w:r>
       <w:r>
-        <w:t xml:space="preserve"> in the single-example check, 63 motif hits covering 311 positions show mean attention of 0.0031 versus 0.0033 elsewhere, not significant (p = 0.60), with neither motif class significant on its own. Across the 100-sequence aggregate, all 100 sequences yield usable hits; only 7% show significantly higher attention at motif positions, against a 5% chance baseline, and the mean attention gap is -0.0009, essentially zero. The ARE pentamer appears in 41 sequences (5% significant, mean gap -0.0027), the ARE nonamer produces no usable hits, and the m6A DRACH consensus appears in all 100 (8% significant, mean gap -0.0009). The frozen RNA encoder's final-layer attention does not preferentially track these canonical stability elements.</w:t>
+        <w:t xml:space="preserve"> in the single-example check, 63 motif hits covering 311 positions show mean attention of 0.0031 versus 0.0033 elsewhere, not significant (p = 0.60), with neither motif class significant on its own. Across the 100-sequence aggregate, all 100 sequences yield usable hits; only 7% show significantly higher attention at motif positions, against a 5% chance baseline, and the mean attention gap is -0.0009, essentially zero. The ARE pentamer appears in 41 sequences (5% significant, mean gap -0.0027), the ARE nonamer produces no usable hits, and the m6A DRACH consensus appears in all 100 (8% significant, mean gap -0.0009). The frozen nucleotide encoder's final-layer attention does not preferentially track these canonical stability elements.</w:t>
       </w:r>
     </w:p>
     <w:p>
@@ -5490,7 +5530,7 @@
         <w:spacing w:after="160"/>
       </w:pPr>
       <w:r>
-        <w:t xml:space="preserve">Frozen protein embeddings carry a real, modest signal about mRNA stability that is not driven by sequence length (R² 0.103); RNA embeddings do not (0.015, indistinguishable from zero). The pipeline is verified correct by the synonymous-recoding control. The two embedding spaces mostly disagree as wholes (CKA, mutual k-NN) but share one specific, real subspace (CCA and retrieval, with RSA consistent), and layer-wise analysis suggests that subspace is driven by a compositional, genetic-code-linked signal rather than deep functional overlap. The alignment-error association finds no relationship between local alignment and downstream error, which is consistent with, but does not prove, the view that an explicit alignment loss would not help.</w:t>
+        <w:t>Frozen protein embeddings carry a real, modest signal about mRNA stability that is not driven by sequence length (R² 0.115); the nucleotide (DNA-model) embeddings carry a weaker, less consistent signal (0.048). The pipeline is verified correct by the synonymous-recoding control. The two embedding spaces mostly disagree as wholes (CKA, mutual k-NN) but share one specific, real subspace (CCA and retrieval, with RSA consistent), and layer-wise analysis suggests that subspace is driven by a compositional, genetic-code-linked signal rather than deep functional overlap. The alignment-error association finds no relationship between local alignment and downstream error, which is consistent with, but does not prove, the view that an explicit alignment loss would not help.</w:t>
       </w:r>
     </w:p>
     <w:p>
@@ -5498,7 +5538,7 @@
         <w:spacing w:after="160"/>
       </w:pPr>
       <w:r>
-        <w:t xml:space="preserve">The attention-motif overlap test is null: the RNA encoder's aggregated final-layer attention does not concentrate at AU-rich-element or m6A motifs, though only coding sequence could be tested. Linear concatenation shows no synergy and does not exploit the shared subspace (0.100 versus 0.103 for protein alone); whether a learned fusion mechanism can is the Stage 3 question. The extended Track A checks show GC3 mostly confirming the GC result, and the secondary structure proxy weakly and about equally decodable from either embedding (0.089 RNA, 0.093 protein). Every planned Stage 1 check is implemented and run.</w:t>
+        <w:t>The attention-motif overlap test is null: the nucleotide encoder's aggregated final-layer attention does not concentrate at AU-rich-element or m6A motifs, though only coding sequence could be tested. Linear concatenation shows no synergy and does not exploit the shared subspace (0.118 versus 0.115 for protein alone); whether a learned fusion mechanism can is the Stage 3 question. The extended Track A checks show GC3 mostly confirming the GC result, and the secondary structure proxy weakly and inconsistently decodable from either embedding (0.048 nucleotide, 0.086 protein). Every planned Stage 1 check is implemented and run.</w:t>
       </w:r>
     </w:p>
     <w:p>
@@ -5691,6 +5731,79 @@
         <w:pStyle w:val="Heading3"/>
       </w:pPr>
       <w:r>
+        <w:t>Stage 1 Extension (DNA and Multiple Encoders)</w:t>
+      </w:r>
+    </w:p>
+    <w:p>
+      <w:pPr>
+        <w:pStyle w:val="ListParagraph"/>
+        <w:numPr>
+          <w:ilvl w:val="0"/>
+          <w:numId w:val="2"/>
+        </w:numPr>
+        <w:spacing w:after="100"/>
+      </w:pPr>
+      <w:r>
+        <w:t>Confirm the mRNA_Stability.csv version against the CodonBERT repository and BioLangFusion's filtering (41,123 raw to 23,929 used), and build a deduplicated, sequence-disjoint split.</w:t>
+      </w:r>
+    </w:p>
+    <w:p>
+      <w:pPr>
+        <w:pStyle w:val="ListParagraph"/>
+        <w:numPr>
+          <w:ilvl w:val="0"/>
+          <w:numId w:val="2"/>
+        </w:numPr>
+        <w:spacing w:after="100"/>
+      </w:pPr>
+      <w:r>
+        <w:t>Extend the Stage 1 code to take a list of encoders (for example Nucleotide Transformer 500M human-ref and v2 100M, DNABERT-2; RNA-FM and an mRNA-trained model such as CodonBERT; ESM-2 8M, 35M, and 150M) and produce pairwise CKA, mutual k-NN, RSA, CCA, and retrieval matrices, including pairs within one modality as a baseline.</w:t>
+      </w:r>
+    </w:p>
+    <w:p>
+      <w:pPr>
+        <w:pStyle w:val="ListParagraph"/>
+        <w:numPr>
+          <w:ilvl w:val="0"/>
+          <w:numId w:val="2"/>
+        </w:numPr>
+        <w:spacing w:after="100"/>
+      </w:pPr>
+      <w:r>
+        <w:t>Add the composition control (regress GC, GC3, codon, and amino-acid composition out of each embedding and recompute) and a permutation (Mantel) test for RSA.</w:t>
+      </w:r>
+    </w:p>
+    <w:p>
+      <w:pPr>
+        <w:pStyle w:val="ListParagraph"/>
+        <w:numPr>
+          <w:ilvl w:val="0"/>
+          <w:numId w:val="2"/>
+        </w:numPr>
+        <w:spacing w:after="100"/>
+      </w:pPr>
+      <w:r>
+        <w:t>Run the same pipeline on a pilot subset of IsoFormer's GTEx data, where DNA is a distinct input.</w:t>
+      </w:r>
+    </w:p>
+    <w:p>
+      <w:pPr>
+        <w:pStyle w:val="ListParagraph"/>
+        <w:numPr>
+          <w:ilvl w:val="0"/>
+          <w:numId w:val="2"/>
+        </w:numPr>
+        <w:spacing w:after="100"/>
+      </w:pPr>
+      <w:r>
+        <w:t>Reproduce BioLangFusion's single-encoder and fusion baselines on the official split, then compare the alignment measurements with fusion gains across both datasets.</w:t>
+      </w:r>
+    </w:p>
+    <w:p>
+      <w:pPr>
+        <w:pStyle w:val="Heading3"/>
+      </w:pPr>
+      <w:r>
         <w:t xml:space="preserve">Stage 2 (Define Alignment)</w:t>
       </w:r>
     </w:p>
@@ -5751,7 +5864,7 @@
         <w:spacing w:after="100"/>
       </w:pPr>
       <w:r>
-        <w:t xml:space="preserve">Build the Coupled Mamba fusion module first, then Isoformer-style cross-attention: frozen RNA and protein encoders feeding a trainable fusion layer plus a task head, training only the fusion module and head.</w:t>
+        <w:t>Build the Coupled Mamba fusion module first, then Isoformer-style cross-attention: frozen DNA, RNA, and protein encoders feeding a trainable fusion layer plus a task head, training only the fusion module and head.</w:t>
       </w:r>
     </w:p>
     <w:p>
@@ -5785,7 +5898,7 @@
         <w:spacing w:after="100"/>
       </w:pPr>
       <w:r>
-        <w:t xml:space="preserve">Compare RNA-only, protein-only, and RNA plus protein fusion (plus all three modalities, if DNA is brought in) against CodonBERT's published scores for mRNA_Stability, with the mRFP_Expression control and the protocol in Section 3.4.</w:t>
+        <w:t>Compare single-modality, pairwise, and three-modality (DNA, RNA, protein) fusion against BioLangFusion's and CodonBERT's published mRNA_Stability scores on the official split, report leakage-free results on a deduplicated split, and include the mRFP_Expression control and the protocol in Section 3.4.</w:t>
       </w:r>
     </w:p>
     <w:p>
@@ -5819,7 +5932,20 @@
         <w:spacing w:after="100"/>
       </w:pPr>
       <w:r>
-        <w:t xml:space="preserve">Does mRNA stability become the confirmed Stage 4 benchmark, or is it one of several candidates? Is proceeding without DNA (given the missing gene and transcript IDs) an acceptable long-term scope?</w:t>
+        <w:t>Does mRNA stability become the confirmed Stage 4 benchmark, or one of several alongside IsoFormer's GTEx data? Is the repository's mRNA_Stability.csv the same version BioLangFusion used (Section 4)?</w:t>
+      </w:r>
+    </w:p>
+    <w:p>
+      <w:pPr>
+        <w:pStyle w:val="ListParagraph"/>
+        <w:numPr>
+          <w:ilvl w:val="0"/>
+          <w:numId w:val="2"/>
+        </w:numPr>
+        <w:spacing w:after="100"/>
+      </w:pPr>
+      <w:r>
+        <w:t>Probe means on the 981-sequence pilot shift across software environments by up to about one fold standard deviation. Should package versions and model revisions be pinned, and several seeds reported, before comparing encoders?</w:t>
       </w:r>
     </w:p>
     <w:p>

</xml_diff>

<commit_message>
Stage 1: one coherent DNA, RNA, and protein notebook with interpretations
Stage1_refactor.ipynb now runs every track on Nucleotide Transformer
(DNA), RNA-FM (RNA), and ESM-2 (protein) in a single flow. The separate
multi-encoder section is removed; its dataset audit, composition
control, and Mantel permutation test are folded into the tracks. Each
result has a results table and interpretation matching the run
outputs. README, docs, reviews, and project notes are updated to the
three-modality results.

Co-Authored-By: Claude Opus 5.5 <noreply@anthropic.com>
Claude-Session: https://claude.ai/code/session_01EXPvTz3oCycFbJjDeAyu2R
</commit_message>
<xml_diff>
--- a/Notes/Mina_Project_Notes.docx
+++ b/Notes/Mina_Project_Notes.docx
@@ -160,7 +160,7 @@
         <w:spacing w:after="160"/>
       </w:pPr>
       <w:r>
-        <w:t>Stage 1 (Representation Analysis) is complete for the first encoder pair: Nucleotide Transformer, a DNA-pretrained model reading the coding sequence, and ESM-2 for protein, both kept frozen throughout. The next step extends Stage 1 to DNA, RNA, and protein encoders, with more than one model per modality, and compares against BioLangFusion and IsoFormer on their own datasets (Sections 4 and 10). Stage 2 (Define Alignment) follows.</w:t>
+        <w:t>Stage 1 (Representation Analysis) is complete for one frozen encoder per modality: Nucleotide Transformer 500M human-ref reads each coding sequence in DNA letters, RNA-FM reads it in RNA letters, and ESM-2 35M reads its translation. The next step adds more than one model per modality and compares against BioLangFusion and IsoFormer on the same inputs (Sections 4 and 10). Stage 2 (Define Alignment) follows.</w:t>
       </w:r>
     </w:p>
     <w:p>
@@ -181,46 +181,46 @@
         <w:spacing w:after="100"/>
       </w:pPr>
       <w:r>
-        <w:t>Frozen protein embeddings carry a modest but reliable signal about mRNA stability (R² = 0.115). The nucleotide (DNA-model) embeddings carry a weaker, less consistent signal (R² = 0.048).</w:t>
-      </w:r>
-    </w:p>
-    <w:p>
-      <w:pPr>
-        <w:pStyle w:val="ListParagraph"/>
-        <w:numPr>
-          <w:ilvl w:val="0"/>
-          <w:numId w:val="2"/>
-        </w:numPr>
-        <w:spacing w:after="100"/>
-      </w:pPr>
-      <w:r>
-        <w:t>The two embedding spaces mostly differ as wholes (final-layer CKA 0.128; mutual k-NN 0.069 against a 0.010 chance level), but they share one strong, learnable subspace (canonical correlations up to 0.955; cross-modal retrieval finds the correct match first 36.6% of the time against 0.3% chance). That shared subspace is most likely compositional, tied to GC content through the genetic code.</w:t>
-      </w:r>
-    </w:p>
-    <w:p>
-      <w:pPr>
-        <w:pStyle w:val="ListParagraph"/>
-        <w:numPr>
-          <w:ilvl w:val="0"/>
-          <w:numId w:val="2"/>
-        </w:numPr>
-        <w:spacing w:after="100"/>
-      </w:pPr>
-      <w:r>
-        <w:t>Simple linear concatenation of the two embeddings shows no meaningful synergy (R² 0.118 against 0.115 for protein alone).</w:t>
-      </w:r>
-    </w:p>
-    <w:p>
-      <w:pPr>
-        <w:pStyle w:val="ListParagraph"/>
-        <w:numPr>
-          <w:ilvl w:val="0"/>
-          <w:numId w:val="2"/>
-        </w:numPr>
-        <w:spacing w:after="100"/>
-      </w:pPr>
-      <w:r>
-        <w:t>The nucleotide encoder's final-layer attention does not concentrate at known mRNA stability motifs (AU-rich elements and m6A sites) within coding sequence.</w:t>
+        <w:t>Frozen protein embeddings carry a modest but reliable linear signal about mRNA stability (R² = 0.103). The DNA (0.015) and RNA (0.028) embeddings show no reliable linear signal; their fold standard deviations exceed their means.</w:t>
+      </w:r>
+    </w:p>
+    <w:p>
+      <w:pPr>
+        <w:pStyle w:val="ListParagraph"/>
+        <w:numPr>
+          <w:ilvl w:val="0"/>
+          <w:numId w:val="2"/>
+        </w:numPr>
+        <w:spacing w:after="100"/>
+      </w:pPr>
+      <w:r>
+        <w:t>The DNA and RNA embeddings agree most with each other (final-layer CKA 0.530), and both agree less with protein (0.128 and 0.199). After fitting linear projections, each modality still finds its matched partner far above chance (CCA Recall@1 0.549, 0.366, and 0.224 against 0.0034). Removing letter, codon, and amino-acid composition cuts CKA by 72% to 81% and Recall@1 to between 0.02 and 0.11, so most cross-modal agreement is compositional.</w:t>
+      </w:r>
+    </w:p>
+    <w:p>
+      <w:pPr>
+        <w:pStyle w:val="ListParagraph"/>
+        <w:numPr>
+          <w:ilvl w:val="0"/>
+          <w:numId w:val="2"/>
+        </w:numPr>
+        <w:spacing w:after="100"/>
+      </w:pPr>
+      <w:r>
+        <w:t>Simple linear concatenation shows no synergy: the best combination (RNA plus protein) reaches R² 0.103, the same as protein alone, and all three modalities together reach 0.098.</w:t>
+      </w:r>
+    </w:p>
+    <w:p>
+      <w:pPr>
+        <w:pStyle w:val="ListParagraph"/>
+        <w:numPr>
+          <w:ilvl w:val="0"/>
+          <w:numId w:val="2"/>
+        </w:numPr>
+        <w:spacing w:after="100"/>
+      </w:pPr>
+      <w:r>
+        <w:t>Neither the DNA nor the RNA encoder's final-layer attention concentrates at known mRNA stability motifs (AU-rich elements and m6A sites) within coding sequence.</w:t>
       </w:r>
     </w:p>
     <w:p>
@@ -236,7 +236,7 @@
         <w:spacing w:after="160"/>
       </w:pPr>
       <w:r>
-        <w:t xml:space="preserve">Mapped onto the alignment theory framework (Section 3.2), these results point to the "low alignment, high uniqueness" branch: each modality carries mostly different information, with one narrow shared subspace. Synergy is not demonstrated by linear concatenation and remains untested until Stage 3's fusion models. The implied Stage 2 direction is to skip an explicit alignment loss and let the fusion architecture learn the shared subspace during training. This is a proposed interpretation of the evidence, not yet a confirmed conclusion.</w:t>
+        <w:t>Mapped onto the alignment theory framework (Section 3.2), these results point to the "low alignment, high uniqueness" branch for the pairs involving protein: the modalities agree weakly, and most of that agreement is reproduced by sequence composition alone. The DNA and RNA encoders are more aligned, as expected for two models reading the same letters, but their agreement is also mostly compositional. Synergy is not demonstrated by linear concatenation and remains untested until Stage 3's fusion models. The implied Stage 2 direction is to skip an explicit alignment loss and let the fusion architecture learn any useful interaction during training. This is a proposed interpretation of the evidence, not yet a confirmed conclusion.</w:t>
       </w:r>
     </w:p>
     <w:p>
@@ -1438,30 +1438,30 @@
           <w:b/>
           <w:bCs/>
         </w:rPr>
-        <w:t xml:space="preserve">Track B, Cross-Modal Comparability:</w:t>
-      </w:r>
-      <w:r>
-        <w:t xml:space="preserve"> CKA and mutual k-NN between the two encoders at multiple layers, not only the final one, since alignment often peaks mid-network. CCA on genuinely paired data (a transcript and its own translated protein) as a direct correspondence check. Cross-modal retrieval as a task-grounded sanity check: query with an RNA embedding and see whether the true matching protein embedding comes back above chance. UMAP last, for communicating results, not as evidence on its own.</w:t>
-      </w:r>
-    </w:p>
-    <w:p>
-      <w:pPr>
-        <w:pStyle w:val="ListParagraph"/>
-        <w:numPr>
-          <w:ilvl w:val="0"/>
-          <w:numId w:val="2"/>
-        </w:numPr>
-        <w:spacing w:after="100"/>
-      </w:pPr>
-      <w:r>
-        <w:rPr>
-          <w:b/>
-          <w:bCs/>
-        </w:rPr>
-        <w:t xml:space="preserve">Track C, Interpretability:</w:t>
-      </w:r>
-      <w:r>
-        <w:t xml:space="preserve"> Nucleotide encoder attention compared against known RNA stability motifs (AU-rich elements and m6A DRACH sites), as a check on whether the representation tracks real regulatory biology rather than an artifact of the probe itself.</w:t>
+        <w:t>Track B, Cross-Modal Comparability:</w:t>
+      </w:r>
+      <w:r>
+        <w:t xml:space="preserve"> CKA and mutual k-NN between each pair of the three encoders at multiple layers, not only the final one, since alignment often peaks mid-network. CCA on genuinely paired data (a coding sequence and its own translated protein) as a direct correspondence check. Cross-modal retrieval as a task-grounded sanity check: query with one modality's embedding and see whether the true matching embedding in the other modality comes back above chance. A composition control that repeats CKA and retrieval after removing sequence composition. UMAP last, for communicating results, not as evidence on its own.</w:t>
+      </w:r>
+    </w:p>
+    <w:p>
+      <w:pPr>
+        <w:pStyle w:val="ListParagraph"/>
+        <w:numPr>
+          <w:ilvl w:val="0"/>
+          <w:numId w:val="2"/>
+        </w:numPr>
+        <w:spacing w:after="100"/>
+      </w:pPr>
+      <w:r>
+        <w:rPr>
+          <w:b/>
+          <w:bCs/>
+        </w:rPr>
+        <w:t>Track C, Interpretability:</w:t>
+      </w:r>
+      <w:r>
+        <w:t xml:space="preserve"> DNA-encoder and RNA-encoder attention compared against known RNA stability motifs (AU-rich elements and m6A DRACH sites), as a check on whether the representation tracks real regulatory biology rather than an artifact of the probe itself.</w:t>
       </w:r>
     </w:p>
     <w:p>
@@ -1469,7 +1469,7 @@
         <w:spacing w:after="160"/>
       </w:pPr>
       <w:r>
-        <w:t xml:space="preserve">The exit criterion for Stage 1 is not a table of CKA scores. It is a placement of the modality pair on the redundancy, uniqueness, and heterogeneity map from the alignment theory paper, plus a synergy reading from Track A. That placement drives Stage 2's decision.</w:t>
+        <w:t>The exit criterion for Stage 1 is not a table of CKA scores. It is a placement of each modality pair on the redundancy, uniqueness, and heterogeneity map from the alignment theory paper, plus a synergy reading from Track A. That placement drives Stage 2's decision.</w:t>
       </w:r>
     </w:p>
     <w:p>
@@ -1854,10 +1854,10 @@
           <w:b/>
           <w:bCs/>
         </w:rPr>
-        <w:t xml:space="preserve">DNA modality: </w:t>
-      </w:r>
-      <w:r>
-        <w:t>the stability data carry only the coding sequence, with no gene or transcript IDs (only Sequence, Value, Dataset, and Split columns), so genomic context around each gene is not available without a separate mapping step. As in BioLangFusion, a modality is therefore defined by the encoder: DNA encoders read the coding sequence in DNA letters, RNA encoders read it in RNA letters, and protein encoders read its translation. Nucleotide Transformer 500M human-ref, used in Stage 1, is itself a DNA-pretrained model, so Stage 1 has already compared a DNA-model representation with a protein representation. Because all three inputs derive from one coding sequence, differences between encoders reflect pretraining corpora and tokenization rather than new biological information.</w:t>
+        <w:t>DNA modality:</w:t>
+      </w:r>
+      <w:r>
+        <w:t xml:space="preserve"> the stability data carry only the coding sequence, with no gene or transcript IDs (only Sequence, Value, Dataset, and Split columns), so genomic context around each gene is not available without a separate mapping step. As in BioLangFusion, a modality is therefore defined by the encoder: DNA encoders read the coding sequence in DNA letters, RNA encoders read it in RNA letters, and protein encoders read its translation. Stage 1 uses Nucleotide Transformer 500M human-ref for DNA, RNA-FM for RNA, and ESM-2 35M for protein. Because all three inputs derive from one coding sequence, differences between encoders reflect pretraining corpora and tokenization rather than new biological information.</w:t>
       </w:r>
     </w:p>
     <w:p>
@@ -3081,7 +3081,7 @@
                 <w:sz w:val="21"/>
                 <w:szCs w:val="21"/>
               </w:rPr>
-              <w:t xml:space="preserve">The ICML 2025 paper's own diagnostic. Run in Stage 1 as an exploratory sample-level adaptation (alignment-error association, r = -0.013, p = 0.83); the paper's across-model version is not replicated.</w:t>
+              <w:t>The ICML 2025 paper's own diagnostic. Run in Stage 1 as an exploratory sample-level adaptation (alignment-error association for each modality pair: 0.010, -0.013, and -0.131, none surviving correction); the paper's across-model version is not replicated.</w:t>
             </w:r>
           </w:p>
         </w:tc>
@@ -5062,7 +5062,7 @@
         <w:spacing w:after="160"/>
       </w:pPr>
       <w:r>
-        <w:t>All results come from the saved outputs of Code/Stage1_refactor.ipynb (GPU run, Python 3.13) on 1,000 sequences sampled from mRNA_Stability.</w:t>
+        <w:t>All results come from the saved outputs of Code/Stage1_refactor.ipynb (CPU run, Python 3.12, transformers 5.15.1, multimolecule 0.2.1) on 1,000 sequences sampled from mRNA_Stability. The notebook gives a results table and interpretation after each output.</w:t>
       </w:r>
     </w:p>
     <w:p>
@@ -5087,30 +5087,30 @@
           <w:b/>
           <w:bCs/>
         </w:rPr>
-        <w:t xml:space="preserve">Pipeline:</w:t>
-      </w:r>
-      <w:r>
-        <w:t xml:space="preserve"> the notebook loads mRNA_Stability, keeps valid, in-frame sequences that start with a start codon, translates each kept sequence to its protein via the genetic code, and embeds the nucleotide sequence (Nucleotide Transformer, a DNA-pretrained model) and the protein sequence (ESM-2) with frozen, off-the-shelf encoders. Of 1,000 sampled sequences, 981 pass the validity filter (98% retention).</w:t>
-      </w:r>
-    </w:p>
-    <w:p>
-      <w:pPr>
-        <w:pStyle w:val="ListParagraph"/>
-        <w:numPr>
-          <w:ilvl w:val="0"/>
-          <w:numId w:val="2"/>
-        </w:numPr>
-        <w:spacing w:after="100"/>
-      </w:pPr>
-      <w:r>
-        <w:rPr>
-          <w:b/>
-          <w:bCs/>
-        </w:rPr>
-        <w:t xml:space="preserve">Correctness control (mRFP_Expression):</w:t>
-      </w:r>
-      <w:r>
-        <w:t xml:space="preserve"> all 1,000 synonymous-recoding variants translate to one identical protein, as expected. Protein embeddings for these variants collapse almost to a single point (average distance to centroid 0.00004), while nucleotide embeddings, which see the codon-level differences, spread out clearly (4.72). This confirms that translation, frame checking, and embedding behave correctly, so the results below are not artifacts of a broken pipeline.</w:t>
+        <w:t>Pipeline:</w:t>
+      </w:r>
+      <w:r>
+        <w:t xml:space="preserve"> the notebook loads mRNA_Stability, keeps valid, in-frame sequences that start with a start codon, and translates each kept sequence to its protein via the genetic code. Each kept sequence is embedded three ways with frozen, off-the-shelf encoders: in DNA letters by Nucleotide Transformer 500M human-ref (1,280 dimensions), in RNA letters by RNA-FM (640 dimensions, reading at most the first 1,022 nucleotides), and as its translated protein by ESM-2 35M (480 dimensions). Of 1,000 sampled sequences, 981 pass the validity filter (98% retention).</w:t>
+      </w:r>
+    </w:p>
+    <w:p>
+      <w:pPr>
+        <w:pStyle w:val="ListParagraph"/>
+        <w:numPr>
+          <w:ilvl w:val="0"/>
+          <w:numId w:val="2"/>
+        </w:numPr>
+        <w:spacing w:after="100"/>
+      </w:pPr>
+      <w:r>
+        <w:rPr>
+          <w:b/>
+          <w:bCs/>
+        </w:rPr>
+        <w:t>Correctness control (mRFP_Expression):</w:t>
+      </w:r>
+      <w:r>
+        <w:t xml:space="preserve"> all 1,000 synonymous-recoding variants translate to one identical protein, as expected. Protein embeddings for these variants collapse almost to a single point (average distance to centroid 0.00003), while the DNA (4.72) and RNA (0.82) embeddings, which see the codon-level differences, spread out clearly. This confirms that translation, frame checking, and embedding behave correctly, so the results below are not artifacts of a broken pipeline.</w:t>
       </w:r>
     </w:p>
     <w:p>
@@ -5135,110 +5135,110 @@
           <w:b/>
           <w:bCs/>
         </w:rPr>
-        <w:t xml:space="preserve">mRNA stability probe:</w:t>
-      </w:r>
-      <w:r>
-        <w:t xml:space="preserve"> nucleotide (DNA-model) embeddings reach R² 0.048 ± 0.034 and protein embeddings 0.115 ± 0.024. Protein carries a modest, reliable signal, nearly five fold standard deviations above zero; the nucleotide signal is weaker and less consistent across folds, about 1.4 standard deviations above zero.</w:t>
-      </w:r>
-    </w:p>
-    <w:p>
-      <w:pPr>
-        <w:pStyle w:val="ListParagraph"/>
-        <w:numPr>
-          <w:ilvl w:val="0"/>
-          <w:numId w:val="2"/>
-        </w:numPr>
-        <w:spacing w:after="100"/>
-      </w:pPr>
-      <w:r>
-        <w:rPr>
-          <w:b/>
-          <w:bCs/>
-        </w:rPr>
-        <w:t xml:space="preserve">Sequence-length baseline:</w:t>
-      </w:r>
-      <w:r>
-        <w:t xml:space="preserve"> R² 0.002 ± 0.014, indistinguishable from zero. This rules out the concern that the probe scores above are just a proxy for sequence length.</w:t>
-      </w:r>
-    </w:p>
-    <w:p>
-      <w:pPr>
-        <w:pStyle w:val="ListParagraph"/>
-        <w:numPr>
-          <w:ilvl w:val="0"/>
-          <w:numId w:val="2"/>
-        </w:numPr>
-        <w:spacing w:after="100"/>
-      </w:pPr>
-      <w:r>
-        <w:rPr>
-          <w:b/>
-          <w:bCs/>
-        </w:rPr>
-        <w:t xml:space="preserve">GC content probe (known-property validity check):</w:t>
-      </w:r>
-      <w:r>
-        <w:t xml:space="preserve"> Nucleotide embeddings recover GC content almost perfectly (R² 0.985), as expected for a direct compositional property. Protein embeddings recover 0.688 of it, which follows from genetic code redundancy: certain amino acids are preferentially encoded by GC-rich or AT-rich codons, so protein composition carries an indirect signature of the source gene's GC content.</w:t>
-      </w:r>
-    </w:p>
-    <w:p>
-      <w:pPr>
-        <w:pStyle w:val="ListParagraph"/>
-        <w:numPr>
-          <w:ilvl w:val="0"/>
-          <w:numId w:val="2"/>
-        </w:numPr>
-        <w:spacing w:after="100"/>
-      </w:pPr>
-      <w:r>
-        <w:rPr>
-          <w:b/>
-          <w:bCs/>
-        </w:rPr>
-        <w:t xml:space="preserve">Synergy check:</w:t>
-      </w:r>
-      <w:r>
-        <w:t xml:space="preserve"> naive concatenation of nucleotide and protein embeddings scores R² 0.118 ± 0.029 against 0.115 ± 0.024 for protein alone, a difference well within noise. At the level of simple concatenation there is no measurable synergy, consistent with the beyond-alignment critique's point that concatenation cannot access synergistic information even if it exists.</w:t>
-      </w:r>
-    </w:p>
-    <w:p>
-      <w:pPr>
-        <w:pStyle w:val="ListParagraph"/>
-        <w:numPr>
-          <w:ilvl w:val="0"/>
-          <w:numId w:val="2"/>
-        </w:numPr>
-        <w:spacing w:after="100"/>
-      </w:pPr>
-      <w:r>
-        <w:rPr>
-          <w:b/>
-          <w:bCs/>
-        </w:rPr>
-        <w:t xml:space="preserve">Codon usage bias probe (GC3):</w:t>
-      </w:r>
-      <w:r>
-        <w:t xml:space="preserve"> Nucleotide embeddings recover GC3 (the GC fraction at each codon's third position, the classical proxy for codon usage bias) at R² 0.970, protein embeddings at 0.389. GC3 correlates 0.922 with overall GC content, so this mostly confirms the GC result. The one new detail is that protein embeddings lose noticeably more ground on this codon-position-specific signal, consistent with translation collapsing synonymous codons to the same amino acid.</w:t>
-      </w:r>
-    </w:p>
-    <w:p>
-      <w:pPr>
-        <w:pStyle w:val="ListParagraph"/>
-        <w:numPr>
-          <w:ilvl w:val="0"/>
-          <w:numId w:val="2"/>
-        </w:numPr>
-        <w:spacing w:after="100"/>
-      </w:pPr>
-      <w:r>
-        <w:rPr>
-          <w:b/>
-          <w:bCs/>
-        </w:rPr>
-        <w:t xml:space="preserve">Secondary structure probe (Nussinov pairing fraction):</w:t>
-      </w:r>
-      <w:r>
-        <w:t xml:space="preserve"> using the classical Nussinov and Jacobson (1980) maximum base-pairing algorithm on a 200-sequence subsample, cropped to each sequence's first 200 nucleotides for runtime (the algorithm is cubic in sequence length), nucleotide embeddings reach R² 0.048 ± 0.102 and protein embeddings 0.086 ± 0.122. Both are weak, and their fold standard deviations exceed their means, so the folds do not agree on whether either embedding encodes this proxy; the nucleotide encoder shows no advantage on this folding proxy despite reading the nucleotides directly. The result is likely limited by the small sample, the simplified pairing model, and the 5' region crop; at face value, composition (GC, GC3) is what these frozen encoders linearly capture, not this structural signal.</w:t>
+        <w:t>mRNA stability probe:</w:t>
+      </w:r>
+      <w:r>
+        <w:t xml:space="preserve"> DNA embeddings reach R² 0.015 ± 0.072, RNA embeddings 0.028 ± 0.065, and protein embeddings 0.103 ± 0.034. Protein carries a modest, reliable signal, about three fold standard deviations above zero; the DNA and RNA means are smaller than their fold standard deviations, so neither shows a reliable linear signal. Both nucleotide encoders read the same letters, so their low scores are not caused by missing input; their pooled embeddings are dominated by composition (see GC below), and RNA-FM sees only the first 1,022 nucleotides.</w:t>
+      </w:r>
+    </w:p>
+    <w:p>
+      <w:pPr>
+        <w:pStyle w:val="ListParagraph"/>
+        <w:numPr>
+          <w:ilvl w:val="0"/>
+          <w:numId w:val="2"/>
+        </w:numPr>
+        <w:spacing w:after="100"/>
+      </w:pPr>
+      <w:r>
+        <w:rPr>
+          <w:b/>
+          <w:bCs/>
+        </w:rPr>
+        <w:t>Sequence-length baseline:</w:t>
+      </w:r>
+      <w:r>
+        <w:t xml:space="preserve"> R² -0.006 ± 0.013, indistinguishable from zero. This rules out the concern that the probe scores above are just a proxy for sequence length.</w:t>
+      </w:r>
+    </w:p>
+    <w:p>
+      <w:pPr>
+        <w:pStyle w:val="ListParagraph"/>
+        <w:numPr>
+          <w:ilvl w:val="0"/>
+          <w:numId w:val="2"/>
+        </w:numPr>
+        <w:spacing w:after="100"/>
+      </w:pPr>
+      <w:r>
+        <w:rPr>
+          <w:b/>
+          <w:bCs/>
+        </w:rPr>
+        <w:t>GC content probe (known-property validity check):</w:t>
+      </w:r>
+      <w:r>
+        <w:t xml:space="preserve"> DNA embeddings recover GC content almost perfectly (R² 0.986) and RNA embeddings nearly so (0.950), as expected for a direct compositional property. Protein embeddings recover 0.678 of it, which follows from genetic code redundancy: certain amino acids are preferentially encoded by GC-rich or AT-rich codons, so protein composition carries an indirect signature of the source gene's GC content.</w:t>
+      </w:r>
+    </w:p>
+    <w:p>
+      <w:pPr>
+        <w:pStyle w:val="ListParagraph"/>
+        <w:numPr>
+          <w:ilvl w:val="0"/>
+          <w:numId w:val="2"/>
+        </w:numPr>
+        <w:spacing w:after="100"/>
+      </w:pPr>
+      <w:r>
+        <w:rPr>
+          <w:b/>
+          <w:bCs/>
+        </w:rPr>
+        <w:t>Synergy check:</w:t>
+      </w:r>
+      <w:r>
+        <w:t xml:space="preserve"> DNA plus RNA reaches R² 0.032 ± 0.073, DNA plus protein 0.100 ± 0.048, RNA plus protein 0.103 ± 0.045, and all three 0.098 ± 0.060, against 0.103 ± 0.034 for protein alone. Every difference from the best member is under 0.01 and well within noise. At the level of simple concatenation there is no measurable synergy, consistent with the beyond-alignment critique's point that concatenation cannot access synergistic information even if it exists.</w:t>
+      </w:r>
+    </w:p>
+    <w:p>
+      <w:pPr>
+        <w:pStyle w:val="ListParagraph"/>
+        <w:numPr>
+          <w:ilvl w:val="0"/>
+          <w:numId w:val="2"/>
+        </w:numPr>
+        <w:spacing w:after="100"/>
+      </w:pPr>
+      <w:r>
+        <w:rPr>
+          <w:b/>
+          <w:bCs/>
+        </w:rPr>
+        <w:t>Codon usage bias probe (GC3):</w:t>
+      </w:r>
+      <w:r>
+        <w:t xml:space="preserve"> DNA and RNA embeddings recover GC3 (the GC fraction at each codon's third position, the classical proxy for codon usage bias) at R² 0.969 and 0.919, protein embeddings at 0.380. GC3 correlates 0.922 with overall GC content. The nucleotide encoders lose almost nothing from GC to GC3, while protein falls from 0.678 to 0.380, consistent with translation collapsing synonymous codons to the same amino acid. This is the clearest evidence that the DNA and RNA embeddings carry information the protein embedding cannot: synonymous codon usage.</w:t>
+      </w:r>
+    </w:p>
+    <w:p>
+      <w:pPr>
+        <w:pStyle w:val="ListParagraph"/>
+        <w:numPr>
+          <w:ilvl w:val="0"/>
+          <w:numId w:val="2"/>
+        </w:numPr>
+        <w:spacing w:after="100"/>
+      </w:pPr>
+      <w:r>
+        <w:rPr>
+          <w:b/>
+          <w:bCs/>
+        </w:rPr>
+        <w:t>Secondary structure probe (Nussinov pairing fraction):</w:t>
+      </w:r>
+      <w:r>
+        <w:t xml:space="preserve"> using the classical Nussinov and Jacobson (1980) maximum base-pairing algorithm on a 200-sequence subsample, cropped to each sequence's first 200 nucleotides for runtime (the algorithm is cubic in sequence length), DNA embeddings reach R² 0.089 ± 0.033, RNA embeddings 0.141 ± 0.093, and protein embeddings 0.093 ± 0.055. All three are small but positive. RNA-FM, pretrained on structured non-coding RNA, has the highest mean, but its fold standard deviation is large enough that the three cannot be separated with 200 rows. The protein encoder scores as well as the DNA encoder without seeing nucleotides, so composition likely carries much of this proxy.</w:t>
       </w:r>
     </w:p>
     <w:p>
@@ -5283,130 +5283,150 @@
           <w:b/>
           <w:bCs/>
         </w:rPr>
-        <w:t xml:space="preserve">Final-layer linear CKA:</w:t>
-      </w:r>
-      <w:r>
-        <w:t xml:space="preserve"> 0.128, meaning the two full embedding spaces are structured quite differently from each other as wholes.</w:t>
-      </w:r>
-    </w:p>
-    <w:p>
-      <w:pPr>
-        <w:pStyle w:val="ListParagraph"/>
-        <w:numPr>
-          <w:ilvl w:val="0"/>
-          <w:numId w:val="2"/>
-        </w:numPr>
-        <w:spacing w:after="100"/>
-      </w:pPr>
-      <w:r>
-        <w:rPr>
-          <w:b/>
-          <w:bCs/>
-        </w:rPr>
-        <w:t xml:space="preserve">Layer-wise CKA</w:t>
-      </w:r>
-      <w:r>
-        <w:t xml:space="preserve"> across every internal layer of both encoders (25 hidden-state outputs for the 24-layer nucleotide encoder, 13 for the 12-layer protein encoder): the overall peak is 0.400, at RNA layer 16 against protein layer 0 (the protein encoder's embedding layer, before self-attention mixes in any context). Restricted to the protein encoder's contextualized layers, the peak drops to 0.359, at RNA layer 0 against protein layer 1. Both of the strongest alignment points involve one encoder at or next to its own embedding layer. Together with the GC content probe, this suggests a compositional signal on each side, tied to genetic code redundancy, drives most of the measured cross-modal alignment, rather than deep functional overlap between the encoders. This tempers, without undoing, the case for fusion: the shared structure looks real but more modest than deep semantic convergence.</w:t>
-      </w:r>
-    </w:p>
-    <w:p>
-      <w:pPr>
-        <w:pStyle w:val="ListParagraph"/>
-        <w:numPr>
-          <w:ilvl w:val="0"/>
-          <w:numId w:val="2"/>
-        </w:numPr>
-        <w:spacing w:after="100"/>
-      </w:pPr>
-      <w:r>
-        <w:rPr>
-          <w:b/>
-          <w:bCs/>
-        </w:rPr>
-        <w:t xml:space="preserve">Layer-wise sampling note:</w:t>
-      </w:r>
-      <w:r>
-        <w:t xml:space="preserve"> the layer-wise analysis uses a 200-sequence subsample. Its final-layer score is 0.187, versus 0.128 on the full 981-sequence sample. Since the final hidden-state layer is the same pooled embedding used in the full-sample calculation, the gap reflects sampling noise at n = 200, so the layer-wise heatmap values should be read as indicative rather than precise.</w:t>
-      </w:r>
-    </w:p>
-    <w:p>
-      <w:pPr>
-        <w:pStyle w:val="ListParagraph"/>
-        <w:numPr>
-          <w:ilvl w:val="0"/>
-          <w:numId w:val="2"/>
-        </w:numPr>
-        <w:spacing w:after="100"/>
-      </w:pPr>
-      <w:r>
-        <w:rPr>
-          <w:b/>
-          <w:bCs/>
-        </w:rPr>
-        <w:t xml:space="preserve">Mutual k-nearest-neighbor alignment (k = 10):</w:t>
-      </w:r>
-      <w:r>
-        <w:t xml:space="preserve"> 0.069, against a chance level of about 0.010, roughly seven times above random. This corroborates CKA's read of modest but real global alignment.</w:t>
-      </w:r>
-    </w:p>
-    <w:p>
-      <w:pPr>
-        <w:pStyle w:val="ListParagraph"/>
-        <w:numPr>
-          <w:ilvl w:val="0"/>
-          <w:numId w:val="2"/>
-        </w:numPr>
-        <w:spacing w:after="100"/>
-      </w:pPr>
-      <w:r>
-        <w:rPr>
-          <w:b/>
-          <w:bCs/>
-        </w:rPr>
-        <w:t xml:space="preserve">CCA</w:t>
-      </w:r>
-      <w:r>
-        <w:t xml:space="preserve"> (PCA-reduced to 50 dimensions per modality, then 10 canonical components, evaluated on a held-out 30% test split): canonical correlations reach 0.955 in the top component. Cross-modal retrieval in that learned subspace finds the correct matching protein embedding as the top candidate 36.6% of the time (chance 0.3%), within the top 5 61.4% of the time, and within the top 10 75.9% of the time.</w:t>
-      </w:r>
-    </w:p>
-    <w:p>
-      <w:pPr>
-        <w:pStyle w:val="ListParagraph"/>
-        <w:numPr>
-          <w:ilvl w:val="0"/>
-          <w:numId w:val="2"/>
-        </w:numPr>
-        <w:spacing w:after="100"/>
-      </w:pPr>
-      <w:r>
-        <w:rPr>
-          <w:b/>
-          <w:bCs/>
-        </w:rPr>
-        <w:t xml:space="preserve">Reading Track B together:</w:t>
-      </w:r>
-      <w:r>
-        <w:t xml:space="preserve"> CKA and mutual k-NN say the two full spaces mostly disagree; CCA and retrieval say a specific, strong, learnable shared subspace exists within them, plausibly the same compositional signal the GC and layer-wise results point to. This is the strongest evidence so far that a trained fusion mechanism, rather than naive concatenation, is worth building: real cross-modal structure exists, but it takes a method that can learn where to look to use it.</w:t>
-      </w:r>
-    </w:p>
-    <w:p>
-      <w:pPr>
-        <w:pStyle w:val="ListParagraph"/>
-        <w:numPr>
-          <w:ilvl w:val="0"/>
-          <w:numId w:val="2"/>
-        </w:numPr>
-        <w:spacing w:after="100"/>
-      </w:pPr>
-      <w:r>
-        <w:rPr>
-          <w:b/>
-          <w:bCs/>
-        </w:rPr>
-        <w:t xml:space="preserve">UMAP:</w:t>
-      </w:r>
-      <w:r>
-        <w:t xml:space="preserve"> both RNA and protein embeddings show one large main cluster plus a small separate subgroup. Two independently trained encoders isolating a similar subgroup is unlikely to be coincidental and may reflect a species subpopulation in this multi-species dataset; worth checking against the dataset's species information. Illustrative only, not evidence on its own.</w:t>
+        <w:t>Final-layer linear CKA:</w:t>
+      </w:r>
+      <w:r>
+        <w:t xml:space="preserve"> 0.530 for DNA-RNA, 0.128 for DNA-protein, and 0.199 for RNA-protein. The two nucleotide encoders organize the sequences much more similarly than either does with the protein encoder, as expected for models reading the same letters.</w:t>
+      </w:r>
+    </w:p>
+    <w:p>
+      <w:pPr>
+        <w:pStyle w:val="ListParagraph"/>
+        <w:numPr>
+          <w:ilvl w:val="0"/>
+          <w:numId w:val="2"/>
+        </w:numPr>
+        <w:spacing w:after="100"/>
+      </w:pPr>
+      <w:r>
+        <w:rPr>
+          <w:b/>
+          <w:bCs/>
+        </w:rPr>
+        <w:t>Layer-wise CKA</w:t>
+      </w:r>
+      <w:r>
+        <w:t xml:space="preserve"> across every internal layer of each pair of encoders (25 hidden-state outputs for the 24-layer DNA encoder, 13 each for the 12-layer RNA and protein encoders). DNA-RNA agreement peaks at 0.764, at DNA layer 14 and RNA layer 1, with a band of high agreement at DNA layers 12 to 16 across every RNA layer. Both pairs involving protein peak at the protein encoder's embedding layer, before self-attention mixes in any context: 0.400 at DNA layer 16 and 0.451 at RNA layer 5. Excluding that layer, the peaks drop to 0.359 and 0.306 at protein layer 1. Together with the GC content probe, this pointed to composition as the main driver of cross-modal agreement, which the composition control below confirms.</w:t>
+      </w:r>
+    </w:p>
+    <w:p>
+      <w:pPr>
+        <w:pStyle w:val="ListParagraph"/>
+        <w:numPr>
+          <w:ilvl w:val="0"/>
+          <w:numId w:val="2"/>
+        </w:numPr>
+        <w:spacing w:after="100"/>
+      </w:pPr>
+      <w:r>
+        <w:rPr>
+          <w:b/>
+          <w:bCs/>
+        </w:rPr>
+        <w:t>Layer-wise sampling note:</w:t>
+      </w:r>
+      <w:r>
+        <w:t xml:space="preserve"> the layer-wise analysis uses a 200-sequence subsample. Its final-layer scores (0.596, 0.187, and 0.225) are higher than the full-sample values, as expected for linear CKA with few examples relative to the embedding widths, so the layer-wise heatmap values should be compared within that analysis rather than with the full-sample values.</w:t>
+      </w:r>
+    </w:p>
+    <w:p>
+      <w:pPr>
+        <w:pStyle w:val="ListParagraph"/>
+        <w:numPr>
+          <w:ilvl w:val="0"/>
+          <w:numId w:val="2"/>
+        </w:numPr>
+        <w:spacing w:after="100"/>
+      </w:pPr>
+      <w:r>
+        <w:rPr>
+          <w:b/>
+          <w:bCs/>
+        </w:rPr>
+        <w:t>Mutual k-nearest-neighbor alignment (k = 10):</w:t>
+      </w:r>
+      <w:r>
+        <w:t xml:space="preserve"> 0.118 for DNA-RNA, 0.070 for DNA-protein, and 0.060 for RNA-protein, against a chance level of about 0.010, roughly 12, 7, and 6 times above random. This corroborates CKA's read of modest but real global alignment, strongest between the two nucleotide encoders.</w:t>
+      </w:r>
+    </w:p>
+    <w:p>
+      <w:pPr>
+        <w:pStyle w:val="ListParagraph"/>
+        <w:numPr>
+          <w:ilvl w:val="0"/>
+          <w:numId w:val="2"/>
+        </w:numPr>
+        <w:spacing w:after="100"/>
+      </w:pPr>
+      <w:r>
+        <w:rPr>
+          <w:b/>
+          <w:bCs/>
+        </w:rPr>
+        <w:t>CCA</w:t>
+      </w:r>
+      <w:r>
+        <w:t xml:space="preserve"> (PCA-reduced to 50 dimensions per modality, then 10 canonical components, evaluated on a held-out 30% test split of 295 rows): the top canonical correlation is 0.972 for DNA-RNA, 0.955 for DNA-protein, and 0.908 for RNA-protein. Cross-modal retrieval in that learned subspace finds the correct match as the top candidate 54.9%, 36.6%, and 22.4% of the time (chance 0.3%), and within the top 10 89.2%, 75.9%, and 62.4% of the time.</w:t>
+      </w:r>
+    </w:p>
+    <w:p>
+      <w:pPr>
+        <w:pStyle w:val="ListParagraph"/>
+        <w:numPr>
+          <w:ilvl w:val="0"/>
+          <w:numId w:val="2"/>
+        </w:numPr>
+        <w:spacing w:after="100"/>
+      </w:pPr>
+      <w:r>
+        <w:rPr>
+          <w:b/>
+          <w:bCs/>
+        </w:rPr>
+        <w:t>Reading Track B together:</w:t>
+      </w:r>
+      <w:r>
+        <w:t xml:space="preserve"> CKA and mutual k-NN say the full spaces mostly disagree, especially with protein; CCA and retrieval say a specific, strong, learnable shared subspace exists within each pair. The composition control shows that this shared subspace is mostly composition.</w:t>
+      </w:r>
+    </w:p>
+    <w:p>
+      <w:pPr>
+        <w:pStyle w:val="ListParagraph"/>
+        <w:numPr>
+          <w:ilvl w:val="0"/>
+          <w:numId w:val="2"/>
+        </w:numPr>
+        <w:spacing w:after="100"/>
+      </w:pPr>
+      <w:r>
+        <w:rPr>
+          <w:b/>
+          <w:bCs/>
+        </w:rPr>
+        <w:t>Composition control:</w:t>
+      </w:r>
+      <w:r>
+        <w:t xml:space="preserve"> composition explains, in sample, 61.8% of the DNA embedding variance, 67.7% of the RNA, and 44.6% of the protein, against about 9% expected by chance from 88 predictors. After regressing letter, codon, and amino-acid frequencies out of every embedding, CKA falls to 0.101, 0.027, and 0.055 (drops of 72% to 81%), and CCA Recall@1 falls to 0.112, 0.024, and 0.054, still about 33, 7, and 16 times chance. Most cross-modal agreement between these frozen pooled embeddings is therefore compositional; the small residual, largest between DNA and RNA, is the part that could reflect shared information beyond composition. Raw similarity between frozen embeddings is a weak alignment target, and later comparisons should report agreement before and after this control.</w:t>
+      </w:r>
+    </w:p>
+    <w:p>
+      <w:pPr>
+        <w:pStyle w:val="ListParagraph"/>
+        <w:numPr>
+          <w:ilvl w:val="0"/>
+          <w:numId w:val="2"/>
+        </w:numPr>
+        <w:spacing w:after="100"/>
+      </w:pPr>
+      <w:r>
+        <w:rPr>
+          <w:b/>
+          <w:bCs/>
+        </w:rPr>
+        <w:t>UMAP:</w:t>
+      </w:r>
+      <w:r>
+        <w:t xml:space="preserve"> each of the three layouts shows one large main cluster plus a small separated group, and the protein layout also shows several small satellite clusters. Because each layout is fitted separately and points are unlabeled, the plots do not show whether these groups contain the same sequences; tracing them back to the rows, and checking length, GC content, and species, would test that. Illustrative only, not evidence on its own.</w:t>
       </w:r>
     </w:p>
     <w:p>
@@ -5451,10 +5471,10 @@
           <w:b/>
           <w:bCs/>
         </w:rPr>
-        <w:t xml:space="preserve">Attention-motif overlap test (results):</w:t>
-      </w:r>
-      <w:r>
-        <w:t xml:space="preserve"> in the single-example check, 63 motif hits covering 311 positions show mean attention of 0.0031 versus 0.0033 elsewhere, not significant (p = 0.60), with neither motif class significant on its own. Across the 100-sequence aggregate, all 100 sequences yield usable hits; only 7% show significantly higher attention at motif positions, against a 5% chance baseline, and the mean attention gap is -0.0009, essentially zero. The ARE pentamer appears in 41 sequences (5% significant, mean gap -0.0027), the ARE nonamer produces no usable hits, and the m6A DRACH consensus appears in all 100 (8% significant, mean gap -0.0009). The frozen nucleotide encoder's final-layer attention does not preferentially track these canonical stability elements.</w:t>
+        <w:t>Attention-motif overlap test (results):</w:t>
+      </w:r>
+      <w:r>
+        <w:t xml:space="preserve"> for the DNA encoder, in the single-example check, 311 matched positions show mean attention of 0.0031 versus 0.0033 elsewhere (p = 0.60). RNA-FM covers only the first 1,022 of that sequence's 2,556 nucleotides, and its 135 matched positions show 0.0172 versus 0.0138 (p = 0.068). Across the 100-sequence aggregate, all 100 sequences yield usable hits for both encoders; 7% (DNA) and 9% (RNA) show nominally higher attention at motif positions, against a 5% chance baseline, and the mean attention gaps are slightly negative (-0.0009 and -0.0015). The ARE pentamer appears in 41 sequences within the DNA encoder's coverage and 33 within RNA-FM's, and the ARE nonamer in none.</w:t>
       </w:r>
     </w:p>
     <w:p>
@@ -5491,30 +5511,30 @@
           <w:b/>
           <w:bCs/>
         </w:rPr>
-        <w:t xml:space="preserve">Alignment-error association</w:t>
-      </w:r>
-      <w:r>
-        <w:t xml:space="preserve"> (an exploratory adaptation of the ICML 2025 paper's diagnostic, reported as a Spearman correlation rather than a fitted slope): on the held-out CCA test-set vectors, the correlation between per-sample local alignment and downstream prediction error is -0.013 (p = 0.83), meaning no detected association. Read against the paper's framework, this is consistent with the view that an explicit alignment loss is unlikely to help the fusion architecture, but it does not establish modality uniqueness or directly predict the effect of training with an alignment loss. It is a single-encoder-pair, sample-level adaptation of the paper's across-model diagnostic, not a replication. It agrees with the direction Track B's CKA and mutual k-NN results already point.</w:t>
-      </w:r>
-    </w:p>
-    <w:p>
-      <w:pPr>
-        <w:pStyle w:val="ListParagraph"/>
-        <w:numPr>
-          <w:ilvl w:val="0"/>
-          <w:numId w:val="2"/>
-        </w:numPr>
-        <w:spacing w:after="100"/>
-      </w:pPr>
-      <w:r>
-        <w:rPr>
-          <w:b/>
-          <w:bCs/>
-        </w:rPr>
-        <w:t xml:space="preserve">Representational Similarity Analysis (RSA):</w:t>
-      </w:r>
-      <w:r>
-        <w:t xml:space="preserve"> the Spearman correlation between the two modalities' internal pairwise-distance structures is 0.234 (p &lt; 0.001). This is consistent with the modest but real shared structure found by CCA and retrieval, this time from comparing each modality's own internal geometry rather than comparing embeddings across modalities, and it does not depend on the two encoders' embedding dimensions matching. It reuses the same embeddings as the other diagnostics, so it is supporting evidence rather than a fully independent confirmation.</w:t>
+        <w:t>Alignment-error association (an exploratory adaptation of the ICML 2025 paper's diagnostic, reported as a Spearman correlation rather than a fitted slope):</w:t>
+      </w:r>
+      <w:r>
+        <w:t xml:space="preserve"> on the held-out CCA test-set vectors, the Spearman correlation between per-sample local alignment and downstream prediction error is 0.010 (p = 0.86) for DNA-RNA, -0.013 (p = 0.83) for DNA-protein, and -0.131 (p = 0.025) for RNA-protein. The RNA-protein association is weak and does not survive a correction for testing three pairs (Bonferroni threshold 0.0167). Read against the paper's framework, this is consistent with the view that an explicit alignment loss is unlikely to help the fusion architecture, but it does not establish modality uniqueness or directly predict the effect of training with an alignment loss. It is a sample-level adaptation of the paper's across-model diagnostic, not a replication.</w:t>
+      </w:r>
+    </w:p>
+    <w:p>
+      <w:pPr>
+        <w:pStyle w:val="ListParagraph"/>
+        <w:numPr>
+          <w:ilvl w:val="0"/>
+          <w:numId w:val="2"/>
+        </w:numPr>
+        <w:spacing w:after="100"/>
+      </w:pPr>
+      <w:r>
+        <w:rPr>
+          <w:b/>
+          <w:bCs/>
+        </w:rPr>
+        <w:t>Representational Similarity Analysis (RSA):</w:t>
+      </w:r>
+      <w:r>
+        <w:t xml:space="preserve"> the Spearman correlation between two modalities' internal pairwise-distance structures is 0.548 for DNA-RNA, 0.234 for DNA-protein, and 0.238 for RNA-protein. A Mantel permutation test with 499 permutations gives p = 0.002 for every pair, the smallest attainable value, so each pair shares more distance structure than chance. RSA ranks the pairs as CKA does, and it reuses the same embeddings as the other diagnostics, so it is supporting evidence rather than a fully independent confirmation.</w:t>
       </w:r>
     </w:p>
     <w:p>
@@ -5530,7 +5550,7 @@
         <w:spacing w:after="160"/>
       </w:pPr>
       <w:r>
-        <w:t>Frozen protein embeddings carry a real, modest signal about mRNA stability that is not driven by sequence length (R² 0.115); the nucleotide (DNA-model) embeddings carry a weaker, less consistent signal (0.048). The pipeline is verified correct by the synonymous-recoding control. The two embedding spaces mostly disagree as wholes (CKA, mutual k-NN) but share one specific, real subspace (CCA and retrieval, with RSA consistent), and layer-wise analysis suggests that subspace is driven by a compositional, genetic-code-linked signal rather than deep functional overlap. The alignment-error association finds no relationship between local alignment and downstream error, which is consistent with, but does not prove, the view that an explicit alignment loss would not help.</w:t>
+        <w:t>Frozen protein embeddings carry a real, modest linear signal about mRNA stability that is not driven by sequence length (R² 0.103); the DNA (0.015) and RNA (0.028) embeddings show no reliable linear signal. The pipeline is verified correct by the synonymous-recoding control. The two nucleotide embeddings agree much more with each other than with protein, CCA and retrieval find a strong shared subspace for every pair, and the composition control shows that most of this agreement is reproduced by letter, codon, and amino-acid frequencies alone. The alignment-error association finds no reliable relationship between local alignment and downstream error.</w:t>
       </w:r>
     </w:p>
     <w:p>
@@ -5538,7 +5558,7 @@
         <w:spacing w:after="160"/>
       </w:pPr>
       <w:r>
-        <w:t>The attention-motif overlap test is null: the nucleotide encoder's aggregated final-layer attention does not concentrate at AU-rich-element or m6A motifs, though only coding sequence could be tested. Linear concatenation shows no synergy and does not exploit the shared subspace (0.118 versus 0.115 for protein alone); whether a learned fusion mechanism can is the Stage 3 question. The extended Track A checks show GC3 mostly confirming the GC result, and the secondary structure proxy weakly and inconsistently decodable from either embedding (0.048 nucleotide, 0.086 protein). Every planned Stage 1 check is implemented and run.</w:t>
+        <w:t>The attention-motif overlap test is null for both nucleotide encoders, though only coding sequence could be tested. Linear concatenation shows no synergy (best combination 0.103, equal to protein alone); whether a learned fusion mechanism can use the modalities together is the Stage 3 question. GC3 shows that the DNA and RNA embeddings keep synonymous codon information the protein embedding lacks, and the secondary structure proxy is weakly decodable from all three embeddings. Every planned Stage 1 check is implemented and run.</w:t>
       </w:r>
     </w:p>
     <w:p>
@@ -5563,70 +5583,70 @@
           <w:b/>
           <w:bCs/>
         </w:rPr>
-        <w:t xml:space="preserve">The disagreement between metrics is the finding.</w:t>
-      </w:r>
-      <w:r>
-        <w:t xml:space="preserve"> CKA and mutual k-NN say the two spaces mostly disagree, while CCA and retrieval find, and RSA is consistent with, one strong, learnable shared subspace. That contrast is informative in itself, not a gap to explain away.</w:t>
-      </w:r>
-    </w:p>
-    <w:p>
-      <w:pPr>
-        <w:pStyle w:val="ListParagraph"/>
-        <w:numPr>
-          <w:ilvl w:val="0"/>
-          <w:numId w:val="2"/>
-        </w:numPr>
-        <w:spacing w:after="100"/>
-      </w:pPr>
-      <w:r>
-        <w:rPr>
-          <w:b/>
-          <w:bCs/>
-        </w:rPr>
-        <w:t xml:space="preserve">Placement in the alignment framework.</w:t>
-      </w:r>
-      <w:r>
-        <w:t xml:space="preserve"> The evidence from several methods (CKA, mutual k-NN, CCA, retrieval, RSA) points to high uniqueness with a narrow pocket of real redundancy, rather than a uniformly redundant or uniformly unique pair. Synergy is a separate question: linear concatenation shows none, and Stage 3 tests it properly.</w:t>
-      </w:r>
-    </w:p>
-    <w:p>
-      <w:pPr>
-        <w:pStyle w:val="ListParagraph"/>
-        <w:numPr>
-          <w:ilvl w:val="0"/>
-          <w:numId w:val="2"/>
-        </w:numPr>
-        <w:spacing w:after="100"/>
-      </w:pPr>
-      <w:r>
-        <w:rPr>
-          <w:b/>
-          <w:bCs/>
-        </w:rPr>
-        <w:t xml:space="preserve">Implication for fusion.</w:t>
-      </w:r>
-      <w:r>
-        <w:t xml:space="preserve"> Linear concatenation shows no synergy, while a targeted method (CCA) finds real structure the two encoders already contain. That supports prioritizing a learned fusion mechanism (Coupled Mamba, then cross-attention) that can learn where that structure is. Concatenation plus an MLP stays in as the baseline, since Stage 1 only tested a linear probe on concatenated embeddings, not a nonlinear head.</w:t>
-      </w:r>
-    </w:p>
-    <w:p>
-      <w:pPr>
-        <w:pStyle w:val="ListParagraph"/>
-        <w:numPr>
-          <w:ilvl w:val="0"/>
-          <w:numId w:val="2"/>
-        </w:numPr>
-        <w:spacing w:after="100"/>
-      </w:pPr>
-      <w:r>
-        <w:rPr>
-          <w:b/>
-          <w:bCs/>
-        </w:rPr>
-        <w:t xml:space="preserve">The null attention result is a real result.</w:t>
-      </w:r>
-      <w:r>
-        <w:t xml:space="preserve"> The frozen encoder's aggregated final-layer attention does not track these canonical stability elements, within the coding-only limit described above. A different layer or attention head, or a dataset with UTR context, could be checked next.</w:t>
+        <w:t>The disagreement between metrics is the finding.</w:t>
+      </w:r>
+      <w:r>
+        <w:t xml:space="preserve"> CKA and mutual k-NN say the spaces mostly disagree, while CCA and retrieval find, and RSA is consistent with, a strong, learnable shared subspace in every pair. The composition control resolves the contrast: that subspace is mostly composition.</w:t>
+      </w:r>
+    </w:p>
+    <w:p>
+      <w:pPr>
+        <w:pStyle w:val="ListParagraph"/>
+        <w:numPr>
+          <w:ilvl w:val="0"/>
+          <w:numId w:val="2"/>
+        </w:numPr>
+        <w:spacing w:after="100"/>
+      </w:pPr>
+      <w:r>
+        <w:rPr>
+          <w:b/>
+          <w:bCs/>
+        </w:rPr>
+        <w:t>Placement in the alignment framework.</w:t>
+      </w:r>
+      <w:r>
+        <w:t xml:space="preserve"> The evidence from several methods points to high uniqueness for the pairs involving protein, with the shared part largely compositional. The DNA and RNA encoders are more redundant with each other, as expected for two models reading the same sequence. Synergy is a separate question: linear concatenation shows none, and Stage 3 tests it properly.</w:t>
+      </w:r>
+    </w:p>
+    <w:p>
+      <w:pPr>
+        <w:pStyle w:val="ListParagraph"/>
+        <w:numPr>
+          <w:ilvl w:val="0"/>
+          <w:numId w:val="2"/>
+        </w:numPr>
+        <w:spacing w:after="100"/>
+      </w:pPr>
+      <w:r>
+        <w:rPr>
+          <w:b/>
+          <w:bCs/>
+        </w:rPr>
+        <w:t>Implication for fusion.</w:t>
+      </w:r>
+      <w:r>
+        <w:t xml:space="preserve"> Linear concatenation shows no synergy, and the cross-modal structure the encoders share is mostly composition that each encoder can already see. A learned fusion mechanism (Coupled Mamba, then cross-attention) is still the right Stage 3 test, since it can use token-level interactions that pooled linear probes cannot, but the bar is high: it must beat protein alone and the concatenation-plus-MLP baseline.</w:t>
+      </w:r>
+    </w:p>
+    <w:p>
+      <w:pPr>
+        <w:pStyle w:val="ListParagraph"/>
+        <w:numPr>
+          <w:ilvl w:val="0"/>
+          <w:numId w:val="2"/>
+        </w:numPr>
+        <w:spacing w:after="100"/>
+      </w:pPr>
+      <w:r>
+        <w:rPr>
+          <w:b/>
+          <w:bCs/>
+        </w:rPr>
+        <w:t>The null attention result is a real result.</w:t>
+      </w:r>
+      <w:r>
+        <w:t xml:space="preserve"> Neither frozen nucleotide encoder's aggregated final-layer attention tracks these canonical stability elements, within the coding-only limit described above. A different layer or attention head, gradient attribution, or a dataset with UTR context could be checked next.</w:t>
       </w:r>
     </w:p>
     <w:p>
@@ -5691,10 +5711,10 @@
           <w:b/>
           <w:bCs/>
         </w:rPr>
-        <w:t xml:space="preserve">Toolkit implemented and run:</w:t>
-      </w:r>
-      <w:r>
-        <w:t xml:space="preserve"> linear probing (RidgeCV, 5-fold grouped cross-validation), CKA (final-layer and layer-wise), mutual k-NN alignment, CCA with held-out cross-modal retrieval, UMAP, the GC content validity probe, the sequence-length confound check, the synergy check, the pipeline-correctness control, the alignment-error association, attention extraction with ARE and m6A motif matching, RSA, and the two extended Track A probes (GC3 and Nussinov pairing fraction). Nothing from the planned Stage 1 toolkit remains unimplemented.</w:t>
+        <w:t>Toolkit implemented and run:</w:t>
+      </w:r>
+      <w:r>
+        <w:t xml:space="preserve"> linear probing (RidgeCV, 5-fold grouped cross-validation), CKA (final-layer and layer-wise), mutual k-NN alignment, CCA with held-out cross-modal retrieval, the composition control, UMAP, the GC content validity probe, the sequence-length confound check, the synergy check, the pipeline-correctness control, the alignment-error association, attention extraction with ARE and m6A motif matching for the DNA and RNA encoders, RSA with a Mantel permutation test, the dataset audit, and the two extended Track A probes (GC3 and Nussinov pairing fraction), all for DNA, RNA, and protein.</w:t>
       </w:r>
     </w:p>
     <w:p>
@@ -5731,7 +5751,7 @@
         <w:pStyle w:val="Heading3"/>
       </w:pPr>
       <w:r>
-        <w:t>Stage 1 Extension (DNA and Multiple Encoders)</w:t>
+        <w:t>Multiple Encoders per Modality</w:t>
       </w:r>
     </w:p>
     <w:p>
@@ -5757,20 +5777,20 @@
         <w:spacing w:after="100"/>
       </w:pPr>
       <w:r>
-        <w:t>Extend the Stage 1 code to take a list of encoders (for example Nucleotide Transformer 500M human-ref and v2 100M, DNABERT-2; RNA-FM and an mRNA-trained model such as CodonBERT; ESM-2 8M, 35M, and 150M) and produce pairwise CKA, mutual k-NN, RSA, CCA, and retrieval matrices, including pairs within one modality as a baseline.</w:t>
-      </w:r>
-    </w:p>
-    <w:p>
-      <w:pPr>
-        <w:pStyle w:val="ListParagraph"/>
-        <w:numPr>
-          <w:ilvl w:val="0"/>
-          <w:numId w:val="2"/>
-        </w:numPr>
-        <w:spacing w:after="100"/>
-      </w:pPr>
-      <w:r>
-        <w:t>Add the composition control (regress GC, GC3, codon, and amino-acid composition out of each embedding and recompute) and a permutation (Mantel) test for RSA.</w:t>
+        <w:t>Extend the Stage 1 code, in a separate notebook, to take a list of encoders (for example Nucleotide Transformer v2 100M and DNABERT-2 for DNA; mRNA-FM for RNA; ESM-2 8M and 150M for protein) and produce pairwise CKA, mutual k-NN, RSA, CCA, and retrieval matrices, including pairs within one modality as a baseline. Nucleotide Transformer v2 and DNABERT-2 need small compatibility adjustments to load under transformers 5.</w:t>
+      </w:r>
+    </w:p>
+    <w:p>
+      <w:pPr>
+        <w:pStyle w:val="ListParagraph"/>
+        <w:numPr>
+          <w:ilvl w:val="0"/>
+          <w:numId w:val="2"/>
+        </w:numPr>
+        <w:spacing w:after="100"/>
+      </w:pPr>
+      <w:r>
+        <w:t>Report every new comparison before and after the composition control, with the Mantel test for RSA, as Stage 1 now does.</w:t>
       </w:r>
     </w:p>
     <w:p>
@@ -5830,7 +5850,7 @@
         <w:spacing w:after="100"/>
       </w:pPr>
       <w:r>
-        <w:t xml:space="preserve">If more evidence is wanted first, regress GC content out of both embeddings and rerun CCA on the residuals. If the shared subspace survives, it is not purely compositional; if it collapses, that confirms the compositional reading and answers the related open question in Section 11.</w:t>
+        <w:t>The composition control already answers the earlier open question: the shared subspace is mostly compositional. A next check is whether the small residual agreement is nonlinear composition or genuinely shared information, for example with a nonlinear composition model.</w:t>
       </w:r>
     </w:p>
     <w:p>
@@ -5971,7 +5991,7 @@
         <w:spacing w:after="100"/>
       </w:pPr>
       <w:r>
-        <w:t xml:space="preserve">Is the shared subspace compositional (GC-linked) or something more specific? The GC-regression test in Section 10 is designed to answer this.</w:t>
+        <w:t>Is the small agreement that survives the composition control shared biological information, or nonlinear composition that a linear control cannot remove?</w:t>
       </w:r>
     </w:p>
     <w:p>

</xml_diff>

<commit_message>
Use the multimodal-bio-fusion name everywhere
Rename the Overleaf project and document titles from "Multimodal
Biology" to multimodal-bio-fusion in the README, docs, skill
descriptions, project notes, bibliography, research canvas, and Gantt
files.

Co-Authored-By: Claude Opus 5.5 <noreply@anthropic.com>
Claude-Session: https://claude.ai/code/session_01EXPvTz3oCycFbJjDeAyu2R
</commit_message>
<xml_diff>
--- a/Notes/Mina_Project_Notes.docx
+++ b/Notes/Mina_Project_Notes.docx
@@ -14,7 +14,7 @@
           <w:sz w:val="40"/>
           <w:szCs w:val="40"/>
         </w:rPr>
-        <w:t>Multimodal Biology</w:t>
+        <w:t>multimodal-bio-fusion</w:t>
       </w:r>
     </w:p>
     <w:p>
@@ -116,7 +116,7 @@
         <w:t xml:space="preserve">Manuscript:</w:t>
       </w:r>
       <w:r>
-        <w:t xml:space="preserve"> the project paper is written in the Overleaf project “Multimodal Biology” at https://www.overleaf.com/project/6ab8535fb63c8540bed7e56f, which also records the Stage 1 methods and what each metric means.</w:t>
+        <w:t xml:space="preserve"> the project paper is written in the Overleaf project “multimodal-bio-fusion” at https://www.overleaf.com/project/6ab8535fb63c8540bed7e56f, which also records the Stage 1 methods and what each metric means.</w:t>
       </w:r>
     </w:p>
     <w:p>

</xml_diff>

<commit_message>
Notes: describe Stage 1 with three encoders
</commit_message>
<xml_diff>
--- a/Notes/Mina_Project_Notes.docx
+++ b/Notes/Mina_Project_Notes.docx
@@ -638,7 +638,7 @@
         <w:spacing w:after="160"/>
       </w:pPr>
       <w:r>
-        <w:t>Living things run on connected layers of information: DNA holds the instructions, RNA is the working copy of those instructions, and protein is what actually carries out the work in the cell. Each layer is read today by separately trained foundation models even though the layers are directly, causally linked. The project goal, set with Mina Basirat, is to fuse several separately pretrained DNA, RNA, and protein foundation models, with more than one model per modality, and to test when combining them captures real biological signal that no single model sees, versus adding complexity for no real benefit. Stage 1 so far compared two encoders: Nucleotide Transformer, a DNA-pretrained model reading the coding sequence, and ESM-2 for protein. Section 4 explains how the DNA modality enters with the current data.</w:t>
+        <w:t>Living things run on connected layers of information: DNA holds the instructions, RNA is the working copy of those instructions, and protein is what actually carries out the work in the cell. Each layer is read today by separately trained foundation models even though the layers are directly, causally linked. The project goal, set with Mina Basirat, is to fuse several separately pretrained DNA, RNA, and protein foundation models, with more than one model per modality, and to test when combining them captures real biological signal that no single model sees, versus adding complexity for no real benefit. Stage 1 uses one frozen encoder per modality: Nucleotide Transformer 500M human-ref reads each coding sequence in DNA letters, RNA-FM reads it in RNA letters, and ESM-2 35M reads its translation. Section 4 explains how the DNA modality enters with the current data.</w:t>
       </w:r>
     </w:p>
     <w:p>
@@ -1171,7 +1171,7 @@
                 <w:sz w:val="21"/>
                 <w:szCs w:val="21"/>
               </w:rPr>
-              <w:t xml:space="preserve">Decide, based on Stage 1 findings, what a meaningful alignment target looks like for this modality pair and task.</w:t>
+              <w:t xml:space="preserve">Decide, based on Stage 1 findings, what a meaningful alignment target looks like for each modality pair and task.</w:t>
             </w:r>
           </w:p>
         </w:tc>
@@ -1613,7 +1613,7 @@
         <w:t xml:space="preserve">Coupled Mamba (priority 1):</w:t>
       </w:r>
       <w:r>
-        <w:t xml:space="preserve"> linear cost, and no alignment loss needed by design, though both streams must share a step grid (the codon grid here).</w:t>
+        <w:t xml:space="preserve"> linear cost, and no alignment loss needed by design, though all streams must share a step grid (the codon grid here).</w:t>
       </w:r>
     </w:p>
     <w:p>
@@ -4929,7 +4929,7 @@
                 <w:sz w:val="21"/>
                 <w:szCs w:val="21"/>
               </w:rPr>
-              <w:t xml:space="preserve">Linear-cost fusion with no alignment loss, once both streams share a step grid (the codon grid here)</w:t>
+              <w:t xml:space="preserve">Linear-cost fusion with no alignment loss, once all streams share a step grid (the codon grid here)</w:t>
             </w:r>
           </w:p>
         </w:tc>

</xml_diff>

<commit_message>
Stage 1: run on Apple GPU (MPS) and update notes to match
</commit_message>
<xml_diff>
--- a/Notes/Mina_Project_Notes.docx
+++ b/Notes/Mina_Project_Notes.docx
@@ -5062,7 +5062,7 @@
         <w:spacing w:after="160"/>
       </w:pPr>
       <w:r>
-        <w:t>All results come from the saved outputs of Code/Stage1_refactor.ipynb (CPU run, Python 3.12, transformers 5.15.1, multimolecule 0.2.1) on 1,000 sequences sampled from mRNA_Stability. The notebook gives a results table and interpretation after each output.</w:t>
+        <w:t>All results come from the saved outputs of Code/Stage1_refactor.ipynb (run on an Apple M4 GPU through MPS, Python 3.12, transformers 5.15.1, multimolecule 0.2.1) on 1,000 sequences sampled from mRNA_Stability. The notebook gives a results table and interpretation after each output.</w:t>
       </w:r>
     </w:p>
     <w:p>
@@ -5110,7 +5110,7 @@
         <w:t>Correctness control (mRFP_Expression):</w:t>
       </w:r>
       <w:r>
-        <w:t xml:space="preserve"> all 1,000 synonymous-recoding variants translate to one identical protein, as expected. Protein embeddings for these variants collapse almost to a single point (average distance to centroid 0.00003), while the DNA (4.72) and RNA (0.82) embeddings, which see the codon-level differences, spread out clearly. This confirms that translation, frame checking, and embedding behave correctly, so the results below are not artifacts of a broken pipeline.</w:t>
+        <w:t xml:space="preserve"> all 1,000 synonymous-recoding variants translate to one identical protein, as expected. Protein embeddings for these variants collapse almost to a single point (average distance to centroid 0.00004), while the DNA (4.72) and RNA (0.82) embeddings, which see the codon-level differences, spread out clearly. This confirms that translation, frame checking, and embedding behave correctly, so the results below are not artifacts of a broken pipeline.</w:t>
       </w:r>
     </w:p>
     <w:p>
@@ -5494,7 +5494,7 @@
         <w:t xml:space="preserve">Important limit on Track C:</w:t>
       </w:r>
       <w:r>
-        <w:t xml:space="preserve"> the mRNA_Stability sequences are coding-only. Every length is a multiple of three, 98.5% start with ATG, and 99.3% end exactly at their first in-frame stop codon, so there is no UTR context. AREs and m6A sites are canonically enriched in 3' UTRs, so this test only covers coding regions, where these elements are less concentrated, and the null result should be given limited weight.</w:t>
+        <w:t xml:space="preserve"> the mRNA_Stability sequences are coding-only. Every length is a multiple of three, 98.2% start with ATG, and 99.1% end exactly at their first in-frame stop codon, so there is no UTR context. AREs and m6A sites are canonically enriched in 3' UTRs, so this test only covers coding regions, where these elements are less concentrated, and the null result should be given limited weight.</w:t>
       </w:r>
     </w:p>
     <w:p>

</xml_diff>